<commit_message>
Documenti: Registro 2.0, Manuale Utente 1.9, Amministratore 1.5, Test 1.5 (script 21)
Co-Authored-By: Claude Opus 5.5 <noreply@anthropic.com>
Claude-Session: https://claude.ai/code/session_01E8XCbEeVHWVP3hntUZ6kZ1
</commit_message>
<xml_diff>
--- a/public/documentazione/Manuale_Test_Portale_CWP.docx
+++ b/public/documentazione/Manuale_Test_Portale_CWP.docx
@@ -302,7 +302,7 @@
                 <w:sz w:val="20"/>
                 <w:szCs w:val="20"/>
               </w:rPr>
-              <w:t xml:space="preserve">Rev. 1.4</w:t>
+              <w:t xml:space="preserve">Rev. 1.5</w:t>
             </w:r>
           </w:p>
         </w:tc>
@@ -719,7 +719,7 @@
                 <w:sz w:val="18"/>
                 <w:szCs w:val="18"/>
               </w:rPr>
-              <w:t xml:space="preserve">1.4</w:t>
+              <w:t xml:space="preserve">1.5</w:t>
             </w:r>
           </w:p>
         </w:tc>
@@ -783,7 +783,7 @@
                 <w:sz w:val="18"/>
                 <w:szCs w:val="18"/>
               </w:rPr>
-              <w:t xml:space="preserve">Nuova prova 7.12 (risultato azzerato dopo una modifica dei dati); prove successive del blocco 7 rinumerate; prova 8.4 estesa.</w:t>
+              <w:t xml:space="preserve">Nuove prove 1.2b, 1.8, 3.7, 4.1b, 6.4, 6.5; prove 1.6, 1.7, 3.2, 4.1, 4.6, 5.4 e 6.3 aggiornate (anagrafiche, documenti richiesti, consultazione, Rapporti a 4 fasi, conservazione, fascicolo).</w:t>
             </w:r>
           </w:p>
         </w:tc>
@@ -853,7 +853,7 @@
                 <w:sz w:val="18"/>
                 <w:szCs w:val="18"/>
               </w:rPr>
-              <w:t xml:space="preserve">1.3</w:t>
+              <w:t xml:space="preserve">1.4</w:t>
             </w:r>
           </w:p>
         </w:tc>
@@ -919,7 +919,7 @@
                 <w:sz w:val="18"/>
                 <w:szCs w:val="18"/>
               </w:rPr>
-              <w:t xml:space="preserve">Prove del rapporto PDF, del numero di registro e del registro dei crediti con le nuove versioni.</w:t>
+              <w:t xml:space="preserve">Nuova prova 7.12 (risultato azzerato dopo una modifica dei dati); prove successive del blocco 7 rinumerate; prova 8.4 estesa.</w:t>
             </w:r>
           </w:p>
         </w:tc>
@@ -989,7 +989,7 @@
                 <w:sz w:val="18"/>
                 <w:szCs w:val="18"/>
               </w:rPr>
-              <w:t xml:space="preserve">1.2</w:t>
+              <w:t xml:space="preserve">1.3</w:t>
             </w:r>
           </w:p>
         </w:tc>
@@ -1053,7 +1053,7 @@
                 <w:sz w:val="18"/>
                 <w:szCs w:val="18"/>
               </w:rPr>
-              <w:t xml:space="preserve">Calcolo crediti: prove di import del tracciato con i file di esempio (compilato, letture, dati personali) e dei controlli di coerenza.</w:t>
+              <w:t xml:space="preserve">Prove del rapporto PDF, del numero di registro e del registro dei crediti con le nuove versioni.</w:t>
             </w:r>
           </w:p>
         </w:tc>
@@ -1123,7 +1123,7 @@
                 <w:sz w:val="18"/>
                 <w:szCs w:val="18"/>
               </w:rPr>
-              <w:t xml:space="preserve">1.1</w:t>
+              <w:t xml:space="preserve">1.2</w:t>
             </w:r>
           </w:p>
         </w:tc>
@@ -1189,7 +1189,7 @@
                 <w:sz w:val="18"/>
                 <w:szCs w:val="18"/>
               </w:rPr>
-              <w:t xml:space="preserve">Prove per Enti di Validazione, modelli, note di fase, messaggi, pagamenti visibili al Comune, pratica sospesa, consultazione pubblica con conferma dell'email, limiti di invio ed errata corrige.</w:t>
+              <w:t xml:space="preserve">Calcolo crediti: prove di import del tracciato con i file di esempio (compilato, letture, dati personali) e dei controlli di coerenza.</w:t>
             </w:r>
           </w:p>
         </w:tc>
@@ -1259,6 +1259,140 @@
                 <w:sz w:val="18"/>
                 <w:szCs w:val="18"/>
               </w:rPr>
+              <w:t xml:space="preserve">1.1</w:t>
+            </w:r>
+          </w:p>
+        </w:tc>
+        <w:tc>
+          <w:tcPr>
+            <w:tcW w:type="dxa" w:w="1300"/>
+            <w:tcBorders>
+              <w:top w:val="single" w:color="D9D4C5" w:sz="4"/>
+              <w:left w:val="single" w:color="D9D4C5" w:sz="4"/>
+              <w:bottom w:val="single" w:color="D9D4C5" w:sz="4"/>
+              <w:right w:val="single" w:color="D9D4C5" w:sz="4"/>
+            </w:tcBorders>
+            <w:tcMar>
+              <w:top w:type="dxa" w:w="70"/>
+              <w:left w:type="dxa" w:w="110"/>
+              <w:bottom w:type="dxa" w:w="70"/>
+              <w:right w:type="dxa" w:w="110"/>
+            </w:tcMar>
+            <w:vAlign w:val="center"/>
+          </w:tcPr>
+          <w:p>
+            <w:pPr>
+              <w:spacing w:after="0" w:before="0"/>
+            </w:pPr>
+            <w:r>
+              <w:rPr>
+                <w:rFonts w:ascii="Arial" w:cs="Arial" w:eastAsia="Arial" w:hAnsi="Arial"/>
+                <w:color w:val="1B2118"/>
+                <w:sz w:val="18"/>
+                <w:szCs w:val="18"/>
+              </w:rPr>
+              <w:t xml:space="preserve">18/10/2026</w:t>
+            </w:r>
+          </w:p>
+        </w:tc>
+        <w:tc>
+          <w:tcPr>
+            <w:tcW w:type="dxa" w:w="5538"/>
+            <w:tcBorders>
+              <w:top w:val="single" w:color="D9D4C5" w:sz="4"/>
+              <w:left w:val="single" w:color="D9D4C5" w:sz="4"/>
+              <w:bottom w:val="single" w:color="D9D4C5" w:sz="4"/>
+              <w:right w:val="single" w:color="D9D4C5" w:sz="4"/>
+            </w:tcBorders>
+            <w:tcMar>
+              <w:top w:type="dxa" w:w="70"/>
+              <w:left w:type="dxa" w:w="110"/>
+              <w:bottom w:type="dxa" w:w="70"/>
+              <w:right w:type="dxa" w:w="110"/>
+            </w:tcMar>
+            <w:vAlign w:val="center"/>
+          </w:tcPr>
+          <w:p>
+            <w:pPr>
+              <w:spacing w:after="0" w:before="0"/>
+            </w:pPr>
+            <w:r>
+              <w:rPr>
+                <w:rFonts w:ascii="Arial" w:cs="Arial" w:eastAsia="Arial" w:hAnsi="Arial"/>
+                <w:color w:val="1B2118"/>
+                <w:sz w:val="18"/>
+                <w:szCs w:val="18"/>
+              </w:rPr>
+              <w:t xml:space="preserve">Prove per Enti di Validazione, modelli, note di fase, messaggi, pagamenti visibili al Comune, pratica sospesa, consultazione pubblica con conferma dell'email, limiti di invio ed errata corrige.</w:t>
+            </w:r>
+          </w:p>
+        </w:tc>
+        <w:tc>
+          <w:tcPr>
+            <w:tcW w:type="dxa" w:w="2000"/>
+            <w:tcBorders>
+              <w:top w:val="single" w:color="D9D4C5" w:sz="4"/>
+              <w:left w:val="single" w:color="D9D4C5" w:sz="4"/>
+              <w:bottom w:val="single" w:color="D9D4C5" w:sz="4"/>
+              <w:right w:val="single" w:color="D9D4C5" w:sz="4"/>
+            </w:tcBorders>
+            <w:tcMar>
+              <w:top w:type="dxa" w:w="70"/>
+              <w:left w:type="dxa" w:w="110"/>
+              <w:bottom w:type="dxa" w:w="70"/>
+              <w:right w:type="dxa" w:w="110"/>
+            </w:tcMar>
+            <w:vAlign w:val="center"/>
+          </w:tcPr>
+          <w:p>
+            <w:pPr>
+              <w:spacing w:after="0" w:before="0"/>
+            </w:pPr>
+            <w:r>
+              <w:rPr>
+                <w:rFonts w:ascii="Arial" w:cs="Arial" w:eastAsia="Arial" w:hAnsi="Arial"/>
+                <w:color w:val="1B2118"/>
+                <w:sz w:val="18"/>
+                <w:szCs w:val="18"/>
+              </w:rPr>
+              <w:t xml:space="preserve">Fondazione Operate</w:t>
+            </w:r>
+          </w:p>
+        </w:tc>
+      </w:tr>
+      <w:tr>
+        <w:trPr>
+          <w:cantSplit/>
+        </w:trPr>
+        <w:tc>
+          <w:tcPr>
+            <w:tcW w:type="dxa" w:w="800"/>
+            <w:tcBorders>
+              <w:top w:val="single" w:color="D9D4C5" w:sz="4"/>
+              <w:left w:val="single" w:color="D9D4C5" w:sz="4"/>
+              <w:bottom w:val="single" w:color="D9D4C5" w:sz="4"/>
+              <w:right w:val="single" w:color="D9D4C5" w:sz="4"/>
+            </w:tcBorders>
+            <w:shd w:fill="F6F4EE" w:color="auto" w:val="clear"/>
+            <w:tcMar>
+              <w:top w:type="dxa" w:w="70"/>
+              <w:left w:type="dxa" w:w="110"/>
+              <w:bottom w:type="dxa" w:w="70"/>
+              <w:right w:type="dxa" w:w="110"/>
+            </w:tcMar>
+            <w:vAlign w:val="center"/>
+          </w:tcPr>
+          <w:p>
+            <w:pPr>
+              <w:spacing w:after="0" w:before="0"/>
+            </w:pPr>
+            <w:r>
+              <w:rPr>
+                <w:rFonts w:ascii="Arial" w:cs="Arial" w:eastAsia="Arial" w:hAnsi="Arial"/>
+                <w:color w:val="1B2118"/>
+                <w:sz w:val="18"/>
+                <w:szCs w:val="18"/>
+              </w:rPr>
               <w:t xml:space="preserve">1.0</w:t>
             </w:r>
           </w:p>
@@ -1272,6 +1406,7 @@
               <w:bottom w:val="single" w:color="D9D4C5" w:sz="4"/>
               <w:right w:val="single" w:color="D9D4C5" w:sz="4"/>
             </w:tcBorders>
+            <w:shd w:fill="F6F4EE" w:color="auto" w:val="clear"/>
             <w:tcMar>
               <w:top w:type="dxa" w:w="70"/>
               <w:left w:type="dxa" w:w="110"/>
@@ -1304,6 +1439,7 @@
               <w:bottom w:val="single" w:color="D9D4C5" w:sz="4"/>
               <w:right w:val="single" w:color="D9D4C5" w:sz="4"/>
             </w:tcBorders>
+            <w:shd w:fill="F6F4EE" w:color="auto" w:val="clear"/>
             <w:tcMar>
               <w:top w:type="dxa" w:w="70"/>
               <w:left w:type="dxa" w:w="110"/>
@@ -1336,6 +1472,7 @@
               <w:bottom w:val="single" w:color="D9D4C5" w:sz="4"/>
               <w:right w:val="single" w:color="D9D4C5" w:sz="4"/>
             </w:tcBorders>
+            <w:shd w:fill="F6F4EE" w:color="auto" w:val="clear"/>
             <w:tcMar>
               <w:top w:type="dxa" w:w="70"/>
               <w:left w:type="dxa" w:w="110"/>
@@ -1377,7 +1514,7 @@
           <w:sz w:val="20"/>
           <w:szCs w:val="20"/>
         </w:rPr>
-        <w:t xml:space="preserve">Guida alla revisione 1.4 del 18/10/2026, allineata al portale e agli altri manuali. È aggiornata a ogni rilascio; la versione corrente si scarica dall'area Documentazione del portale (solo Amministratori).</w:t>
+        <w:t xml:space="preserve">Guida alla revisione 1.5 del 18/10/2026, allineata al portale e agli altri manuali. È aggiornata a ogni rilascio; la versione corrente si scarica dall'area Documentazione del portale (solo Amministratori).</w:t>
       </w:r>
     </w:p>
     <w:p>
@@ -1751,7 +1888,7 @@
         </w:rPr>
         <w:t xml:space="preserve">Il portale: </w:t>
       </w:r>
-      <w:hyperlink w:history="1" r:id="rIdeynjy1rwvnkjw21lac6yo">
+      <w:hyperlink w:history="1" r:id="rIdkwchexy9bxerj6lj0uwjs">
         <w:r>
           <w:rPr>
             <w:rFonts w:ascii="Arial" w:cs="Arial" w:eastAsia="Arial" w:hAnsi="Arial"/>
@@ -3753,8 +3890,8 @@
       </w:tblPr>
       <w:tblGrid>
         <w:gridCol w:w="2010"/>
-        <w:gridCol w:w="5546"/>
-        <w:gridCol w:w="2082"/>
+        <w:gridCol w:w="5556"/>
+        <w:gridCol w:w="2072"/>
       </w:tblGrid>
       <w:tr>
         <w:trPr>
@@ -3797,7 +3934,7 @@
         </w:tc>
         <w:tc>
           <w:tcPr>
-            <w:tcW w:type="dxa" w:w="5546"/>
+            <w:tcW w:type="dxa" w:w="5556"/>
             <w:tcBorders>
               <w:top w:val="single" w:color="D9D4C5" w:sz="4"/>
               <w:left w:val="single" w:color="D9D4C5" w:sz="4"/>
@@ -3832,7 +3969,7 @@
         </w:tc>
         <w:tc>
           <w:tcPr>
-            <w:tcW w:type="dxa" w:w="2082"/>
+            <w:tcW w:type="dxa" w:w="2072"/>
             <w:tcBorders>
               <w:top w:val="single" w:color="D9D4C5" w:sz="4"/>
               <w:left w:val="single" w:color="D9D4C5" w:sz="4"/>
@@ -3904,7 +4041,7 @@
         </w:tc>
         <w:tc>
           <w:tcPr>
-            <w:tcW w:type="dxa" w:w="5546"/>
+            <w:tcW w:type="dxa" w:w="5556"/>
             <w:tcBorders>
               <w:top w:val="single" w:color="D9D4C5" w:sz="4"/>
               <w:left w:val="single" w:color="D9D4C5" w:sz="4"/>
@@ -3936,7 +4073,7 @@
         </w:tc>
         <w:tc>
           <w:tcPr>
-            <w:tcW w:type="dxa" w:w="2082"/>
+            <w:tcW w:type="dxa" w:w="2072"/>
             <w:tcBorders>
               <w:top w:val="single" w:color="D9D4C5" w:sz="4"/>
               <w:left w:val="single" w:color="D9D4C5" w:sz="4"/>
@@ -4006,7 +4143,7 @@
         </w:tc>
         <w:tc>
           <w:tcPr>
-            <w:tcW w:type="dxa" w:w="5546"/>
+            <w:tcW w:type="dxa" w:w="5556"/>
             <w:tcBorders>
               <w:top w:val="single" w:color="D9D4C5" w:sz="4"/>
               <w:left w:val="single" w:color="D9D4C5" w:sz="4"/>
@@ -4033,13 +4170,13 @@
                 <w:sz w:val="18"/>
                 <w:szCs w:val="18"/>
               </w:rPr>
-              <w:t xml:space="preserve">Progetti e Rapporti di Monitoraggio, codice automatico (CWP-AAAA-NNNN), stati attiva / sospesa / annullata / chiusa</w:t>
-            </w:r>
-          </w:p>
-        </w:tc>
-        <w:tc>
-          <w:tcPr>
-            <w:tcW w:type="dxa" w:w="2082"/>
+              <w:t xml:space="preserve">Progetti e Rapporti di Monitoraggio, codice automatico (CWP-AAAA-NNNN), stati attiva / sospesa / annullata / chiusa; conservazione per 10 anni, nulla si cancella</w:t>
+            </w:r>
+          </w:p>
+        </w:tc>
+        <w:tc>
+          <w:tcPr>
+            <w:tcW w:type="dxa" w:w="2072"/>
             <w:tcBorders>
               <w:top w:val="single" w:color="D9D4C5" w:sz="4"/>
               <w:left w:val="single" w:color="D9D4C5" w:sz="4"/>
@@ -4109,39 +4246,39 @@
         </w:tc>
         <w:tc>
           <w:tcPr>
-            <w:tcW w:type="dxa" w:w="5546"/>
-            <w:tcBorders>
-              <w:top w:val="single" w:color="D9D4C5" w:sz="4"/>
-              <w:left w:val="single" w:color="D9D4C5" w:sz="4"/>
-              <w:bottom w:val="single" w:color="D9D4C5" w:sz="4"/>
-              <w:right w:val="single" w:color="D9D4C5" w:sz="4"/>
-            </w:tcBorders>
-            <w:tcMar>
-              <w:top w:type="dxa" w:w="70"/>
-              <w:left w:type="dxa" w:w="110"/>
-              <w:bottom w:type="dxa" w:w="70"/>
-              <w:right w:type="dxa" w:w="110"/>
-            </w:tcMar>
-            <w:vAlign w:val="center"/>
-          </w:tcPr>
-          <w:p>
-            <w:pPr>
-              <w:spacing w:after="0" w:before="0"/>
-            </w:pPr>
-            <w:r>
-              <w:rPr>
-                <w:rFonts w:ascii="Arial" w:cs="Arial" w:eastAsia="Arial" w:hAnsi="Arial"/>
-                <w:color w:val="1B2118"/>
-                <w:sz w:val="18"/>
-                <w:szCs w:val="18"/>
-              </w:rPr>
-              <w:t xml:space="preserve">7 fasi con apertura, scadenza calcolata, chiusura, modifica della scadenza con motivazione; note di fase interne o condivise; modelli da scaricare per fase</w:t>
-            </w:r>
-          </w:p>
-        </w:tc>
-        <w:tc>
-          <w:tcPr>
-            <w:tcW w:type="dxa" w:w="2082"/>
+            <w:tcW w:type="dxa" w:w="5556"/>
+            <w:tcBorders>
+              <w:top w:val="single" w:color="D9D4C5" w:sz="4"/>
+              <w:left w:val="single" w:color="D9D4C5" w:sz="4"/>
+              <w:bottom w:val="single" w:color="D9D4C5" w:sz="4"/>
+              <w:right w:val="single" w:color="D9D4C5" w:sz="4"/>
+            </w:tcBorders>
+            <w:tcMar>
+              <w:top w:type="dxa" w:w="70"/>
+              <w:left w:type="dxa" w:w="110"/>
+              <w:bottom w:type="dxa" w:w="70"/>
+              <w:right w:type="dxa" w:w="110"/>
+            </w:tcMar>
+            <w:vAlign w:val="center"/>
+          </w:tcPr>
+          <w:p>
+            <w:pPr>
+              <w:spacing w:after="0" w:before="0"/>
+            </w:pPr>
+            <w:r>
+              <w:rPr>
+                <w:rFonts w:ascii="Arial" w:cs="Arial" w:eastAsia="Arial" w:hAnsi="Arial"/>
+                <w:color w:val="1B2118"/>
+                <w:sz w:val="18"/>
+                <w:szCs w:val="18"/>
+              </w:rPr>
+              <w:t xml:space="preserve">7 fasi per il Progetto, 4 per il Rapporto; apertura, scadenza calcolata, chiusura, modifica della scadenza con motivazione; note di fase interne o condivise; modelli da scaricare e documenti richiesti per fase</w:t>
+            </w:r>
+          </w:p>
+        </w:tc>
+        <w:tc>
+          <w:tcPr>
+            <w:tcW w:type="dxa" w:w="2072"/>
             <w:tcBorders>
               <w:top w:val="single" w:color="D9D4C5" w:sz="4"/>
               <w:left w:val="single" w:color="D9D4C5" w:sz="4"/>
@@ -4205,13 +4342,13 @@
                 <w:sz w:val="18"/>
                 <w:szCs w:val="18"/>
               </w:rPr>
-              <w:t xml:space="preserve">Messaggi</w:t>
-            </w:r>
-          </w:p>
-        </w:tc>
-        <w:tc>
-          <w:tcPr>
-            <w:tcW w:type="dxa" w:w="5546"/>
+              <w:t xml:space="preserve">Anagrafiche</w:t>
+            </w:r>
+          </w:p>
+        </w:tc>
+        <w:tc>
+          <w:tcPr>
+            <w:tcW w:type="dxa" w:w="5556"/>
             <w:tcBorders>
               <w:top w:val="single" w:color="D9D4C5" w:sz="4"/>
               <w:left w:val="single" w:color="D9D4C5" w:sz="4"/>
@@ -4238,13 +4375,13 @@
                 <w:sz w:val="18"/>
                 <w:szCs w:val="18"/>
               </w:rPr>
-              <w:t xml:space="preserve">Conversazione tra Comune e Fondazione dentro ogni pratica</w:t>
-            </w:r>
-          </w:p>
-        </w:tc>
-        <w:tc>
-          <w:tcPr>
-            <w:tcW w:type="dxa" w:w="2082"/>
+              <w:t xml:space="preserve">Organizzazioni ed Enti di Validazione, con le pratiche collegate</w:t>
+            </w:r>
+          </w:p>
+        </w:tc>
+        <w:tc>
+          <w:tcPr>
+            <w:tcW w:type="dxa" w:w="2072"/>
             <w:tcBorders>
               <w:top w:val="single" w:color="D9D4C5" w:sz="4"/>
               <w:left w:val="single" w:color="D9D4C5" w:sz="4"/>
@@ -4271,7 +4408,7 @@
                 <w:sz w:val="18"/>
                 <w:szCs w:val="18"/>
               </w:rPr>
-              <w:t xml:space="preserve">tutti</w:t>
+              <w:t xml:space="preserve">Fondazione</w:t>
             </w:r>
           </w:p>
         </w:tc>
@@ -4308,45 +4445,45 @@
                 <w:sz w:val="18"/>
                 <w:szCs w:val="18"/>
               </w:rPr>
-              <w:t xml:space="preserve">Documenti</w:t>
-            </w:r>
-          </w:p>
-        </w:tc>
-        <w:tc>
-          <w:tcPr>
-            <w:tcW w:type="dxa" w:w="5546"/>
-            <w:tcBorders>
-              <w:top w:val="single" w:color="D9D4C5" w:sz="4"/>
-              <w:left w:val="single" w:color="D9D4C5" w:sz="4"/>
-              <w:bottom w:val="single" w:color="D9D4C5" w:sz="4"/>
-              <w:right w:val="single" w:color="D9D4C5" w:sz="4"/>
-            </w:tcBorders>
-            <w:tcMar>
-              <w:top w:type="dxa" w:w="70"/>
-              <w:left w:type="dxa" w:w="110"/>
-              <w:bottom w:type="dxa" w:w="70"/>
-              <w:right w:type="dxa" w:w="110"/>
-            </w:tcMar>
-            <w:vAlign w:val="center"/>
-          </w:tcPr>
-          <w:p>
-            <w:pPr>
-              <w:spacing w:after="0" w:before="0"/>
-            </w:pPr>
-            <w:r>
-              <w:rPr>
-                <w:rFonts w:ascii="Arial" w:cs="Arial" w:eastAsia="Arial" w:hAnsi="Arial"/>
-                <w:color w:val="1B2118"/>
-                <w:sz w:val="18"/>
-                <w:szCs w:val="18"/>
-              </w:rPr>
-              <w:t xml:space="preserve">Caricamento con versioni (mai sovrascritte), visibilità, controllo di formato e contenuto, impronta di integrità</w:t>
-            </w:r>
-          </w:p>
-        </w:tc>
-        <w:tc>
-          <w:tcPr>
-            <w:tcW w:type="dxa" w:w="2082"/>
+              <w:t xml:space="preserve">Messaggi</w:t>
+            </w:r>
+          </w:p>
+        </w:tc>
+        <w:tc>
+          <w:tcPr>
+            <w:tcW w:type="dxa" w:w="5556"/>
+            <w:tcBorders>
+              <w:top w:val="single" w:color="D9D4C5" w:sz="4"/>
+              <w:left w:val="single" w:color="D9D4C5" w:sz="4"/>
+              <w:bottom w:val="single" w:color="D9D4C5" w:sz="4"/>
+              <w:right w:val="single" w:color="D9D4C5" w:sz="4"/>
+            </w:tcBorders>
+            <w:tcMar>
+              <w:top w:type="dxa" w:w="70"/>
+              <w:left w:type="dxa" w:w="110"/>
+              <w:bottom w:type="dxa" w:w="70"/>
+              <w:right w:type="dxa" w:w="110"/>
+            </w:tcMar>
+            <w:vAlign w:val="center"/>
+          </w:tcPr>
+          <w:p>
+            <w:pPr>
+              <w:spacing w:after="0" w:before="0"/>
+            </w:pPr>
+            <w:r>
+              <w:rPr>
+                <w:rFonts w:ascii="Arial" w:cs="Arial" w:eastAsia="Arial" w:hAnsi="Arial"/>
+                <w:color w:val="1B2118"/>
+                <w:sz w:val="18"/>
+                <w:szCs w:val="18"/>
+              </w:rPr>
+              <w:t xml:space="preserve">Conversazione tra Comune e Fondazione dentro ogni pratica</w:t>
+            </w:r>
+          </w:p>
+        </w:tc>
+        <w:tc>
+          <w:tcPr>
+            <w:tcW w:type="dxa" w:w="2072"/>
             <w:tcBorders>
               <w:top w:val="single" w:color="D9D4C5" w:sz="4"/>
               <w:left w:val="single" w:color="D9D4C5" w:sz="4"/>
@@ -4410,13 +4547,13 @@
                 <w:sz w:val="18"/>
                 <w:szCs w:val="18"/>
               </w:rPr>
-              <w:t xml:space="preserve">Integrazioni</w:t>
-            </w:r>
-          </w:p>
-        </w:tc>
-        <w:tc>
-          <w:tcPr>
-            <w:tcW w:type="dxa" w:w="5546"/>
+              <w:t xml:space="preserve">Documenti</w:t>
+            </w:r>
+          </w:p>
+        </w:tc>
+        <w:tc>
+          <w:tcPr>
+            <w:tcW w:type="dxa" w:w="5556"/>
             <w:tcBorders>
               <w:top w:val="single" w:color="D9D4C5" w:sz="4"/>
               <w:left w:val="single" w:color="D9D4C5" w:sz="4"/>
@@ -4443,13 +4580,13 @@
                 <w:sz w:val="18"/>
                 <w:szCs w:val="18"/>
               </w:rPr>
-              <w:t xml:space="preserve">Richiesta della Fondazione → risposta del Comune con documento → chiusura</w:t>
-            </w:r>
-          </w:p>
-        </w:tc>
-        <w:tc>
-          <w:tcPr>
-            <w:tcW w:type="dxa" w:w="2082"/>
+              <w:t xml:space="preserve">Caricamento con versioni (mai sovrascritte), visibilità, controllo di formato e contenuto, impronta di integrità</w:t>
+            </w:r>
+          </w:p>
+        </w:tc>
+        <w:tc>
+          <w:tcPr>
+            <w:tcW w:type="dxa" w:w="2072"/>
             <w:tcBorders>
               <w:top w:val="single" w:color="D9D4C5" w:sz="4"/>
               <w:left w:val="single" w:color="D9D4C5" w:sz="4"/>
@@ -4513,71 +4650,71 @@
                 <w:sz w:val="18"/>
                 <w:szCs w:val="18"/>
               </w:rPr>
-              <w:t xml:space="preserve">Consultazione pubblica</w:t>
-            </w:r>
-          </w:p>
-        </w:tc>
-        <w:tc>
-          <w:tcPr>
-            <w:tcW w:type="dxa" w:w="5546"/>
-            <w:tcBorders>
-              <w:top w:val="single" w:color="D9D4C5" w:sz="4"/>
-              <w:left w:val="single" w:color="D9D4C5" w:sz="4"/>
-              <w:bottom w:val="single" w:color="D9D4C5" w:sz="4"/>
-              <w:right w:val="single" w:color="D9D4C5" w:sz="4"/>
-            </w:tcBorders>
-            <w:tcMar>
-              <w:top w:type="dxa" w:w="70"/>
-              <w:left w:type="dxa" w:w="110"/>
-              <w:bottom w:type="dxa" w:w="70"/>
-              <w:right w:type="dxa" w:w="110"/>
-            </w:tcMar>
-            <w:vAlign w:val="center"/>
-          </w:tcPr>
-          <w:p>
-            <w:pPr>
-              <w:spacing w:after="0" w:before="0"/>
-            </w:pPr>
-            <w:r>
-              <w:rPr>
-                <w:rFonts w:ascii="Arial" w:cs="Arial" w:eastAsia="Arial" w:hAnsi="Arial"/>
-                <w:color w:val="1B2118"/>
-                <w:sz w:val="18"/>
-                <w:szCs w:val="18"/>
-              </w:rPr>
-              <w:t xml:space="preserve">Pagina pubblica per 30 giorni; osservazioni con email confermata e allegato; moderazione; risposte del Comune; errata corrige</w:t>
-            </w:r>
-          </w:p>
-        </w:tc>
-        <w:tc>
-          <w:tcPr>
-            <w:tcW w:type="dxa" w:w="2082"/>
-            <w:tcBorders>
-              <w:top w:val="single" w:color="D9D4C5" w:sz="4"/>
-              <w:left w:val="single" w:color="D9D4C5" w:sz="4"/>
-              <w:bottom w:val="single" w:color="D9D4C5" w:sz="4"/>
-              <w:right w:val="single" w:color="D9D4C5" w:sz="4"/>
-            </w:tcBorders>
-            <w:tcMar>
-              <w:top w:type="dxa" w:w="70"/>
-              <w:left w:type="dxa" w:w="110"/>
-              <w:bottom w:type="dxa" w:w="70"/>
-              <w:right w:type="dxa" w:w="110"/>
-            </w:tcMar>
-            <w:vAlign w:val="center"/>
-          </w:tcPr>
-          <w:p>
-            <w:pPr>
-              <w:spacing w:after="0" w:before="0"/>
-            </w:pPr>
-            <w:r>
-              <w:rPr>
-                <w:rFonts w:ascii="Arial" w:cs="Arial" w:eastAsia="Arial" w:hAnsi="Arial"/>
-                <w:color w:val="1B2118"/>
-                <w:sz w:val="18"/>
-                <w:szCs w:val="18"/>
-              </w:rPr>
-              <w:t xml:space="preserve">tutti, anche senza accesso</w:t>
+              <w:t xml:space="preserve">Integrazioni</w:t>
+            </w:r>
+          </w:p>
+        </w:tc>
+        <w:tc>
+          <w:tcPr>
+            <w:tcW w:type="dxa" w:w="5556"/>
+            <w:tcBorders>
+              <w:top w:val="single" w:color="D9D4C5" w:sz="4"/>
+              <w:left w:val="single" w:color="D9D4C5" w:sz="4"/>
+              <w:bottom w:val="single" w:color="D9D4C5" w:sz="4"/>
+              <w:right w:val="single" w:color="D9D4C5" w:sz="4"/>
+            </w:tcBorders>
+            <w:tcMar>
+              <w:top w:type="dxa" w:w="70"/>
+              <w:left w:type="dxa" w:w="110"/>
+              <w:bottom w:type="dxa" w:w="70"/>
+              <w:right w:type="dxa" w:w="110"/>
+            </w:tcMar>
+            <w:vAlign w:val="center"/>
+          </w:tcPr>
+          <w:p>
+            <w:pPr>
+              <w:spacing w:after="0" w:before="0"/>
+            </w:pPr>
+            <w:r>
+              <w:rPr>
+                <w:rFonts w:ascii="Arial" w:cs="Arial" w:eastAsia="Arial" w:hAnsi="Arial"/>
+                <w:color w:val="1B2118"/>
+                <w:sz w:val="18"/>
+                <w:szCs w:val="18"/>
+              </w:rPr>
+              <w:t xml:space="preserve">Richiesta della Fondazione → risposta del Comune con documento → chiusura</w:t>
+            </w:r>
+          </w:p>
+        </w:tc>
+        <w:tc>
+          <w:tcPr>
+            <w:tcW w:type="dxa" w:w="2072"/>
+            <w:tcBorders>
+              <w:top w:val="single" w:color="D9D4C5" w:sz="4"/>
+              <w:left w:val="single" w:color="D9D4C5" w:sz="4"/>
+              <w:bottom w:val="single" w:color="D9D4C5" w:sz="4"/>
+              <w:right w:val="single" w:color="D9D4C5" w:sz="4"/>
+            </w:tcBorders>
+            <w:tcMar>
+              <w:top w:type="dxa" w:w="70"/>
+              <w:left w:type="dxa" w:w="110"/>
+              <w:bottom w:type="dxa" w:w="70"/>
+              <w:right w:type="dxa" w:w="110"/>
+            </w:tcMar>
+            <w:vAlign w:val="center"/>
+          </w:tcPr>
+          <w:p>
+            <w:pPr>
+              <w:spacing w:after="0" w:before="0"/>
+            </w:pPr>
+            <w:r>
+              <w:rPr>
+                <w:rFonts w:ascii="Arial" w:cs="Arial" w:eastAsia="Arial" w:hAnsi="Arial"/>
+                <w:color w:val="1B2118"/>
+                <w:sz w:val="18"/>
+                <w:szCs w:val="18"/>
+              </w:rPr>
+              <w:t xml:space="preserve">tutti</w:t>
             </w:r>
           </w:p>
         </w:tc>
@@ -4615,13 +4752,13 @@
                 <w:sz w:val="18"/>
                 <w:szCs w:val="18"/>
               </w:rPr>
-              <w:t xml:space="preserve">Pagamenti</w:t>
-            </w:r>
-          </w:p>
-        </w:tc>
-        <w:tc>
-          <w:tcPr>
-            <w:tcW w:type="dxa" w:w="5546"/>
+              <w:t xml:space="preserve">Consultazione pubblica</w:t>
+            </w:r>
+          </w:p>
+        </w:tc>
+        <w:tc>
+          <w:tcPr>
+            <w:tcW w:type="dxa" w:w="5556"/>
             <w:tcBorders>
               <w:top w:val="single" w:color="D9D4C5" w:sz="4"/>
               <w:left w:val="single" w:color="D9D4C5" w:sz="4"/>
@@ -4648,13 +4785,13 @@
                 <w:sz w:val="18"/>
                 <w:szCs w:val="18"/>
               </w:rPr>
-              <w:t xml:space="preserve">Voci previste e incassi registrati a mano (nessun pagamento online)</w:t>
-            </w:r>
-          </w:p>
-        </w:tc>
-        <w:tc>
-          <w:tcPr>
-            <w:tcW w:type="dxa" w:w="2082"/>
+              <w:t xml:space="preserve">Pagina pubblica per 30 giorni; documento bloccato; osservazioni numerate con email confermata e allegato; moderazione con motivazione; risposte del Comune; errata corrige</w:t>
+            </w:r>
+          </w:p>
+        </w:tc>
+        <w:tc>
+          <w:tcPr>
+            <w:tcW w:type="dxa" w:w="2072"/>
             <w:tcBorders>
               <w:top w:val="single" w:color="D9D4C5" w:sz="4"/>
               <w:left w:val="single" w:color="D9D4C5" w:sz="4"/>
@@ -4681,7 +4818,7 @@
                 <w:sz w:val="18"/>
                 <w:szCs w:val="18"/>
               </w:rPr>
-              <w:t xml:space="preserve">Fondazione; il Comune consulta</w:t>
+              <w:t xml:space="preserve">tutti, anche senza accesso</w:t>
             </w:r>
           </w:p>
         </w:tc>
@@ -4718,71 +4855,71 @@
                 <w:sz w:val="18"/>
                 <w:szCs w:val="18"/>
               </w:rPr>
-              <w:t xml:space="preserve">Notifiche</w:t>
-            </w:r>
-          </w:p>
-        </w:tc>
-        <w:tc>
-          <w:tcPr>
-            <w:tcW w:type="dxa" w:w="5546"/>
-            <w:tcBorders>
-              <w:top w:val="single" w:color="D9D4C5" w:sz="4"/>
-              <w:left w:val="single" w:color="D9D4C5" w:sz="4"/>
-              <w:bottom w:val="single" w:color="D9D4C5" w:sz="4"/>
-              <w:right w:val="single" w:color="D9D4C5" w:sz="4"/>
-            </w:tcBorders>
-            <w:tcMar>
-              <w:top w:type="dxa" w:w="70"/>
-              <w:left w:type="dxa" w:w="110"/>
-              <w:bottom w:type="dxa" w:w="70"/>
-              <w:right w:type="dxa" w:w="110"/>
-            </w:tcMar>
-            <w:vAlign w:val="center"/>
-          </w:tcPr>
-          <w:p>
-            <w:pPr>
-              <w:spacing w:after="0" w:before="0"/>
-            </w:pPr>
-            <w:r>
-              <w:rPr>
-                <w:rFonts w:ascii="Arial" w:cs="Arial" w:eastAsia="Arial" w:hAnsi="Arial"/>
-                <w:color w:val="1B2118"/>
-                <w:sz w:val="18"/>
-                <w:szCs w:val="18"/>
-              </w:rPr>
-              <w:t xml:space="preserve">Campanella nel portale ed email per ogni evento importante; avvisi di scadenza</w:t>
-            </w:r>
-          </w:p>
-        </w:tc>
-        <w:tc>
-          <w:tcPr>
-            <w:tcW w:type="dxa" w:w="2082"/>
-            <w:tcBorders>
-              <w:top w:val="single" w:color="D9D4C5" w:sz="4"/>
-              <w:left w:val="single" w:color="D9D4C5" w:sz="4"/>
-              <w:bottom w:val="single" w:color="D9D4C5" w:sz="4"/>
-              <w:right w:val="single" w:color="D9D4C5" w:sz="4"/>
-            </w:tcBorders>
-            <w:tcMar>
-              <w:top w:type="dxa" w:w="70"/>
-              <w:left w:type="dxa" w:w="110"/>
-              <w:bottom w:type="dxa" w:w="70"/>
-              <w:right w:type="dxa" w:w="110"/>
-            </w:tcMar>
-            <w:vAlign w:val="center"/>
-          </w:tcPr>
-          <w:p>
-            <w:pPr>
-              <w:spacing w:after="0" w:before="0"/>
-            </w:pPr>
-            <w:r>
-              <w:rPr>
-                <w:rFonts w:ascii="Arial" w:cs="Arial" w:eastAsia="Arial" w:hAnsi="Arial"/>
-                <w:color w:val="1B2118"/>
-                <w:sz w:val="18"/>
-                <w:szCs w:val="18"/>
-              </w:rPr>
-              <w:t xml:space="preserve">tutti</w:t>
+              <w:t xml:space="preserve">Pagamenti</w:t>
+            </w:r>
+          </w:p>
+        </w:tc>
+        <w:tc>
+          <w:tcPr>
+            <w:tcW w:type="dxa" w:w="5556"/>
+            <w:tcBorders>
+              <w:top w:val="single" w:color="D9D4C5" w:sz="4"/>
+              <w:left w:val="single" w:color="D9D4C5" w:sz="4"/>
+              <w:bottom w:val="single" w:color="D9D4C5" w:sz="4"/>
+              <w:right w:val="single" w:color="D9D4C5" w:sz="4"/>
+            </w:tcBorders>
+            <w:tcMar>
+              <w:top w:type="dxa" w:w="70"/>
+              <w:left w:type="dxa" w:w="110"/>
+              <w:bottom w:type="dxa" w:w="70"/>
+              <w:right w:type="dxa" w:w="110"/>
+            </w:tcMar>
+            <w:vAlign w:val="center"/>
+          </w:tcPr>
+          <w:p>
+            <w:pPr>
+              <w:spacing w:after="0" w:before="0"/>
+            </w:pPr>
+            <w:r>
+              <w:rPr>
+                <w:rFonts w:ascii="Arial" w:cs="Arial" w:eastAsia="Arial" w:hAnsi="Arial"/>
+                <w:color w:val="1B2118"/>
+                <w:sz w:val="18"/>
+                <w:szCs w:val="18"/>
+              </w:rPr>
+              <w:t xml:space="preserve">Voci previste e incassi registrati a mano (nessun pagamento online)</w:t>
+            </w:r>
+          </w:p>
+        </w:tc>
+        <w:tc>
+          <w:tcPr>
+            <w:tcW w:type="dxa" w:w="2072"/>
+            <w:tcBorders>
+              <w:top w:val="single" w:color="D9D4C5" w:sz="4"/>
+              <w:left w:val="single" w:color="D9D4C5" w:sz="4"/>
+              <w:bottom w:val="single" w:color="D9D4C5" w:sz="4"/>
+              <w:right w:val="single" w:color="D9D4C5" w:sz="4"/>
+            </w:tcBorders>
+            <w:tcMar>
+              <w:top w:type="dxa" w:w="70"/>
+              <w:left w:type="dxa" w:w="110"/>
+              <w:bottom w:type="dxa" w:w="70"/>
+              <w:right w:type="dxa" w:w="110"/>
+            </w:tcMar>
+            <w:vAlign w:val="center"/>
+          </w:tcPr>
+          <w:p>
+            <w:pPr>
+              <w:spacing w:after="0" w:before="0"/>
+            </w:pPr>
+            <w:r>
+              <w:rPr>
+                <w:rFonts w:ascii="Arial" w:cs="Arial" w:eastAsia="Arial" w:hAnsi="Arial"/>
+                <w:color w:val="1B2118"/>
+                <w:sz w:val="18"/>
+                <w:szCs w:val="18"/>
+              </w:rPr>
+              <w:t xml:space="preserve">Fondazione; il Comune consulta</w:t>
             </w:r>
           </w:p>
         </w:tc>
@@ -4820,13 +4957,13 @@
                 <w:sz w:val="18"/>
                 <w:szCs w:val="18"/>
               </w:rPr>
-              <w:t xml:space="preserve">Cruscotto</w:t>
-            </w:r>
-          </w:p>
-        </w:tc>
-        <w:tc>
-          <w:tcPr>
-            <w:tcW w:type="dxa" w:w="5546"/>
+              <w:t xml:space="preserve">Notifiche</w:t>
+            </w:r>
+          </w:p>
+        </w:tc>
+        <w:tc>
+          <w:tcPr>
+            <w:tcW w:type="dxa" w:w="5556"/>
             <w:tcBorders>
               <w:top w:val="single" w:color="D9D4C5" w:sz="4"/>
               <w:left w:val="single" w:color="D9D4C5" w:sz="4"/>
@@ -4853,13 +4990,13 @@
                 <w:sz w:val="18"/>
                 <w:szCs w:val="18"/>
               </w:rPr>
-              <w:t xml:space="preserve">Tutte le pratiche con fase, scadenza e cose da fare, filtri e ricerca</w:t>
-            </w:r>
-          </w:p>
-        </w:tc>
-        <w:tc>
-          <w:tcPr>
-            <w:tcW w:type="dxa" w:w="2082"/>
+              <w:t xml:space="preserve">Campanella nel portale ed email per ogni evento importante; avvisi di scadenza</w:t>
+            </w:r>
+          </w:p>
+        </w:tc>
+        <w:tc>
+          <w:tcPr>
+            <w:tcW w:type="dxa" w:w="2072"/>
             <w:tcBorders>
               <w:top w:val="single" w:color="D9D4C5" w:sz="4"/>
               <w:left w:val="single" w:color="D9D4C5" w:sz="4"/>
@@ -4886,7 +5023,7 @@
                 <w:sz w:val="18"/>
                 <w:szCs w:val="18"/>
               </w:rPr>
-              <w:t xml:space="preserve">Fondazione</w:t>
+              <w:t xml:space="preserve">tutti</w:t>
             </w:r>
           </w:p>
         </w:tc>
@@ -4923,71 +5060,71 @@
                 <w:sz w:val="18"/>
                 <w:szCs w:val="18"/>
               </w:rPr>
-              <w:t xml:space="preserve">Export</w:t>
-            </w:r>
-          </w:p>
-        </w:tc>
-        <w:tc>
-          <w:tcPr>
-            <w:tcW w:type="dxa" w:w="5546"/>
-            <w:tcBorders>
-              <w:top w:val="single" w:color="D9D4C5" w:sz="4"/>
-              <w:left w:val="single" w:color="D9D4C5" w:sz="4"/>
-              <w:bottom w:val="single" w:color="D9D4C5" w:sz="4"/>
-              <w:right w:val="single" w:color="D9D4C5" w:sz="4"/>
-            </w:tcBorders>
-            <w:tcMar>
-              <w:top w:type="dxa" w:w="70"/>
-              <w:left w:type="dxa" w:w="110"/>
-              <w:bottom w:type="dxa" w:w="70"/>
-              <w:right w:type="dxa" w:w="110"/>
-            </w:tcMar>
-            <w:vAlign w:val="center"/>
-          </w:tcPr>
-          <w:p>
-            <w:pPr>
-              <w:spacing w:after="0" w:before="0"/>
-            </w:pPr>
-            <w:r>
-              <w:rPr>
-                <w:rFonts w:ascii="Arial" w:cs="Arial" w:eastAsia="Arial" w:hAnsi="Arial"/>
-                <w:color w:val="1B2118"/>
-                <w:sz w:val="18"/>
-                <w:szCs w:val="18"/>
-              </w:rPr>
-              <w:t xml:space="preserve">Fascicolo completo della pratica in un file ZIP</w:t>
-            </w:r>
-          </w:p>
-        </w:tc>
-        <w:tc>
-          <w:tcPr>
-            <w:tcW w:type="dxa" w:w="2082"/>
-            <w:tcBorders>
-              <w:top w:val="single" w:color="D9D4C5" w:sz="4"/>
-              <w:left w:val="single" w:color="D9D4C5" w:sz="4"/>
-              <w:bottom w:val="single" w:color="D9D4C5" w:sz="4"/>
-              <w:right w:val="single" w:color="D9D4C5" w:sz="4"/>
-            </w:tcBorders>
-            <w:tcMar>
-              <w:top w:type="dxa" w:w="70"/>
-              <w:left w:type="dxa" w:w="110"/>
-              <w:bottom w:type="dxa" w:w="70"/>
-              <w:right w:type="dxa" w:w="110"/>
-            </w:tcMar>
-            <w:vAlign w:val="center"/>
-          </w:tcPr>
-          <w:p>
-            <w:pPr>
-              <w:spacing w:after="0" w:before="0"/>
-            </w:pPr>
-            <w:r>
-              <w:rPr>
-                <w:rFonts w:ascii="Arial" w:cs="Arial" w:eastAsia="Arial" w:hAnsi="Arial"/>
-                <w:color w:val="1B2118"/>
-                <w:sz w:val="18"/>
-                <w:szCs w:val="18"/>
-              </w:rPr>
-              <w:t xml:space="preserve">tutti</w:t>
+              <w:t xml:space="preserve">Cruscotto</w:t>
+            </w:r>
+          </w:p>
+        </w:tc>
+        <w:tc>
+          <w:tcPr>
+            <w:tcW w:type="dxa" w:w="5556"/>
+            <w:tcBorders>
+              <w:top w:val="single" w:color="D9D4C5" w:sz="4"/>
+              <w:left w:val="single" w:color="D9D4C5" w:sz="4"/>
+              <w:bottom w:val="single" w:color="D9D4C5" w:sz="4"/>
+              <w:right w:val="single" w:color="D9D4C5" w:sz="4"/>
+            </w:tcBorders>
+            <w:tcMar>
+              <w:top w:type="dxa" w:w="70"/>
+              <w:left w:type="dxa" w:w="110"/>
+              <w:bottom w:type="dxa" w:w="70"/>
+              <w:right w:type="dxa" w:w="110"/>
+            </w:tcMar>
+            <w:vAlign w:val="center"/>
+          </w:tcPr>
+          <w:p>
+            <w:pPr>
+              <w:spacing w:after="0" w:before="0"/>
+            </w:pPr>
+            <w:r>
+              <w:rPr>
+                <w:rFonts w:ascii="Arial" w:cs="Arial" w:eastAsia="Arial" w:hAnsi="Arial"/>
+                <w:color w:val="1B2118"/>
+                <w:sz w:val="18"/>
+                <w:szCs w:val="18"/>
+              </w:rPr>
+              <w:t xml:space="preserve">Tutte le pratiche con fase, scadenza e cose da fare, filtri e ricerca</w:t>
+            </w:r>
+          </w:p>
+        </w:tc>
+        <w:tc>
+          <w:tcPr>
+            <w:tcW w:type="dxa" w:w="2072"/>
+            <w:tcBorders>
+              <w:top w:val="single" w:color="D9D4C5" w:sz="4"/>
+              <w:left w:val="single" w:color="D9D4C5" w:sz="4"/>
+              <w:bottom w:val="single" w:color="D9D4C5" w:sz="4"/>
+              <w:right w:val="single" w:color="D9D4C5" w:sz="4"/>
+            </w:tcBorders>
+            <w:tcMar>
+              <w:top w:type="dxa" w:w="70"/>
+              <w:left w:type="dxa" w:w="110"/>
+              <w:bottom w:type="dxa" w:w="70"/>
+              <w:right w:type="dxa" w:w="110"/>
+            </w:tcMar>
+            <w:vAlign w:val="center"/>
+          </w:tcPr>
+          <w:p>
+            <w:pPr>
+              <w:spacing w:after="0" w:before="0"/>
+            </w:pPr>
+            <w:r>
+              <w:rPr>
+                <w:rFonts w:ascii="Arial" w:cs="Arial" w:eastAsia="Arial" w:hAnsi="Arial"/>
+                <w:color w:val="1B2118"/>
+                <w:sz w:val="18"/>
+                <w:szCs w:val="18"/>
+              </w:rPr>
+              <w:t xml:space="preserve">Fondazione</w:t>
             </w:r>
           </w:p>
         </w:tc>
@@ -5025,13 +5162,13 @@
                 <w:sz w:val="18"/>
                 <w:szCs w:val="18"/>
               </w:rPr>
-              <w:t xml:space="preserve">Audit</w:t>
-            </w:r>
-          </w:p>
-        </w:tc>
-        <w:tc>
-          <w:tcPr>
-            <w:tcW w:type="dxa" w:w="5546"/>
+              <w:t xml:space="preserve">Export</w:t>
+            </w:r>
+          </w:p>
+        </w:tc>
+        <w:tc>
+          <w:tcPr>
+            <w:tcW w:type="dxa" w:w="5556"/>
             <w:tcBorders>
               <w:top w:val="single" w:color="D9D4C5" w:sz="4"/>
               <w:left w:val="single" w:color="D9D4C5" w:sz="4"/>
@@ -5058,13 +5195,13 @@
                 <w:sz w:val="18"/>
                 <w:szCs w:val="18"/>
               </w:rPr>
-              <w:t xml:space="preserve">Registro non modificabile di ogni operazione, con motivazione</w:t>
-            </w:r>
-          </w:p>
-        </w:tc>
-        <w:tc>
-          <w:tcPr>
-            <w:tcW w:type="dxa" w:w="2082"/>
+              <w:t xml:space="preserve">Fascicolo completo della pratica in un file ZIP con riepilogo PDF</w:t>
+            </w:r>
+          </w:p>
+        </w:tc>
+        <w:tc>
+          <w:tcPr>
+            <w:tcW w:type="dxa" w:w="2072"/>
             <w:tcBorders>
               <w:top w:val="single" w:color="D9D4C5" w:sz="4"/>
               <w:left w:val="single" w:color="D9D4C5" w:sz="4"/>
@@ -5091,7 +5228,7 @@
                 <w:sz w:val="18"/>
                 <w:szCs w:val="18"/>
               </w:rPr>
-              <w:t xml:space="preserve">Amministratore</w:t>
+              <w:t xml:space="preserve">tutti</w:t>
             </w:r>
           </w:p>
         </w:tc>
@@ -5128,45 +5265,45 @@
                 <w:sz w:val="18"/>
                 <w:szCs w:val="18"/>
               </w:rPr>
-              <w:t xml:space="preserve">Utenti e impostazioni</w:t>
-            </w:r>
-          </w:p>
-        </w:tc>
-        <w:tc>
-          <w:tcPr>
-            <w:tcW w:type="dxa" w:w="5546"/>
-            <w:tcBorders>
-              <w:top w:val="single" w:color="D9D4C5" w:sz="4"/>
-              <w:left w:val="single" w:color="D9D4C5" w:sz="4"/>
-              <w:bottom w:val="single" w:color="D9D4C5" w:sz="4"/>
-              <w:right w:val="single" w:color="D9D4C5" w:sz="4"/>
-            </w:tcBorders>
-            <w:tcMar>
-              <w:top w:type="dxa" w:w="70"/>
-              <w:left w:type="dxa" w:w="110"/>
-              <w:bottom w:type="dxa" w:w="70"/>
-              <w:right w:type="dxa" w:w="110"/>
-            </w:tcMar>
-            <w:vAlign w:val="center"/>
-          </w:tcPr>
-          <w:p>
-            <w:pPr>
-              <w:spacing w:after="0" w:before="0"/>
-            </w:pPr>
-            <w:r>
-              <w:rPr>
-                <w:rFonts w:ascii="Arial" w:cs="Arial" w:eastAsia="Arial" w:hAnsi="Arial"/>
-                <w:color w:val="1B2118"/>
-                <w:sz w:val="18"/>
-                <w:szCs w:val="18"/>
-              </w:rPr>
-              <w:t xml:space="preserve">Creazione utenti, associazione ai Comuni, reimpostazione password, durata delle fasi, Enti di Validazione, modelli di documento</w:t>
-            </w:r>
-          </w:p>
-        </w:tc>
-        <w:tc>
-          <w:tcPr>
-            <w:tcW w:type="dxa" w:w="2082"/>
+              <w:t xml:space="preserve">Audit</w:t>
+            </w:r>
+          </w:p>
+        </w:tc>
+        <w:tc>
+          <w:tcPr>
+            <w:tcW w:type="dxa" w:w="5556"/>
+            <w:tcBorders>
+              <w:top w:val="single" w:color="D9D4C5" w:sz="4"/>
+              <w:left w:val="single" w:color="D9D4C5" w:sz="4"/>
+              <w:bottom w:val="single" w:color="D9D4C5" w:sz="4"/>
+              <w:right w:val="single" w:color="D9D4C5" w:sz="4"/>
+            </w:tcBorders>
+            <w:tcMar>
+              <w:top w:type="dxa" w:w="70"/>
+              <w:left w:type="dxa" w:w="110"/>
+              <w:bottom w:type="dxa" w:w="70"/>
+              <w:right w:type="dxa" w:w="110"/>
+            </w:tcMar>
+            <w:vAlign w:val="center"/>
+          </w:tcPr>
+          <w:p>
+            <w:pPr>
+              <w:spacing w:after="0" w:before="0"/>
+            </w:pPr>
+            <w:r>
+              <w:rPr>
+                <w:rFonts w:ascii="Arial" w:cs="Arial" w:eastAsia="Arial" w:hAnsi="Arial"/>
+                <w:color w:val="1B2118"/>
+                <w:sz w:val="18"/>
+                <w:szCs w:val="18"/>
+              </w:rPr>
+              <w:t xml:space="preserve">Registro non modificabile di ogni operazione, con motivazione</w:t>
+            </w:r>
+          </w:p>
+        </w:tc>
+        <w:tc>
+          <w:tcPr>
+            <w:tcW w:type="dxa" w:w="2072"/>
             <w:tcBorders>
               <w:top w:val="single" w:color="D9D4C5" w:sz="4"/>
               <w:left w:val="single" w:color="D9D4C5" w:sz="4"/>
@@ -5230,13 +5367,13 @@
                 <w:sz w:val="18"/>
                 <w:szCs w:val="18"/>
               </w:rPr>
-              <w:t xml:space="preserve">Calcolo crediti</w:t>
-            </w:r>
-          </w:p>
-        </w:tc>
-        <w:tc>
-          <w:tcPr>
-            <w:tcW w:type="dxa" w:w="5546"/>
+              <w:t xml:space="preserve">Utenti e impostazioni</w:t>
+            </w:r>
+          </w:p>
+        </w:tc>
+        <w:tc>
+          <w:tcPr>
+            <w:tcW w:type="dxa" w:w="5556"/>
             <w:tcBorders>
               <w:top w:val="single" w:color="D9D4C5" w:sz="4"/>
               <w:left w:val="single" w:color="D9D4C5" w:sz="4"/>
@@ -5263,13 +5400,13 @@
                 <w:sz w:val="18"/>
                 <w:szCs w:val="18"/>
               </w:rPr>
-              <w:t xml:space="preserve">Import del tracciato dati del Comune con controllo dei dati personali e della coerenza, calcolo secondo la Metodologia, rapporto PDF, conferma con numero di registro, registro dei crediti, nuove versioni</w:t>
-            </w:r>
-          </w:p>
-        </w:tc>
-        <w:tc>
-          <w:tcPr>
-            <w:tcW w:type="dxa" w:w="2082"/>
+              <w:t xml:space="preserve">Creazione utenti, associazione ai Comuni, reimpostazione password, durata delle fasi, documenti richiesti, modelli di documento</w:t>
+            </w:r>
+          </w:p>
+        </w:tc>
+        <w:tc>
+          <w:tcPr>
+            <w:tcW w:type="dxa" w:w="2072"/>
             <w:tcBorders>
               <w:top w:val="single" w:color="D9D4C5" w:sz="4"/>
               <w:left w:val="single" w:color="D9D4C5" w:sz="4"/>
@@ -5333,71 +5470,71 @@
                 <w:sz w:val="18"/>
                 <w:szCs w:val="18"/>
               </w:rPr>
-              <w:t xml:space="preserve">Formato dati</w:t>
-            </w:r>
-          </w:p>
-        </w:tc>
-        <w:tc>
-          <w:tcPr>
-            <w:tcW w:type="dxa" w:w="5546"/>
-            <w:tcBorders>
-              <w:top w:val="single" w:color="D9D4C5" w:sz="4"/>
-              <w:left w:val="single" w:color="D9D4C5" w:sz="4"/>
-              <w:bottom w:val="single" w:color="D9D4C5" w:sz="4"/>
-              <w:right w:val="single" w:color="D9D4C5" w:sz="4"/>
-            </w:tcBorders>
-            <w:tcMar>
-              <w:top w:type="dxa" w:w="70"/>
-              <w:left w:type="dxa" w:w="110"/>
-              <w:bottom w:type="dxa" w:w="70"/>
-              <w:right w:type="dxa" w:w="110"/>
-            </w:tcMar>
-            <w:vAlign w:val="center"/>
-          </w:tcPr>
-          <w:p>
-            <w:pPr>
-              <w:spacing w:after="0" w:before="0"/>
-            </w:pPr>
-            <w:r>
-              <w:rPr>
-                <w:rFonts w:ascii="Arial" w:cs="Arial" w:eastAsia="Arial" w:hAnsi="Arial"/>
-                <w:color w:val="1B2118"/>
-                <w:sz w:val="18"/>
-                <w:szCs w:val="18"/>
-              </w:rPr>
-              <w:t xml:space="preserve">Pagina pubblica con il tracciato Excel standard per i dati dei Comuni</w:t>
-            </w:r>
-          </w:p>
-        </w:tc>
-        <w:tc>
-          <w:tcPr>
-            <w:tcW w:type="dxa" w:w="2082"/>
-            <w:tcBorders>
-              <w:top w:val="single" w:color="D9D4C5" w:sz="4"/>
-              <w:left w:val="single" w:color="D9D4C5" w:sz="4"/>
-              <w:bottom w:val="single" w:color="D9D4C5" w:sz="4"/>
-              <w:right w:val="single" w:color="D9D4C5" w:sz="4"/>
-            </w:tcBorders>
-            <w:tcMar>
-              <w:top w:type="dxa" w:w="70"/>
-              <w:left w:type="dxa" w:w="110"/>
-              <w:bottom w:type="dxa" w:w="70"/>
-              <w:right w:type="dxa" w:w="110"/>
-            </w:tcMar>
-            <w:vAlign w:val="center"/>
-          </w:tcPr>
-          <w:p>
-            <w:pPr>
-              <w:spacing w:after="0" w:before="0"/>
-            </w:pPr>
-            <w:r>
-              <w:rPr>
-                <w:rFonts w:ascii="Arial" w:cs="Arial" w:eastAsia="Arial" w:hAnsi="Arial"/>
-                <w:color w:val="1B2118"/>
-                <w:sz w:val="18"/>
-                <w:szCs w:val="18"/>
-              </w:rPr>
-              <w:t xml:space="preserve">tutti, anche senza accesso</w:t>
+              <w:t xml:space="preserve">Calcolo crediti</w:t>
+            </w:r>
+          </w:p>
+        </w:tc>
+        <w:tc>
+          <w:tcPr>
+            <w:tcW w:type="dxa" w:w="5556"/>
+            <w:tcBorders>
+              <w:top w:val="single" w:color="D9D4C5" w:sz="4"/>
+              <w:left w:val="single" w:color="D9D4C5" w:sz="4"/>
+              <w:bottom w:val="single" w:color="D9D4C5" w:sz="4"/>
+              <w:right w:val="single" w:color="D9D4C5" w:sz="4"/>
+            </w:tcBorders>
+            <w:tcMar>
+              <w:top w:type="dxa" w:w="70"/>
+              <w:left w:type="dxa" w:w="110"/>
+              <w:bottom w:type="dxa" w:w="70"/>
+              <w:right w:type="dxa" w:w="110"/>
+            </w:tcMar>
+            <w:vAlign w:val="center"/>
+          </w:tcPr>
+          <w:p>
+            <w:pPr>
+              <w:spacing w:after="0" w:before="0"/>
+            </w:pPr>
+            <w:r>
+              <w:rPr>
+                <w:rFonts w:ascii="Arial" w:cs="Arial" w:eastAsia="Arial" w:hAnsi="Arial"/>
+                <w:color w:val="1B2118"/>
+                <w:sz w:val="18"/>
+                <w:szCs w:val="18"/>
+              </w:rPr>
+              <w:t xml:space="preserve">Import del tracciato dati del Comune con controllo dei dati personali e della coerenza, calcolo secondo la Metodologia, rapporto PDF, conferma con numero di registro, registro dei crediti, nuove versioni</w:t>
+            </w:r>
+          </w:p>
+        </w:tc>
+        <w:tc>
+          <w:tcPr>
+            <w:tcW w:type="dxa" w:w="2072"/>
+            <w:tcBorders>
+              <w:top w:val="single" w:color="D9D4C5" w:sz="4"/>
+              <w:left w:val="single" w:color="D9D4C5" w:sz="4"/>
+              <w:bottom w:val="single" w:color="D9D4C5" w:sz="4"/>
+              <w:right w:val="single" w:color="D9D4C5" w:sz="4"/>
+            </w:tcBorders>
+            <w:tcMar>
+              <w:top w:type="dxa" w:w="70"/>
+              <w:left w:type="dxa" w:w="110"/>
+              <w:bottom w:type="dxa" w:w="70"/>
+              <w:right w:type="dxa" w:w="110"/>
+            </w:tcMar>
+            <w:vAlign w:val="center"/>
+          </w:tcPr>
+          <w:p>
+            <w:pPr>
+              <w:spacing w:after="0" w:before="0"/>
+            </w:pPr>
+            <w:r>
+              <w:rPr>
+                <w:rFonts w:ascii="Arial" w:cs="Arial" w:eastAsia="Arial" w:hAnsi="Arial"/>
+                <w:color w:val="1B2118"/>
+                <w:sz w:val="18"/>
+                <w:szCs w:val="18"/>
+              </w:rPr>
+              <w:t xml:space="preserve">Amministratore</w:t>
             </w:r>
           </w:p>
         </w:tc>
@@ -5435,20 +5572,122 @@
                 <w:sz w:val="18"/>
                 <w:szCs w:val="18"/>
               </w:rPr>
+              <w:t xml:space="preserve">Formato dati</w:t>
+            </w:r>
+          </w:p>
+        </w:tc>
+        <w:tc>
+          <w:tcPr>
+            <w:tcW w:type="dxa" w:w="5556"/>
+            <w:tcBorders>
+              <w:top w:val="single" w:color="D9D4C5" w:sz="4"/>
+              <w:left w:val="single" w:color="D9D4C5" w:sz="4"/>
+              <w:bottom w:val="single" w:color="D9D4C5" w:sz="4"/>
+              <w:right w:val="single" w:color="D9D4C5" w:sz="4"/>
+            </w:tcBorders>
+            <w:shd w:fill="F6F4EE" w:color="auto" w:val="clear"/>
+            <w:tcMar>
+              <w:top w:type="dxa" w:w="70"/>
+              <w:left w:type="dxa" w:w="110"/>
+              <w:bottom w:type="dxa" w:w="70"/>
+              <w:right w:type="dxa" w:w="110"/>
+            </w:tcMar>
+            <w:vAlign w:val="center"/>
+          </w:tcPr>
+          <w:p>
+            <w:pPr>
+              <w:spacing w:after="0" w:before="0"/>
+            </w:pPr>
+            <w:r>
+              <w:rPr>
+                <w:rFonts w:ascii="Arial" w:cs="Arial" w:eastAsia="Arial" w:hAnsi="Arial"/>
+                <w:color w:val="1B2118"/>
+                <w:sz w:val="18"/>
+                <w:szCs w:val="18"/>
+              </w:rPr>
+              <w:t xml:space="preserve">Pagina pubblica con il tracciato Excel standard per i dati dei Comuni</w:t>
+            </w:r>
+          </w:p>
+        </w:tc>
+        <w:tc>
+          <w:tcPr>
+            <w:tcW w:type="dxa" w:w="2072"/>
+            <w:tcBorders>
+              <w:top w:val="single" w:color="D9D4C5" w:sz="4"/>
+              <w:left w:val="single" w:color="D9D4C5" w:sz="4"/>
+              <w:bottom w:val="single" w:color="D9D4C5" w:sz="4"/>
+              <w:right w:val="single" w:color="D9D4C5" w:sz="4"/>
+            </w:tcBorders>
+            <w:shd w:fill="F6F4EE" w:color="auto" w:val="clear"/>
+            <w:tcMar>
+              <w:top w:type="dxa" w:w="70"/>
+              <w:left w:type="dxa" w:w="110"/>
+              <w:bottom w:type="dxa" w:w="70"/>
+              <w:right w:type="dxa" w:w="110"/>
+            </w:tcMar>
+            <w:vAlign w:val="center"/>
+          </w:tcPr>
+          <w:p>
+            <w:pPr>
+              <w:spacing w:after="0" w:before="0"/>
+            </w:pPr>
+            <w:r>
+              <w:rPr>
+                <w:rFonts w:ascii="Arial" w:cs="Arial" w:eastAsia="Arial" w:hAnsi="Arial"/>
+                <w:color w:val="1B2118"/>
+                <w:sz w:val="18"/>
+                <w:szCs w:val="18"/>
+              </w:rPr>
+              <w:t xml:space="preserve">tutti, anche senza accesso</w:t>
+            </w:r>
+          </w:p>
+        </w:tc>
+      </w:tr>
+      <w:tr>
+        <w:trPr>
+          <w:cantSplit/>
+        </w:trPr>
+        <w:tc>
+          <w:tcPr>
+            <w:tcW w:type="dxa" w:w="2010"/>
+            <w:tcBorders>
+              <w:top w:val="single" w:color="D9D4C5" w:sz="4"/>
+              <w:left w:val="single" w:color="D9D4C5" w:sz="4"/>
+              <w:bottom w:val="single" w:color="D9D4C5" w:sz="4"/>
+              <w:right w:val="single" w:color="D9D4C5" w:sz="4"/>
+            </w:tcBorders>
+            <w:tcMar>
+              <w:top w:type="dxa" w:w="70"/>
+              <w:left w:type="dxa" w:w="110"/>
+              <w:bottom w:type="dxa" w:w="70"/>
+              <w:right w:type="dxa" w:w="110"/>
+            </w:tcMar>
+            <w:vAlign w:val="center"/>
+          </w:tcPr>
+          <w:p>
+            <w:pPr>
+              <w:spacing w:after="0" w:before="0"/>
+            </w:pPr>
+            <w:r>
+              <w:rPr>
+                <w:rFonts w:ascii="Arial" w:cs="Arial" w:eastAsia="Arial" w:hAnsi="Arial"/>
+                <w:color w:val="1B2118"/>
+                <w:sz w:val="18"/>
+                <w:szCs w:val="18"/>
+              </w:rPr>
               <w:t xml:space="preserve">Documentazione</w:t>
             </w:r>
           </w:p>
         </w:tc>
         <w:tc>
           <w:tcPr>
-            <w:tcW w:type="dxa" w:w="5546"/>
-            <w:tcBorders>
-              <w:top w:val="single" w:color="D9D4C5" w:sz="4"/>
-              <w:left w:val="single" w:color="D9D4C5" w:sz="4"/>
-              <w:bottom w:val="single" w:color="D9D4C5" w:sz="4"/>
-              <w:right w:val="single" w:color="D9D4C5" w:sz="4"/>
-            </w:tcBorders>
-            <w:shd w:fill="F6F4EE" w:color="auto" w:val="clear"/>
+            <w:tcW w:type="dxa" w:w="5556"/>
+            <w:tcBorders>
+              <w:top w:val="single" w:color="D9D4C5" w:sz="4"/>
+              <w:left w:val="single" w:color="D9D4C5" w:sz="4"/>
+              <w:bottom w:val="single" w:color="D9D4C5" w:sz="4"/>
+              <w:right w:val="single" w:color="D9D4C5" w:sz="4"/>
+            </w:tcBorders>
             <w:tcMar>
               <w:top w:type="dxa" w:w="70"/>
               <w:left w:type="dxa" w:w="110"/>
@@ -5474,14 +5713,13 @@
         </w:tc>
         <w:tc>
           <w:tcPr>
-            <w:tcW w:type="dxa" w:w="2082"/>
-            <w:tcBorders>
-              <w:top w:val="single" w:color="D9D4C5" w:sz="4"/>
-              <w:left w:val="single" w:color="D9D4C5" w:sz="4"/>
-              <w:bottom w:val="single" w:color="D9D4C5" w:sz="4"/>
-              <w:right w:val="single" w:color="D9D4C5" w:sz="4"/>
-            </w:tcBorders>
-            <w:shd w:fill="F6F4EE" w:color="auto" w:val="clear"/>
+            <w:tcW w:type="dxa" w:w="2072"/>
+            <w:tcBorders>
+              <w:top w:val="single" w:color="D9D4C5" w:sz="4"/>
+              <w:left w:val="single" w:color="D9D4C5" w:sz="4"/>
+              <w:bottom w:val="single" w:color="D9D4C5" w:sz="4"/>
+              <w:right w:val="single" w:color="D9D4C5" w:sz="4"/>
+            </w:tcBorders>
             <w:tcMar>
               <w:top w:type="dxa" w:w="70"/>
               <w:left w:type="dxa" w:w="110"/>
@@ -6012,7 +6250,7 @@
                 <w:sz w:val="18"/>
                 <w:szCs w:val="18"/>
               </w:rPr>
-              <w:t xml:space="preserve">1.3</w:t>
+              <w:t xml:space="preserve">1.2b</w:t>
             </w:r>
           </w:p>
         </w:tc>
@@ -6044,7 +6282,7 @@
                 <w:sz w:val="18"/>
                 <w:szCs w:val="18"/>
               </w:rPr>
-              <w:t xml:space="preserve">[A] Utenti → + Nuovo utente, ruolo Cliente, associato a «Comune di Prova»</w:t>
+              <w:t xml:space="preserve">[O] Anagrafiche → Organizzazioni: Modifica «Comune di Prova» aggiungendo codice fiscale e PEC</w:t>
             </w:r>
           </w:p>
         </w:tc>
@@ -6076,7 +6314,7 @@
                 <w:sz w:val="18"/>
                 <w:szCs w:val="18"/>
               </w:rPr>
-              <w:t xml:space="preserve">L'utente compare in elenco; annotate la password temporanea</w:t>
+              <w:t xml:space="preserve">Dati salvati; sotto l'organizzazione compare la pratica creata</w:t>
             </w:r>
           </w:p>
         </w:tc>
@@ -6114,7 +6352,7 @@
                 <w:sz w:val="18"/>
                 <w:szCs w:val="18"/>
               </w:rPr>
-              <w:t xml:space="preserve">1.4</w:t>
+              <w:t xml:space="preserve">1.3</w:t>
             </w:r>
           </w:p>
         </w:tc>
@@ -6147,7 +6385,7 @@
                 <w:sz w:val="18"/>
                 <w:szCs w:val="18"/>
               </w:rPr>
-              <w:t xml:space="preserve">[C] Accedete con la password temporanea</w:t>
+              <w:t xml:space="preserve">[A] Utenti → + Nuovo utente, ruolo Cliente, associato a «Comune di Prova»</w:t>
             </w:r>
           </w:p>
         </w:tc>
@@ -6180,7 +6418,7 @@
                 <w:sz w:val="18"/>
                 <w:szCs w:val="18"/>
               </w:rPr>
-              <w:t xml:space="preserve">Il portale chiede subito una nuova password (min. 10 caratteri, lettere e numeri)</w:t>
+              <w:t xml:space="preserve">L'utente compare in elenco; annotate la password temporanea</w:t>
             </w:r>
           </w:p>
         </w:tc>
@@ -6217,7 +6455,7 @@
                 <w:sz w:val="18"/>
                 <w:szCs w:val="18"/>
               </w:rPr>
-              <w:t xml:space="preserve">1.5</w:t>
+              <w:t xml:space="preserve">1.4</w:t>
             </w:r>
           </w:p>
         </w:tc>
@@ -6249,7 +6487,7 @@
                 <w:sz w:val="18"/>
                 <w:szCs w:val="18"/>
               </w:rPr>
-              <w:t xml:space="preserve">[C] Aprite Il mio profilo e il Manuale</w:t>
+              <w:t xml:space="preserve">[C] Accedete con la password temporanea</w:t>
             </w:r>
           </w:p>
         </w:tc>
@@ -6281,7 +6519,7 @@
                 <w:sz w:val="18"/>
                 <w:szCs w:val="18"/>
               </w:rPr>
-              <w:t xml:space="preserve">Dati dell'account; manuale scaricabile in PDF</w:t>
+              <w:t xml:space="preserve">Il portale chiede subito una nuova password (min. 10 caratteri, lettere e numeri)</w:t>
             </w:r>
           </w:p>
         </w:tc>
@@ -6319,7 +6557,7 @@
                 <w:sz w:val="18"/>
                 <w:szCs w:val="18"/>
               </w:rPr>
-              <w:t xml:space="preserve">1.6</w:t>
+              <w:t xml:space="preserve">1.5</w:t>
             </w:r>
           </w:p>
         </w:tc>
@@ -6352,7 +6590,7 @@
                 <w:sz w:val="18"/>
                 <w:szCs w:val="18"/>
               </w:rPr>
-              <w:t xml:space="preserve">[A] Impostazioni → Enti di Validazione: + Nuovo ente «RINA (prova)»</w:t>
+              <w:t xml:space="preserve">[C] Aprite Il mio profilo e il Manuale</w:t>
             </w:r>
           </w:p>
         </w:tc>
@@ -6385,7 +6623,7 @@
                 <w:sz w:val="18"/>
                 <w:szCs w:val="18"/>
               </w:rPr>
-              <w:t xml:space="preserve">L'ente compare in elenco</w:t>
+              <w:t xml:space="preserve">Dati dell'account; manuale scaricabile in PDF</w:t>
             </w:r>
           </w:p>
         </w:tc>
@@ -6422,6 +6660,108 @@
                 <w:sz w:val="18"/>
                 <w:szCs w:val="18"/>
               </w:rPr>
+              <w:t xml:space="preserve">1.6</w:t>
+            </w:r>
+          </w:p>
+        </w:tc>
+        <w:tc>
+          <w:tcPr>
+            <w:tcW w:type="dxa" w:w="4414"/>
+            <w:tcBorders>
+              <w:top w:val="single" w:color="D9D4C5" w:sz="4"/>
+              <w:left w:val="single" w:color="D9D4C5" w:sz="4"/>
+              <w:bottom w:val="single" w:color="D9D4C5" w:sz="4"/>
+              <w:right w:val="single" w:color="D9D4C5" w:sz="4"/>
+            </w:tcBorders>
+            <w:tcMar>
+              <w:top w:type="dxa" w:w="70"/>
+              <w:left w:type="dxa" w:w="110"/>
+              <w:bottom w:type="dxa" w:w="70"/>
+              <w:right w:type="dxa" w:w="110"/>
+            </w:tcMar>
+            <w:vAlign w:val="center"/>
+          </w:tcPr>
+          <w:p>
+            <w:pPr>
+              <w:spacing w:after="0" w:before="0"/>
+            </w:pPr>
+            <w:r>
+              <w:rPr>
+                <w:rFonts w:ascii="Arial" w:cs="Arial" w:eastAsia="Arial" w:hAnsi="Arial"/>
+                <w:color w:val="1B2118"/>
+                <w:sz w:val="18"/>
+                <w:szCs w:val="18"/>
+              </w:rPr>
+              <w:t xml:space="preserve">[O] Anagrafiche → Enti di Validazione: + Nuovo ente «RINA (prova)»</w:t>
+            </w:r>
+          </w:p>
+        </w:tc>
+        <w:tc>
+          <w:tcPr>
+            <w:tcW w:type="dxa" w:w="4415"/>
+            <w:tcBorders>
+              <w:top w:val="single" w:color="D9D4C5" w:sz="4"/>
+              <w:left w:val="single" w:color="D9D4C5" w:sz="4"/>
+              <w:bottom w:val="single" w:color="D9D4C5" w:sz="4"/>
+              <w:right w:val="single" w:color="D9D4C5" w:sz="4"/>
+            </w:tcBorders>
+            <w:tcMar>
+              <w:top w:type="dxa" w:w="70"/>
+              <w:left w:type="dxa" w:w="110"/>
+              <w:bottom w:type="dxa" w:w="70"/>
+              <w:right w:type="dxa" w:w="110"/>
+            </w:tcMar>
+            <w:vAlign w:val="center"/>
+          </w:tcPr>
+          <w:p>
+            <w:pPr>
+              <w:spacing w:after="0" w:before="0"/>
+            </w:pPr>
+            <w:r>
+              <w:rPr>
+                <w:rFonts w:ascii="Arial" w:cs="Arial" w:eastAsia="Arial" w:hAnsi="Arial"/>
+                <w:color w:val="1B2118"/>
+                <w:sz w:val="18"/>
+                <w:szCs w:val="18"/>
+              </w:rPr>
+              <w:t xml:space="preserve">L'ente compare in elenco (anche un Operatore può crearlo)</w:t>
+            </w:r>
+          </w:p>
+        </w:tc>
+      </w:tr>
+      <w:tr>
+        <w:trPr>
+          <w:cantSplit/>
+        </w:trPr>
+        <w:tc>
+          <w:tcPr>
+            <w:tcW w:type="dxa" w:w="809"/>
+            <w:tcBorders>
+              <w:top w:val="single" w:color="D9D4C5" w:sz="4"/>
+              <w:left w:val="single" w:color="D9D4C5" w:sz="4"/>
+              <w:bottom w:val="single" w:color="D9D4C5" w:sz="4"/>
+              <w:right w:val="single" w:color="D9D4C5" w:sz="4"/>
+            </w:tcBorders>
+            <w:shd w:fill="F6F4EE" w:color="auto" w:val="clear"/>
+            <w:tcMar>
+              <w:top w:type="dxa" w:w="70"/>
+              <w:left w:type="dxa" w:w="110"/>
+              <w:bottom w:type="dxa" w:w="70"/>
+              <w:right w:type="dxa" w:w="110"/>
+            </w:tcMar>
+            <w:vAlign w:val="center"/>
+          </w:tcPr>
+          <w:p>
+            <w:pPr>
+              <w:spacing w:after="0" w:before="0"/>
+            </w:pPr>
+            <w:r>
+              <w:rPr>
+                <w:rFonts w:ascii="Arial" w:cs="Arial" w:eastAsia="Arial" w:hAnsi="Arial"/>
+                <w:color w:val="1B2118"/>
+                <w:sz w:val="18"/>
+                <w:szCs w:val="18"/>
+              </w:rPr>
               <w:t xml:space="preserve">1.7</w:t>
             </w:r>
           </w:p>
@@ -6435,26 +6775,27 @@
               <w:bottom w:val="single" w:color="D9D4C5" w:sz="4"/>
               <w:right w:val="single" w:color="D9D4C5" w:sz="4"/>
             </w:tcBorders>
-            <w:tcMar>
-              <w:top w:type="dxa" w:w="70"/>
-              <w:left w:type="dxa" w:w="110"/>
-              <w:bottom w:type="dxa" w:w="70"/>
-              <w:right w:type="dxa" w:w="110"/>
-            </w:tcMar>
-            <w:vAlign w:val="center"/>
-          </w:tcPr>
-          <w:p>
-            <w:pPr>
-              <w:spacing w:after="0" w:before="0"/>
-            </w:pPr>
-            <w:r>
-              <w:rPr>
-                <w:rFonts w:ascii="Arial" w:cs="Arial" w:eastAsia="Arial" w:hAnsi="Arial"/>
-                <w:color w:val="1B2118"/>
-                <w:sz w:val="18"/>
-                <w:szCs w:val="18"/>
-              </w:rPr>
-              <w:t xml:space="preserve">[A] Impostazioni → Modelli di documento: un modello per la fase 1 e uno Generale</w:t>
+            <w:shd w:fill="F6F4EE" w:color="auto" w:val="clear"/>
+            <w:tcMar>
+              <w:top w:type="dxa" w:w="70"/>
+              <w:left w:type="dxa" w:w="110"/>
+              <w:bottom w:type="dxa" w:w="70"/>
+              <w:right w:type="dxa" w:w="110"/>
+            </w:tcMar>
+            <w:vAlign w:val="center"/>
+          </w:tcPr>
+          <w:p>
+            <w:pPr>
+              <w:spacing w:after="0" w:before="0"/>
+            </w:pPr>
+            <w:r>
+              <w:rPr>
+                <w:rFonts w:ascii="Arial" w:cs="Arial" w:eastAsia="Arial" w:hAnsi="Arial"/>
+                <w:color w:val="1B2118"/>
+                <w:sz w:val="18"/>
+                <w:szCs w:val="18"/>
+              </w:rPr>
+              <w:t xml:space="preserve">[A] Impostazioni → Modelli di documento: un modello per «Progetto · Fase 1» e uno Generale</w:t>
             </w:r>
           </w:p>
         </w:tc>
@@ -6467,6 +6808,7 @@
               <w:bottom w:val="single" w:color="D9D4C5" w:sz="4"/>
               <w:right w:val="single" w:color="D9D4C5" w:sz="4"/>
             </w:tcBorders>
+            <w:shd w:fill="F6F4EE" w:color="auto" w:val="clear"/>
             <w:tcMar>
               <w:top w:type="dxa" w:w="70"/>
               <w:left w:type="dxa" w:w="110"/>
@@ -6487,6 +6829,107 @@
                 <w:szCs w:val="18"/>
               </w:rPr>
               <w:t xml:space="preserve">Pubblicati; il Comune vede il primo nella fase 1 e il secondo in I tuoi documenti</w:t>
+            </w:r>
+          </w:p>
+        </w:tc>
+      </w:tr>
+      <w:tr>
+        <w:trPr>
+          <w:cantSplit/>
+        </w:trPr>
+        <w:tc>
+          <w:tcPr>
+            <w:tcW w:type="dxa" w:w="809"/>
+            <w:tcBorders>
+              <w:top w:val="single" w:color="D9D4C5" w:sz="4"/>
+              <w:left w:val="single" w:color="D9D4C5" w:sz="4"/>
+              <w:bottom w:val="single" w:color="D9D4C5" w:sz="4"/>
+              <w:right w:val="single" w:color="D9D4C5" w:sz="4"/>
+            </w:tcBorders>
+            <w:tcMar>
+              <w:top w:type="dxa" w:w="70"/>
+              <w:left w:type="dxa" w:w="110"/>
+              <w:bottom w:type="dxa" w:w="70"/>
+              <w:right w:type="dxa" w:w="110"/>
+            </w:tcMar>
+            <w:vAlign w:val="center"/>
+          </w:tcPr>
+          <w:p>
+            <w:pPr>
+              <w:spacing w:after="0" w:before="0"/>
+            </w:pPr>
+            <w:r>
+              <w:rPr>
+                <w:rFonts w:ascii="Arial" w:cs="Arial" w:eastAsia="Arial" w:hAnsi="Arial"/>
+                <w:color w:val="1B2118"/>
+                <w:sz w:val="18"/>
+                <w:szCs w:val="18"/>
+              </w:rPr>
+              <w:t xml:space="preserve">1.8</w:t>
+            </w:r>
+          </w:p>
+        </w:tc>
+        <w:tc>
+          <w:tcPr>
+            <w:tcW w:type="dxa" w:w="4414"/>
+            <w:tcBorders>
+              <w:top w:val="single" w:color="D9D4C5" w:sz="4"/>
+              <w:left w:val="single" w:color="D9D4C5" w:sz="4"/>
+              <w:bottom w:val="single" w:color="D9D4C5" w:sz="4"/>
+              <w:right w:val="single" w:color="D9D4C5" w:sz="4"/>
+            </w:tcBorders>
+            <w:tcMar>
+              <w:top w:type="dxa" w:w="70"/>
+              <w:left w:type="dxa" w:w="110"/>
+              <w:bottom w:type="dxa" w:w="70"/>
+              <w:right w:type="dxa" w:w="110"/>
+            </w:tcMar>
+            <w:vAlign w:val="center"/>
+          </w:tcPr>
+          <w:p>
+            <w:pPr>
+              <w:spacing w:after="0" w:before="0"/>
+            </w:pPr>
+            <w:r>
+              <w:rPr>
+                <w:rFonts w:ascii="Arial" w:cs="Arial" w:eastAsia="Arial" w:hAnsi="Arial"/>
+                <w:color w:val="1B2118"/>
+                <w:sz w:val="18"/>
+                <w:szCs w:val="18"/>
+              </w:rPr>
+              <w:t xml:space="preserve">[A] Impostazioni → Documenti richiesti per fase: Progetto, Fase 2, tipologia «Documento di progetto»</w:t>
+            </w:r>
+          </w:p>
+        </w:tc>
+        <w:tc>
+          <w:tcPr>
+            <w:tcW w:type="dxa" w:w="4415"/>
+            <w:tcBorders>
+              <w:top w:val="single" w:color="D9D4C5" w:sz="4"/>
+              <w:left w:val="single" w:color="D9D4C5" w:sz="4"/>
+              <w:bottom w:val="single" w:color="D9D4C5" w:sz="4"/>
+              <w:right w:val="single" w:color="D9D4C5" w:sz="4"/>
+            </w:tcBorders>
+            <w:tcMar>
+              <w:top w:type="dxa" w:w="70"/>
+              <w:left w:type="dxa" w:w="110"/>
+              <w:bottom w:type="dxa" w:w="70"/>
+              <w:right w:type="dxa" w:w="110"/>
+            </w:tcMar>
+            <w:vAlign w:val="center"/>
+          </w:tcPr>
+          <w:p>
+            <w:pPr>
+              <w:spacing w:after="0" w:before="0"/>
+            </w:pPr>
+            <w:r>
+              <w:rPr>
+                <w:rFonts w:ascii="Arial" w:cs="Arial" w:eastAsia="Arial" w:hAnsi="Arial"/>
+                <w:color w:val="1B2118"/>
+                <w:sz w:val="18"/>
+                <w:szCs w:val="18"/>
+              </w:rPr>
+              <w:t xml:space="preserve">La voce compare in elenco</w:t>
             </w:r>
           </w:p>
         </w:tc>
@@ -7883,7 +8326,7 @@
                 <w:sz w:val="18"/>
                 <w:szCs w:val="18"/>
               </w:rPr>
-              <w:t xml:space="preserve">[C] Nella fase 2 caricate un documento di progetto</w:t>
+              <w:t xml:space="preserve">[C] Nella fase 2 guardate «Documenti richiesti», poi caricate un file scegliendo «Documento di progetto»</w:t>
             </w:r>
           </w:p>
         </w:tc>
@@ -7916,7 +8359,7 @@
                 <w:sz w:val="18"/>
                 <w:szCs w:val="18"/>
               </w:rPr>
-              <w:t xml:space="preserve">Lo staff riceve la notifica «Il Cliente ha caricato un documento»</w:t>
+              <w:t xml:space="preserve">Prima «○ manca», dopo «✓ presente»; lo staff riceve la notifica «Il Cliente ha caricato un documento»</w:t>
             </w:r>
           </w:p>
         </w:tc>
@@ -8327,6 +8770,107 @@
                 <w:szCs w:val="18"/>
               </w:rPr>
               <w:t xml:space="preserve">La fase torna In corso dopo la chiusura dell'integrazione, poi Completata</w:t>
+            </w:r>
+          </w:p>
+        </w:tc>
+      </w:tr>
+      <w:tr>
+        <w:trPr>
+          <w:cantSplit/>
+        </w:trPr>
+        <w:tc>
+          <w:tcPr>
+            <w:tcW w:type="dxa" w:w="809"/>
+            <w:tcBorders>
+              <w:top w:val="single" w:color="D9D4C5" w:sz="4"/>
+              <w:left w:val="single" w:color="D9D4C5" w:sz="4"/>
+              <w:bottom w:val="single" w:color="D9D4C5" w:sz="4"/>
+              <w:right w:val="single" w:color="D9D4C5" w:sz="4"/>
+            </w:tcBorders>
+            <w:tcMar>
+              <w:top w:type="dxa" w:w="70"/>
+              <w:left w:type="dxa" w:w="110"/>
+              <w:bottom w:type="dxa" w:w="70"/>
+              <w:right w:type="dxa" w:w="110"/>
+            </w:tcMar>
+            <w:vAlign w:val="center"/>
+          </w:tcPr>
+          <w:p>
+            <w:pPr>
+              <w:spacing w:after="0" w:before="0"/>
+            </w:pPr>
+            <w:r>
+              <w:rPr>
+                <w:rFonts w:ascii="Arial" w:cs="Arial" w:eastAsia="Arial" w:hAnsi="Arial"/>
+                <w:color w:val="1B2118"/>
+                <w:sz w:val="18"/>
+                <w:szCs w:val="18"/>
+              </w:rPr>
+              <w:t xml:space="preserve">3.7</w:t>
+            </w:r>
+          </w:p>
+        </w:tc>
+        <w:tc>
+          <w:tcPr>
+            <w:tcW w:type="dxa" w:w="4414"/>
+            <w:tcBorders>
+              <w:top w:val="single" w:color="D9D4C5" w:sz="4"/>
+              <w:left w:val="single" w:color="D9D4C5" w:sz="4"/>
+              <w:bottom w:val="single" w:color="D9D4C5" w:sz="4"/>
+              <w:right w:val="single" w:color="D9D4C5" w:sz="4"/>
+            </w:tcBorders>
+            <w:tcMar>
+              <w:top w:type="dxa" w:w="70"/>
+              <w:left w:type="dxa" w:w="110"/>
+              <w:bottom w:type="dxa" w:w="70"/>
+              <w:right w:type="dxa" w:w="110"/>
+            </w:tcMar>
+            <w:vAlign w:val="center"/>
+          </w:tcPr>
+          <w:p>
+            <w:pPr>
+              <w:spacing w:after="0" w:before="0"/>
+            </w:pPr>
+            <w:r>
+              <w:rPr>
+                <w:rFonts w:ascii="Arial" w:cs="Arial" w:eastAsia="Arial" w:hAnsi="Arial"/>
+                <w:color w:val="1B2118"/>
+                <w:sz w:val="18"/>
+                <w:szCs w:val="18"/>
+              </w:rPr>
+              <w:t xml:space="preserve">[C] Riaprite la fase 2 completata</w:t>
+            </w:r>
+          </w:p>
+        </w:tc>
+        <w:tc>
+          <w:tcPr>
+            <w:tcW w:type="dxa" w:w="4415"/>
+            <w:tcBorders>
+              <w:top w:val="single" w:color="D9D4C5" w:sz="4"/>
+              <w:left w:val="single" w:color="D9D4C5" w:sz="4"/>
+              <w:bottom w:val="single" w:color="D9D4C5" w:sz="4"/>
+              <w:right w:val="single" w:color="D9D4C5" w:sz="4"/>
+            </w:tcBorders>
+            <w:tcMar>
+              <w:top w:type="dxa" w:w="70"/>
+              <w:left w:type="dxa" w:w="110"/>
+              <w:bottom w:type="dxa" w:w="70"/>
+              <w:right w:type="dxa" w:w="110"/>
+            </w:tcMar>
+            <w:vAlign w:val="center"/>
+          </w:tcPr>
+          <w:p>
+            <w:pPr>
+              <w:spacing w:after="0" w:before="0"/>
+            </w:pPr>
+            <w:r>
+              <w:rPr>
+                <w:rFonts w:ascii="Arial" w:cs="Arial" w:eastAsia="Arial" w:hAnsi="Arial"/>
+                <w:color w:val="1B2118"/>
+                <w:sz w:val="18"/>
+                <w:szCs w:val="18"/>
+              </w:rPr>
+              <w:t xml:space="preserve">Il pulsante + Carica non c'è più (si carica solo nelle fasi aperte)</w:t>
             </w:r>
           </w:p>
         </w:tc>
@@ -8579,7 +9123,7 @@
                 <w:sz w:val="18"/>
                 <w:szCs w:val="18"/>
               </w:rPr>
-              <w:t xml:space="preserve">Consultazione Attiva per 30 giorni; notifica al Comune; link alla pagina pubblica</w:t>
+              <w:t xml:space="preserve">Consultazione Attiva per 30 giorni; il documento diventa Pubblico; notifica al Comune; link alla pagina pubblica</w:t>
             </w:r>
           </w:p>
         </w:tc>
@@ -8617,7 +9161,7 @@
                 <w:sz w:val="18"/>
                 <w:szCs w:val="18"/>
               </w:rPr>
-              <w:t xml:space="preserve">4.2</w:t>
+              <w:t xml:space="preserve">4.1b</w:t>
             </w:r>
           </w:p>
         </w:tc>
@@ -8650,7 +9194,7 @@
                 <w:sz w:val="18"/>
                 <w:szCs w:val="18"/>
               </w:rPr>
-              <w:t xml:space="preserve">Senza accesso, aprite Consultazioni pubbliche (link nella pagina di accesso) e la consultazione</w:t>
+              <w:t xml:space="preserve">[O] Sul documento in consultazione provate a togliere la spunta Pubblico</w:t>
             </w:r>
           </w:p>
         </w:tc>
@@ -8683,7 +9227,7 @@
                 <w:sz w:val="18"/>
                 <w:szCs w:val="18"/>
               </w:rPr>
-              <w:t xml:space="preserve">Si leggono documento e osservazioni pubblicate</w:t>
+              <w:t xml:space="preserve">Rifiutato: «Il documento è pubblicato in una consultazione attiva…»</w:t>
             </w:r>
           </w:p>
         </w:tc>
@@ -8720,7 +9264,7 @@
                 <w:sz w:val="18"/>
                 <w:szCs w:val="18"/>
               </w:rPr>
-              <w:t xml:space="preserve">4.3</w:t>
+              <w:t xml:space="preserve">4.2</w:t>
             </w:r>
           </w:p>
         </w:tc>
@@ -8752,7 +9296,7 @@
                 <w:sz w:val="18"/>
                 <w:szCs w:val="18"/>
               </w:rPr>
-              <w:t xml:space="preserve">Inviate un'osservazione con nome, email (quella del titolare del servizio email, vedi limiti) e un PDF allegato</w:t>
+              <w:t xml:space="preserve">Senza accesso, aprite Consultazioni pubbliche (link nella pagina di accesso) e la consultazione</w:t>
             </w:r>
           </w:p>
         </w:tc>
@@ -8784,7 +9328,7 @@
                 <w:sz w:val="18"/>
                 <w:szCs w:val="18"/>
               </w:rPr>
-              <w:t xml:space="preserve">Messaggio «Controlla la tua email»; arriva l'email di conferma</w:t>
+              <w:t xml:space="preserve">Si leggono documento e osservazioni pubblicate</w:t>
             </w:r>
           </w:p>
         </w:tc>
@@ -8822,7 +9366,7 @@
                 <w:sz w:val="18"/>
                 <w:szCs w:val="18"/>
               </w:rPr>
-              <w:t xml:space="preserve">4.4</w:t>
+              <w:t xml:space="preserve">4.3</w:t>
             </w:r>
           </w:p>
         </w:tc>
@@ -8855,7 +9399,7 @@
                 <w:sz w:val="18"/>
                 <w:szCs w:val="18"/>
               </w:rPr>
-              <w:t xml:space="preserve">Premete il pulsante dell'email; riprovate lo stesso collegamento</w:t>
+              <w:t xml:space="preserve">Inviate un'osservazione con nome, email (quella del titolare del servizio email, vedi limiti) e un PDF allegato</w:t>
             </w:r>
           </w:p>
         </w:tc>
@@ -8888,7 +9432,7 @@
                 <w:sz w:val="18"/>
                 <w:szCs w:val="18"/>
               </w:rPr>
-              <w:t xml:space="preserve">Prima volta: «osservazione ricevuta», notifica allo staff; seconda volta: collegamento già utilizzato</w:t>
+              <w:t xml:space="preserve">Messaggio «Controlla la tua email»; arriva l'email di conferma</w:t>
             </w:r>
           </w:p>
         </w:tc>
@@ -8925,7 +9469,7 @@
                 <w:sz w:val="18"/>
                 <w:szCs w:val="18"/>
               </w:rPr>
-              <w:t xml:space="preserve">4.5</w:t>
+              <w:t xml:space="preserve">4.4</w:t>
             </w:r>
           </w:p>
         </w:tc>
@@ -8957,7 +9501,7 @@
                 <w:sz w:val="18"/>
                 <w:szCs w:val="18"/>
               </w:rPr>
-              <w:t xml:space="preserve">Provate a inviare 4 osservazioni in un'ora con lo stesso indirizzo; un allegato .exe</w:t>
+              <w:t xml:space="preserve">Premete il pulsante dell'email; riprovate lo stesso collegamento</w:t>
             </w:r>
           </w:p>
         </w:tc>
@@ -8989,7 +9533,7 @@
                 <w:sz w:val="18"/>
                 <w:szCs w:val="18"/>
               </w:rPr>
-              <w:t xml:space="preserve">La quarta e l'allegato sono rifiutati con un messaggio chiaro</w:t>
+              <w:t xml:space="preserve">Prima volta: «osservazione ricevuta», notifica allo staff; seconda volta: collegamento già utilizzato</w:t>
             </w:r>
           </w:p>
         </w:tc>
@@ -9027,7 +9571,7 @@
                 <w:sz w:val="18"/>
                 <w:szCs w:val="18"/>
               </w:rPr>
-              <w:t xml:space="preserve">4.6</w:t>
+              <w:t xml:space="preserve">4.5</w:t>
             </w:r>
           </w:p>
         </w:tc>
@@ -9060,7 +9604,7 @@
                 <w:sz w:val="18"/>
                 <w:szCs w:val="18"/>
               </w:rPr>
-              <w:t xml:space="preserve">[O] Pubblica un'osservazione e Non pubblicare un'altra</w:t>
+              <w:t xml:space="preserve">Provate a inviare 4 osservazioni in un'ora con lo stesso indirizzo; un allegato .exe</w:t>
             </w:r>
           </w:p>
         </w:tc>
@@ -9093,7 +9637,7 @@
                 <w:sz w:val="18"/>
                 <w:szCs w:val="18"/>
               </w:rPr>
-              <w:t xml:space="preserve">Lo staff vede nome, email e allegato; il Comune e la pagina pubblica vedono solo quella pubblicata, firmata «Partecipante»</w:t>
+              <w:t xml:space="preserve">La quarta e l'allegato sono rifiutati con un messaggio chiaro</w:t>
             </w:r>
           </w:p>
         </w:tc>
@@ -9130,7 +9674,7 @@
                 <w:sz w:val="18"/>
                 <w:szCs w:val="18"/>
               </w:rPr>
-              <w:t xml:space="preserve">4.7</w:t>
+              <w:t xml:space="preserve">4.6</w:t>
             </w:r>
           </w:p>
         </w:tc>
@@ -9162,7 +9706,7 @@
                 <w:sz w:val="18"/>
                 <w:szCs w:val="18"/>
               </w:rPr>
-              <w:t xml:space="preserve">[O] + Pubblica errata corrige spuntando «Fai ripartire i 30 giorni», prima senza e poi con motivazione</w:t>
+              <w:t xml:space="preserve">[O] Pubblica un'osservazione; su un'altra Non pubblicare scrivendo una motivazione</w:t>
             </w:r>
           </w:p>
         </w:tc>
@@ -9194,7 +9738,7 @@
                 <w:sz w:val="18"/>
                 <w:szCs w:val="18"/>
               </w:rPr>
-              <w:t xml:space="preserve">Senza motivazione: errore; con motivazione: nuova chiusura a 30 giorni, visibile anche sulla pagina pubblica; notifica al Comune</w:t>
+              <w:t xml:space="preserve">Ogni osservazione ha il suo numero («Osservazione n. 1»); lo staff vede nome, email, allegato e la motivazione; il Comune riceve «Nuova osservazione a cui rispondere»; il Comune e la pagina pubblica vedono solo quella pubblicata, firmata «Partecipante»</w:t>
             </w:r>
           </w:p>
         </w:tc>
@@ -9232,7 +9776,7 @@
                 <w:sz w:val="18"/>
                 <w:szCs w:val="18"/>
               </w:rPr>
-              <w:t xml:space="preserve">4.8</w:t>
+              <w:t xml:space="preserve">4.7</w:t>
             </w:r>
           </w:p>
         </w:tc>
@@ -9265,7 +9809,7 @@
                 <w:sz w:val="18"/>
                 <w:szCs w:val="18"/>
               </w:rPr>
-              <w:t xml:space="preserve">[C] Rispondete all'osservazione pubblicata</w:t>
+              <w:t xml:space="preserve">[O] + Pubblica errata corrige spuntando «Fai ripartire i 30 giorni», prima senza e poi con motivazione</w:t>
             </w:r>
           </w:p>
         </w:tc>
@@ -9298,7 +9842,7 @@
                 <w:sz w:val="18"/>
                 <w:szCs w:val="18"/>
               </w:rPr>
-              <w:t xml:space="preserve">Stato Risposto; la risposta compare anche sulla pagina pubblica</w:t>
+              <w:t xml:space="preserve">Senza motivazione: errore; con motivazione: nuova chiusura a 30 giorni, visibile anche sulla pagina pubblica; notifica al Comune</w:t>
             </w:r>
           </w:p>
         </w:tc>
@@ -9335,6 +9879,108 @@
                 <w:sz w:val="18"/>
                 <w:szCs w:val="18"/>
               </w:rPr>
+              <w:t xml:space="preserve">4.8</w:t>
+            </w:r>
+          </w:p>
+        </w:tc>
+        <w:tc>
+          <w:tcPr>
+            <w:tcW w:type="dxa" w:w="4414"/>
+            <w:tcBorders>
+              <w:top w:val="single" w:color="D9D4C5" w:sz="4"/>
+              <w:left w:val="single" w:color="D9D4C5" w:sz="4"/>
+              <w:bottom w:val="single" w:color="D9D4C5" w:sz="4"/>
+              <w:right w:val="single" w:color="D9D4C5" w:sz="4"/>
+            </w:tcBorders>
+            <w:tcMar>
+              <w:top w:type="dxa" w:w="70"/>
+              <w:left w:type="dxa" w:w="110"/>
+              <w:bottom w:type="dxa" w:w="70"/>
+              <w:right w:type="dxa" w:w="110"/>
+            </w:tcMar>
+            <w:vAlign w:val="center"/>
+          </w:tcPr>
+          <w:p>
+            <w:pPr>
+              <w:spacing w:after="0" w:before="0"/>
+            </w:pPr>
+            <w:r>
+              <w:rPr>
+                <w:rFonts w:ascii="Arial" w:cs="Arial" w:eastAsia="Arial" w:hAnsi="Arial"/>
+                <w:color w:val="1B2118"/>
+                <w:sz w:val="18"/>
+                <w:szCs w:val="18"/>
+              </w:rPr>
+              <w:t xml:space="preserve">[C] Rispondete all'osservazione pubblicata</w:t>
+            </w:r>
+          </w:p>
+        </w:tc>
+        <w:tc>
+          <w:tcPr>
+            <w:tcW w:type="dxa" w:w="4415"/>
+            <w:tcBorders>
+              <w:top w:val="single" w:color="D9D4C5" w:sz="4"/>
+              <w:left w:val="single" w:color="D9D4C5" w:sz="4"/>
+              <w:bottom w:val="single" w:color="D9D4C5" w:sz="4"/>
+              <w:right w:val="single" w:color="D9D4C5" w:sz="4"/>
+            </w:tcBorders>
+            <w:tcMar>
+              <w:top w:type="dxa" w:w="70"/>
+              <w:left w:type="dxa" w:w="110"/>
+              <w:bottom w:type="dxa" w:w="70"/>
+              <w:right w:type="dxa" w:w="110"/>
+            </w:tcMar>
+            <w:vAlign w:val="center"/>
+          </w:tcPr>
+          <w:p>
+            <w:pPr>
+              <w:spacing w:after="0" w:before="0"/>
+            </w:pPr>
+            <w:r>
+              <w:rPr>
+                <w:rFonts w:ascii="Arial" w:cs="Arial" w:eastAsia="Arial" w:hAnsi="Arial"/>
+                <w:color w:val="1B2118"/>
+                <w:sz w:val="18"/>
+                <w:szCs w:val="18"/>
+              </w:rPr>
+              <w:t xml:space="preserve">Stato Risposto; la risposta compare anche sulla pagina pubblica</w:t>
+            </w:r>
+          </w:p>
+        </w:tc>
+      </w:tr>
+      <w:tr>
+        <w:trPr>
+          <w:cantSplit/>
+        </w:trPr>
+        <w:tc>
+          <w:tcPr>
+            <w:tcW w:type="dxa" w:w="809"/>
+            <w:tcBorders>
+              <w:top w:val="single" w:color="D9D4C5" w:sz="4"/>
+              <w:left w:val="single" w:color="D9D4C5" w:sz="4"/>
+              <w:bottom w:val="single" w:color="D9D4C5" w:sz="4"/>
+              <w:right w:val="single" w:color="D9D4C5" w:sz="4"/>
+            </w:tcBorders>
+            <w:shd w:fill="F6F4EE" w:color="auto" w:val="clear"/>
+            <w:tcMar>
+              <w:top w:type="dxa" w:w="70"/>
+              <w:left w:type="dxa" w:w="110"/>
+              <w:bottom w:type="dxa" w:w="70"/>
+              <w:right w:type="dxa" w:w="110"/>
+            </w:tcMar>
+            <w:vAlign w:val="center"/>
+          </w:tcPr>
+          <w:p>
+            <w:pPr>
+              <w:spacing w:after="0" w:before="0"/>
+            </w:pPr>
+            <w:r>
+              <w:rPr>
+                <w:rFonts w:ascii="Arial" w:cs="Arial" w:eastAsia="Arial" w:hAnsi="Arial"/>
+                <w:color w:val="1B2118"/>
+                <w:sz w:val="18"/>
+                <w:szCs w:val="18"/>
+              </w:rPr>
               <w:t xml:space="preserve">4.9</w:t>
             </w:r>
           </w:p>
@@ -9348,6 +9994,7 @@
               <w:bottom w:val="single" w:color="D9D4C5" w:sz="4"/>
               <w:right w:val="single" w:color="D9D4C5" w:sz="4"/>
             </w:tcBorders>
+            <w:shd w:fill="F6F4EE" w:color="auto" w:val="clear"/>
             <w:tcMar>
               <w:top w:type="dxa" w:w="70"/>
               <w:left w:type="dxa" w:w="110"/>
@@ -9380,6 +10027,7 @@
               <w:bottom w:val="single" w:color="D9D4C5" w:sz="4"/>
               <w:right w:val="single" w:color="D9D4C5" w:sz="4"/>
             </w:tcBorders>
+            <w:shd w:fill="F6F4EE" w:color="auto" w:val="clear"/>
             <w:tcMar>
               <w:top w:type="dxa" w:w="70"/>
               <w:left w:type="dxa" w:w="110"/>
@@ -9961,7 +10609,7 @@
                 <w:sz w:val="18"/>
                 <w:szCs w:val="18"/>
               </w:rPr>
-              <w:t xml:space="preserve">ZIP con documenti e riepiloghi; pagamenti e audit solo nell'export dello staff</w:t>
+              <w:t xml:space="preserve">ZIP con Riepilogo.pdf, documenti, cartella Validazione (rapporto dell'Ente), Consultazione con osservazioni numerate e allegati, note e messaggi; pagamenti e audit (con i nomi) solo nell'export dello staff</w:t>
             </w:r>
           </w:p>
         </w:tc>
@@ -10419,7 +11067,212 @@
                 <w:sz w:val="18"/>
                 <w:szCs w:val="18"/>
               </w:rPr>
-              <w:t xml:space="preserve">Nasce la pratica CWP-…-RM1 con le sue 7 fasi</w:t>
+              <w:t xml:space="preserve">Nasce la pratica CWP-…-RM1 con 4 fasi (Caricamento del rapporto in corso, Verifica documentale, Validazione e verifica, Chiusura), senza consultazione</w:t>
+            </w:r>
+          </w:p>
+        </w:tc>
+      </w:tr>
+      <w:tr>
+        <w:trPr>
+          <w:cantSplit/>
+        </w:trPr>
+        <w:tc>
+          <w:tcPr>
+            <w:tcW w:type="dxa" w:w="809"/>
+            <w:tcBorders>
+              <w:top w:val="single" w:color="D9D4C5" w:sz="4"/>
+              <w:left w:val="single" w:color="D9D4C5" w:sz="4"/>
+              <w:bottom w:val="single" w:color="D9D4C5" w:sz="4"/>
+              <w:right w:val="single" w:color="D9D4C5" w:sz="4"/>
+            </w:tcBorders>
+            <w:shd w:fill="F6F4EE" w:color="auto" w:val="clear"/>
+            <w:tcMar>
+              <w:top w:type="dxa" w:w="70"/>
+              <w:left w:type="dxa" w:w="110"/>
+              <w:bottom w:type="dxa" w:w="70"/>
+              <w:right w:type="dxa" w:w="110"/>
+            </w:tcMar>
+            <w:vAlign w:val="center"/>
+          </w:tcPr>
+          <w:p>
+            <w:pPr>
+              <w:spacing w:after="0" w:before="0"/>
+            </w:pPr>
+            <w:r>
+              <w:rPr>
+                <w:rFonts w:ascii="Arial" w:cs="Arial" w:eastAsia="Arial" w:hAnsi="Arial"/>
+                <w:color w:val="1B2118"/>
+                <w:sz w:val="18"/>
+                <w:szCs w:val="18"/>
+              </w:rPr>
+              <w:t xml:space="preserve">6.4</w:t>
+            </w:r>
+          </w:p>
+        </w:tc>
+        <w:tc>
+          <w:tcPr>
+            <w:tcW w:type="dxa" w:w="4414"/>
+            <w:tcBorders>
+              <w:top w:val="single" w:color="D9D4C5" w:sz="4"/>
+              <w:left w:val="single" w:color="D9D4C5" w:sz="4"/>
+              <w:bottom w:val="single" w:color="D9D4C5" w:sz="4"/>
+              <w:right w:val="single" w:color="D9D4C5" w:sz="4"/>
+            </w:tcBorders>
+            <w:shd w:fill="F6F4EE" w:color="auto" w:val="clear"/>
+            <w:tcMar>
+              <w:top w:type="dxa" w:w="70"/>
+              <w:left w:type="dxa" w:w="110"/>
+              <w:bottom w:type="dxa" w:w="70"/>
+              <w:right w:type="dxa" w:w="110"/>
+            </w:tcMar>
+            <w:vAlign w:val="center"/>
+          </w:tcPr>
+          <w:p>
+            <w:pPr>
+              <w:spacing w:after="0" w:before="0"/>
+            </w:pPr>
+            <w:r>
+              <w:rPr>
+                <w:rFonts w:ascii="Arial" w:cs="Arial" w:eastAsia="Arial" w:hAnsi="Arial"/>
+                <w:color w:val="1B2118"/>
+                <w:sz w:val="18"/>
+                <w:szCs w:val="18"/>
+              </w:rPr>
+              <w:t xml:space="preserve">[O] Nel Rapporto aprite la fase 2</w:t>
+            </w:r>
+          </w:p>
+        </w:tc>
+        <w:tc>
+          <w:tcPr>
+            <w:tcW w:type="dxa" w:w="4415"/>
+            <w:tcBorders>
+              <w:top w:val="single" w:color="D9D4C5" w:sz="4"/>
+              <w:left w:val="single" w:color="D9D4C5" w:sz="4"/>
+              <w:bottom w:val="single" w:color="D9D4C5" w:sz="4"/>
+              <w:right w:val="single" w:color="D9D4C5" w:sz="4"/>
+            </w:tcBorders>
+            <w:shd w:fill="F6F4EE" w:color="auto" w:val="clear"/>
+            <w:tcMar>
+              <w:top w:type="dxa" w:w="70"/>
+              <w:left w:type="dxa" w:w="110"/>
+              <w:bottom w:type="dxa" w:w="70"/>
+              <w:right w:type="dxa" w:w="110"/>
+            </w:tcMar>
+            <w:vAlign w:val="center"/>
+          </w:tcPr>
+          <w:p>
+            <w:pPr>
+              <w:spacing w:after="0" w:before="0"/>
+            </w:pPr>
+            <w:r>
+              <w:rPr>
+                <w:rFonts w:ascii="Arial" w:cs="Arial" w:eastAsia="Arial" w:hAnsi="Arial"/>
+                <w:color w:val="1B2118"/>
+                <w:sz w:val="18"/>
+                <w:szCs w:val="18"/>
+              </w:rPr>
+              <w:t xml:space="preserve">Scadenza = oggi + 10 giorni (durata del Rapporto in Impostazioni)</w:t>
+            </w:r>
+          </w:p>
+        </w:tc>
+      </w:tr>
+      <w:tr>
+        <w:trPr>
+          <w:cantSplit/>
+        </w:trPr>
+        <w:tc>
+          <w:tcPr>
+            <w:tcW w:type="dxa" w:w="809"/>
+            <w:tcBorders>
+              <w:top w:val="single" w:color="D9D4C5" w:sz="4"/>
+              <w:left w:val="single" w:color="D9D4C5" w:sz="4"/>
+              <w:bottom w:val="single" w:color="D9D4C5" w:sz="4"/>
+              <w:right w:val="single" w:color="D9D4C5" w:sz="4"/>
+            </w:tcBorders>
+            <w:tcMar>
+              <w:top w:type="dxa" w:w="70"/>
+              <w:left w:type="dxa" w:w="110"/>
+              <w:bottom w:type="dxa" w:w="70"/>
+              <w:right w:type="dxa" w:w="110"/>
+            </w:tcMar>
+            <w:vAlign w:val="center"/>
+          </w:tcPr>
+          <w:p>
+            <w:pPr>
+              <w:spacing w:after="0" w:before="0"/>
+            </w:pPr>
+            <w:r>
+              <w:rPr>
+                <w:rFonts w:ascii="Arial" w:cs="Arial" w:eastAsia="Arial" w:hAnsi="Arial"/>
+                <w:color w:val="1B2118"/>
+                <w:sz w:val="18"/>
+                <w:szCs w:val="18"/>
+              </w:rPr>
+              <w:t xml:space="preserve">6.5</w:t>
+            </w:r>
+          </w:p>
+        </w:tc>
+        <w:tc>
+          <w:tcPr>
+            <w:tcW w:type="dxa" w:w="4414"/>
+            <w:tcBorders>
+              <w:top w:val="single" w:color="D9D4C5" w:sz="4"/>
+              <w:left w:val="single" w:color="D9D4C5" w:sz="4"/>
+              <w:bottom w:val="single" w:color="D9D4C5" w:sz="4"/>
+              <w:right w:val="single" w:color="D9D4C5" w:sz="4"/>
+            </w:tcBorders>
+            <w:tcMar>
+              <w:top w:type="dxa" w:w="70"/>
+              <w:left w:type="dxa" w:w="110"/>
+              <w:bottom w:type="dxa" w:w="70"/>
+              <w:right w:type="dxa" w:w="110"/>
+            </w:tcMar>
+            <w:vAlign w:val="center"/>
+          </w:tcPr>
+          <w:p>
+            <w:pPr>
+              <w:spacing w:after="0" w:before="0"/>
+            </w:pPr>
+            <w:r>
+              <w:rPr>
+                <w:rFonts w:ascii="Arial" w:cs="Arial" w:eastAsia="Arial" w:hAnsi="Arial"/>
+                <w:color w:val="1B2118"/>
+                <w:sz w:val="18"/>
+                <w:szCs w:val="18"/>
+              </w:rPr>
+              <w:t xml:space="preserve">[O] Chiudete la pratica (Chiudi pratica, con motivazione)</w:t>
+            </w:r>
+          </w:p>
+        </w:tc>
+        <w:tc>
+          <w:tcPr>
+            <w:tcW w:type="dxa" w:w="4415"/>
+            <w:tcBorders>
+              <w:top w:val="single" w:color="D9D4C5" w:sz="4"/>
+              <w:left w:val="single" w:color="D9D4C5" w:sz="4"/>
+              <w:bottom w:val="single" w:color="D9D4C5" w:sz="4"/>
+              <w:right w:val="single" w:color="D9D4C5" w:sz="4"/>
+            </w:tcBorders>
+            <w:tcMar>
+              <w:top w:type="dxa" w:w="70"/>
+              <w:left w:type="dxa" w:w="110"/>
+              <w:bottom w:type="dxa" w:w="70"/>
+              <w:right w:type="dxa" w:w="110"/>
+            </w:tcMar>
+            <w:vAlign w:val="center"/>
+          </w:tcPr>
+          <w:p>
+            <w:pPr>
+              <w:spacing w:after="0" w:before="0"/>
+            </w:pPr>
+            <w:r>
+              <w:rPr>
+                <w:rFonts w:ascii="Arial" w:cs="Arial" w:eastAsia="Arial" w:hAnsi="Arial"/>
+                <w:color w:val="1B2118"/>
+                <w:sz w:val="18"/>
+                <w:szCs w:val="18"/>
+              </w:rPr>
+              <w:t xml:space="preserve">Stato Chiusa; nell'intestazione «Da conservare fino al» con la data tra 10 anni; riattivando la data sparisce</w:t>
             </w:r>
           </w:p>
         </w:tc>
@@ -13705,7 +14558,7 @@
         <w:szCs w:val="16"/>
       </w:rPr>
       <w:tab/>
-      <w:t xml:space="preserve">Manuale Test · Rev. 1.4 · 18/10/2026</w:t>
+      <w:t xml:space="preserve">Manuale Test · Rev. 1.5 · 18/10/2026</w:t>
     </w:r>
   </w:p>
 </w:hdr>
@@ -13770,7 +14623,7 @@
         <w:szCs w:val="16"/>
       </w:rPr>
       <w:tab/>
-      <w:t xml:space="preserve">Manuale Test · Rev. 1.4 · 18/10/2026</w:t>
+      <w:t xml:space="preserve">Manuale Test · Rev. 1.5 · 18/10/2026</w:t>
     </w:r>
   </w:p>
 </w:hdr>

</xml_diff>

<commit_message>
Utenti: eliminazione degli utenti mai attivi (script 30), pulsante «+ Nuovo utente» sulla riga del titolo, azioni a capo sul telefono; manuali e registro
Co-Authored-By: Claude Opus 5.5 <noreply@anthropic.com>
Claude-Session: https://claude.ai/code/session_01E8XCbEeVHWVP3hntUZ6kZ1
</commit_message>
<xml_diff>
--- a/public/documentazione/Manuale_Test_Portale_CWP.docx
+++ b/public/documentazione/Manuale_Test_Portale_CWP.docx
@@ -302,7 +302,7 @@
                 <w:sz w:val="20"/>
                 <w:szCs w:val="20"/>
               </w:rPr>
-              <w:t xml:space="preserve">Rev. 2.6</w:t>
+              <w:t xml:space="preserve">Rev. 2.7</w:t>
             </w:r>
           </w:p>
         </w:tc>
@@ -719,7 +719,7 @@
                 <w:sz w:val="18"/>
                 <w:szCs w:val="18"/>
               </w:rPr>
-              <w:t xml:space="preserve">2.6</w:t>
+              <w:t xml:space="preserve">2.7</w:t>
             </w:r>
           </w:p>
         </w:tc>
@@ -783,7 +783,7 @@
                 <w:sz w:val="18"/>
                 <w:szCs w:val="18"/>
               </w:rPr>
-              <w:t xml:space="preserve">Prove 1.3 e 1.3c: email con le credenziali.</w:t>
+              <w:t xml:space="preserve">Prova 1.3d: eliminazione di un utente mai attivo.</w:t>
             </w:r>
           </w:p>
         </w:tc>
@@ -853,7 +853,7 @@
                 <w:sz w:val="18"/>
                 <w:szCs w:val="18"/>
               </w:rPr>
-              <w:t xml:space="preserve">2.5</w:t>
+              <w:t xml:space="preserve">2.6</w:t>
             </w:r>
           </w:p>
         </w:tc>
@@ -919,7 +919,7 @@
                 <w:sz w:val="18"/>
                 <w:szCs w:val="18"/>
               </w:rPr>
-              <w:t xml:space="preserve">Prove 1.3a-1.3a3: nomina di un Amministratore e protezione del principale.</w:t>
+              <w:t xml:space="preserve">Prove 1.3 e 1.3c: email con le credenziali.</w:t>
             </w:r>
           </w:p>
         </w:tc>
@@ -989,7 +989,7 @@
                 <w:sz w:val="18"/>
                 <w:szCs w:val="18"/>
               </w:rPr>
-              <w:t xml:space="preserve">2.4</w:t>
+              <w:t xml:space="preserve">2.5</w:t>
             </w:r>
           </w:p>
         </w:tc>
@@ -1053,7 +1053,7 @@
                 <w:sz w:val="18"/>
                 <w:szCs w:val="18"/>
               </w:rPr>
-              <w:t xml:space="preserve">Prove 8b.7c e 8b.7d: costi Caso 1 e Caso 2.</w:t>
+              <w:t xml:space="preserve">Prove 1.3a-1.3a3: nomina di un Amministratore e protezione del principale.</w:t>
             </w:r>
           </w:p>
         </w:tc>
@@ -1123,7 +1123,7 @@
                 <w:sz w:val="18"/>
                 <w:szCs w:val="18"/>
               </w:rPr>
-              <w:t xml:space="preserve">2.3</w:t>
+              <w:t xml:space="preserve">2.4</w:t>
             </w:r>
           </w:p>
         </w:tc>
@@ -1189,7 +1189,7 @@
                 <w:sz w:val="18"/>
                 <w:szCs w:val="18"/>
               </w:rPr>
-              <w:t xml:space="preserve">Prova 8b.7b aggiornata: valore del credito anno per anno.</w:t>
+              <w:t xml:space="preserve">Prove 8b.7c e 8b.7d: costi Caso 1 e Caso 2.</w:t>
             </w:r>
           </w:p>
         </w:tc>
@@ -1259,7 +1259,7 @@
                 <w:sz w:val="18"/>
                 <w:szCs w:val="18"/>
               </w:rPr>
-              <w:t xml:space="preserve">2.2</w:t>
+              <w:t xml:space="preserve">2.3</w:t>
             </w:r>
           </w:p>
         </w:tc>
@@ -1323,7 +1323,7 @@
                 <w:sz w:val="18"/>
                 <w:szCs w:val="18"/>
               </w:rPr>
-              <w:t xml:space="preserve">Prova 8b.7b della simulazione economica (ricavi e costi per il Comune).</w:t>
+              <w:t xml:space="preserve">Prova 8b.7b aggiornata: valore del credito anno per anno.</w:t>
             </w:r>
           </w:p>
         </w:tc>
@@ -1393,7 +1393,7 @@
                 <w:sz w:val="18"/>
                 <w:szCs w:val="18"/>
               </w:rPr>
-              <w:t xml:space="preserve">2.1</w:t>
+              <w:t xml:space="preserve">2.2</w:t>
             </w:r>
           </w:p>
         </w:tc>
@@ -1459,7 +1459,7 @@
                 <w:sz w:val="18"/>
                 <w:szCs w:val="18"/>
               </w:rPr>
-              <w:t xml:space="preserve">Prove 8b.2b e 8b.2c (scenario di riferimento e situazione attuale).</w:t>
+              <w:t xml:space="preserve">Prova 8b.7b della simulazione economica (ricavi e costi per il Comune).</w:t>
             </w:r>
           </w:p>
         </w:tc>
@@ -1529,7 +1529,7 @@
                 <w:sz w:val="18"/>
                 <w:szCs w:val="18"/>
               </w:rPr>
-              <w:t xml:space="preserve">2.0</w:t>
+              <w:t xml:space="preserve">2.1</w:t>
             </w:r>
           </w:p>
         </w:tc>
@@ -1593,7 +1593,7 @@
                 <w:sz w:val="18"/>
                 <w:szCs w:val="18"/>
               </w:rPr>
-              <w:t xml:space="preserve">Prove 8b del simulatore di scenari.</w:t>
+              <w:t xml:space="preserve">Prove 8b.2b e 8b.2c (scenario di riferimento e situazione attuale).</w:t>
             </w:r>
           </w:p>
         </w:tc>
@@ -1663,7 +1663,7 @@
                 <w:sz w:val="18"/>
                 <w:szCs w:val="18"/>
               </w:rPr>
-              <w:t xml:space="preserve">1.9</w:t>
+              <w:t xml:space="preserve">2.0</w:t>
             </w:r>
           </w:p>
         </w:tc>
@@ -1729,7 +1729,7 @@
                 <w:sz w:val="18"/>
                 <w:szCs w:val="18"/>
               </w:rPr>
-              <w:t xml:space="preserve">In sviluppo: simulatore di scenari e assistente virtuale.</w:t>
+              <w:t xml:space="preserve">Prove 8b del simulatore di scenari.</w:t>
             </w:r>
           </w:p>
         </w:tc>
@@ -1799,7 +1799,7 @@
                 <w:sz w:val="18"/>
                 <w:szCs w:val="18"/>
               </w:rPr>
-              <w:t xml:space="preserve">1.8</w:t>
+              <w:t xml:space="preserve">1.9</w:t>
             </w:r>
           </w:p>
         </w:tc>
@@ -1863,7 +1863,7 @@
                 <w:sz w:val="18"/>
                 <w:szCs w:val="18"/>
               </w:rPr>
-              <w:t xml:space="preserve">Tolto il limite noto sull'incarico del soggetto promotore del programma.</w:t>
+              <w:t xml:space="preserve">In sviluppo: simulatore di scenari e assistente virtuale.</w:t>
             </w:r>
           </w:p>
         </w:tc>
@@ -1933,7 +1933,7 @@
                 <w:sz w:val="18"/>
                 <w:szCs w:val="18"/>
               </w:rPr>
-              <w:t xml:space="preserve">1.7</w:t>
+              <w:t xml:space="preserve">1.8</w:t>
             </w:r>
           </w:p>
         </w:tc>
@@ -1966,7 +1966,7 @@
                 <w:sz w:val="18"/>
                 <w:szCs w:val="18"/>
               </w:rPr>
-              <w:t xml:space="preserve">18/10/2026</w:t>
+              <w:t xml:space="preserve">19/10/2026</w:t>
             </w:r>
           </w:p>
         </w:tc>
@@ -1999,7 +1999,7 @@
                 <w:sz w:val="18"/>
                 <w:szCs w:val="18"/>
               </w:rPr>
-              <w:t xml:space="preserve">Percorso di prova esteso alle funzioni dell'allineamento ai documenti CWP: territorio ISTAT, stati del Programma, Rapporto a 7 fasi, tariffe e sospensione, accuratezza, ritiro, account unico, crediti emessi, reclami, pagina pubblica, qualità dei dati.</w:t>
+              <w:t xml:space="preserve">Tolto il limite noto sull'incarico del soggetto promotore del programma.</w:t>
             </w:r>
           </w:p>
         </w:tc>
@@ -2069,7 +2069,7 @@
                 <w:sz w:val="18"/>
                 <w:szCs w:val="18"/>
               </w:rPr>
-              <w:t xml:space="preserve">1.6</w:t>
+              <w:t xml:space="preserve">1.7</w:t>
             </w:r>
           </w:p>
         </w:tc>
@@ -2133,7 +2133,7 @@
                 <w:sz w:val="18"/>
                 <w:szCs w:val="18"/>
               </w:rPr>
-              <w:t xml:space="preserve">Glossario: descrizione corretta del buffer (al massimo 80%).</w:t>
+              <w:t xml:space="preserve">Percorso di prova esteso alle funzioni dell'allineamento ai documenti CWP: territorio ISTAT, stati del Programma, Rapporto a 7 fasi, tariffe e sospensione, accuratezza, ritiro, account unico, crediti emessi, reclami, pagina pubblica, qualità dei dati.</w:t>
             </w:r>
           </w:p>
         </w:tc>
@@ -2203,7 +2203,7 @@
                 <w:sz w:val="18"/>
                 <w:szCs w:val="18"/>
               </w:rPr>
-              <w:t xml:space="preserve">1.5</w:t>
+              <w:t xml:space="preserve">1.6</w:t>
             </w:r>
           </w:p>
         </w:tc>
@@ -2269,7 +2269,7 @@
                 <w:sz w:val="18"/>
                 <w:szCs w:val="18"/>
               </w:rPr>
-              <w:t xml:space="preserve">Nuove prove 1.2b, 1.8, 3.7, 4.1b, 6.4, 6.5; prove 1.6, 1.7, 3.2, 4.1, 4.6, 5.4 e 6.3 aggiornate (anagrafiche, documenti richiesti, consultazione, Rapporti a 4 fasi, conservazione, fascicolo).</w:t>
+              <w:t xml:space="preserve">Glossario: descrizione corretta del buffer (al massimo 80%).</w:t>
             </w:r>
           </w:p>
         </w:tc>
@@ -2339,7 +2339,7 @@
                 <w:sz w:val="18"/>
                 <w:szCs w:val="18"/>
               </w:rPr>
-              <w:t xml:space="preserve">1.4</w:t>
+              <w:t xml:space="preserve">1.5</w:t>
             </w:r>
           </w:p>
         </w:tc>
@@ -2403,7 +2403,7 @@
                 <w:sz w:val="18"/>
                 <w:szCs w:val="18"/>
               </w:rPr>
-              <w:t xml:space="preserve">Nuova prova 7.12 (risultato azzerato dopo una modifica dei dati); prove successive del blocco 7 rinumerate; prova 8.4 estesa.</w:t>
+              <w:t xml:space="preserve">Nuove prove 1.2b, 1.8, 3.7, 4.1b, 6.4, 6.5; prove 1.6, 1.7, 3.2, 4.1, 4.6, 5.4 e 6.3 aggiornate (anagrafiche, documenti richiesti, consultazione, Rapporti a 4 fasi, conservazione, fascicolo).</w:t>
             </w:r>
           </w:p>
         </w:tc>
@@ -2473,7 +2473,7 @@
                 <w:sz w:val="18"/>
                 <w:szCs w:val="18"/>
               </w:rPr>
-              <w:t xml:space="preserve">1.3</w:t>
+              <w:t xml:space="preserve">1.4</w:t>
             </w:r>
           </w:p>
         </w:tc>
@@ -2539,7 +2539,7 @@
                 <w:sz w:val="18"/>
                 <w:szCs w:val="18"/>
               </w:rPr>
-              <w:t xml:space="preserve">Prove del rapporto PDF, del numero di registro e del registro dei crediti con le nuove versioni.</w:t>
+              <w:t xml:space="preserve">Nuova prova 7.12 (risultato azzerato dopo una modifica dei dati); prove successive del blocco 7 rinumerate; prova 8.4 estesa.</w:t>
             </w:r>
           </w:p>
         </w:tc>
@@ -2609,7 +2609,7 @@
                 <w:sz w:val="18"/>
                 <w:szCs w:val="18"/>
               </w:rPr>
-              <w:t xml:space="preserve">1.2</w:t>
+              <w:t xml:space="preserve">1.3</w:t>
             </w:r>
           </w:p>
         </w:tc>
@@ -2673,7 +2673,7 @@
                 <w:sz w:val="18"/>
                 <w:szCs w:val="18"/>
               </w:rPr>
-              <w:t xml:space="preserve">Calcolo crediti: prove di import del tracciato con i file di esempio (compilato, letture, dati personali) e dei controlli di coerenza.</w:t>
+              <w:t xml:space="preserve">Prove del rapporto PDF, del numero di registro e del registro dei crediti con le nuove versioni.</w:t>
             </w:r>
           </w:p>
         </w:tc>
@@ -2743,7 +2743,7 @@
                 <w:sz w:val="18"/>
                 <w:szCs w:val="18"/>
               </w:rPr>
-              <w:t xml:space="preserve">1.1</w:t>
+              <w:t xml:space="preserve">1.2</w:t>
             </w:r>
           </w:p>
         </w:tc>
@@ -2809,7 +2809,7 @@
                 <w:sz w:val="18"/>
                 <w:szCs w:val="18"/>
               </w:rPr>
-              <w:t xml:space="preserve">Prove per Enti di Validazione, modelli, note di fase, messaggi, pagamenti visibili al Comune, pratica sospesa, consultazione pubblica con conferma dell'email, limiti di invio ed errata corrige.</w:t>
+              <w:t xml:space="preserve">Calcolo crediti: prove di import del tracciato con i file di esempio (compilato, letture, dati personali) e dei controlli di coerenza.</w:t>
             </w:r>
           </w:p>
         </w:tc>
@@ -2879,6 +2879,140 @@
                 <w:sz w:val="18"/>
                 <w:szCs w:val="18"/>
               </w:rPr>
+              <w:t xml:space="preserve">1.1</w:t>
+            </w:r>
+          </w:p>
+        </w:tc>
+        <w:tc>
+          <w:tcPr>
+            <w:tcW w:type="dxa" w:w="1300"/>
+            <w:tcBorders>
+              <w:top w:val="single" w:color="D9D4C5" w:sz="4"/>
+              <w:left w:val="single" w:color="D9D4C5" w:sz="4"/>
+              <w:bottom w:val="single" w:color="D9D4C5" w:sz="4"/>
+              <w:right w:val="single" w:color="D9D4C5" w:sz="4"/>
+            </w:tcBorders>
+            <w:tcMar>
+              <w:top w:type="dxa" w:w="70"/>
+              <w:left w:type="dxa" w:w="110"/>
+              <w:bottom w:type="dxa" w:w="70"/>
+              <w:right w:type="dxa" w:w="110"/>
+            </w:tcMar>
+            <w:vAlign w:val="center"/>
+          </w:tcPr>
+          <w:p>
+            <w:pPr>
+              <w:spacing w:after="0" w:before="0"/>
+            </w:pPr>
+            <w:r>
+              <w:rPr>
+                <w:rFonts w:ascii="Arial" w:cs="Arial" w:eastAsia="Arial" w:hAnsi="Arial"/>
+                <w:color w:val="1B2118"/>
+                <w:sz w:val="18"/>
+                <w:szCs w:val="18"/>
+              </w:rPr>
+              <w:t xml:space="preserve">18/10/2026</w:t>
+            </w:r>
+          </w:p>
+        </w:tc>
+        <w:tc>
+          <w:tcPr>
+            <w:tcW w:type="dxa" w:w="5538"/>
+            <w:tcBorders>
+              <w:top w:val="single" w:color="D9D4C5" w:sz="4"/>
+              <w:left w:val="single" w:color="D9D4C5" w:sz="4"/>
+              <w:bottom w:val="single" w:color="D9D4C5" w:sz="4"/>
+              <w:right w:val="single" w:color="D9D4C5" w:sz="4"/>
+            </w:tcBorders>
+            <w:tcMar>
+              <w:top w:type="dxa" w:w="70"/>
+              <w:left w:type="dxa" w:w="110"/>
+              <w:bottom w:type="dxa" w:w="70"/>
+              <w:right w:type="dxa" w:w="110"/>
+            </w:tcMar>
+            <w:vAlign w:val="center"/>
+          </w:tcPr>
+          <w:p>
+            <w:pPr>
+              <w:spacing w:after="0" w:before="0"/>
+            </w:pPr>
+            <w:r>
+              <w:rPr>
+                <w:rFonts w:ascii="Arial" w:cs="Arial" w:eastAsia="Arial" w:hAnsi="Arial"/>
+                <w:color w:val="1B2118"/>
+                <w:sz w:val="18"/>
+                <w:szCs w:val="18"/>
+              </w:rPr>
+              <w:t xml:space="preserve">Prove per Enti di Validazione, modelli, note di fase, messaggi, pagamenti visibili al Comune, pratica sospesa, consultazione pubblica con conferma dell'email, limiti di invio ed errata corrige.</w:t>
+            </w:r>
+          </w:p>
+        </w:tc>
+        <w:tc>
+          <w:tcPr>
+            <w:tcW w:type="dxa" w:w="2000"/>
+            <w:tcBorders>
+              <w:top w:val="single" w:color="D9D4C5" w:sz="4"/>
+              <w:left w:val="single" w:color="D9D4C5" w:sz="4"/>
+              <w:bottom w:val="single" w:color="D9D4C5" w:sz="4"/>
+              <w:right w:val="single" w:color="D9D4C5" w:sz="4"/>
+            </w:tcBorders>
+            <w:tcMar>
+              <w:top w:type="dxa" w:w="70"/>
+              <w:left w:type="dxa" w:w="110"/>
+              <w:bottom w:type="dxa" w:w="70"/>
+              <w:right w:type="dxa" w:w="110"/>
+            </w:tcMar>
+            <w:vAlign w:val="center"/>
+          </w:tcPr>
+          <w:p>
+            <w:pPr>
+              <w:spacing w:after="0" w:before="0"/>
+            </w:pPr>
+            <w:r>
+              <w:rPr>
+                <w:rFonts w:ascii="Arial" w:cs="Arial" w:eastAsia="Arial" w:hAnsi="Arial"/>
+                <w:color w:val="1B2118"/>
+                <w:sz w:val="18"/>
+                <w:szCs w:val="18"/>
+              </w:rPr>
+              <w:t xml:space="preserve">Fondazione Operate</w:t>
+            </w:r>
+          </w:p>
+        </w:tc>
+      </w:tr>
+      <w:tr>
+        <w:trPr>
+          <w:cantSplit/>
+        </w:trPr>
+        <w:tc>
+          <w:tcPr>
+            <w:tcW w:type="dxa" w:w="800"/>
+            <w:tcBorders>
+              <w:top w:val="single" w:color="D9D4C5" w:sz="4"/>
+              <w:left w:val="single" w:color="D9D4C5" w:sz="4"/>
+              <w:bottom w:val="single" w:color="D9D4C5" w:sz="4"/>
+              <w:right w:val="single" w:color="D9D4C5" w:sz="4"/>
+            </w:tcBorders>
+            <w:shd w:fill="F6F4EE" w:color="auto" w:val="clear"/>
+            <w:tcMar>
+              <w:top w:type="dxa" w:w="70"/>
+              <w:left w:type="dxa" w:w="110"/>
+              <w:bottom w:type="dxa" w:w="70"/>
+              <w:right w:type="dxa" w:w="110"/>
+            </w:tcMar>
+            <w:vAlign w:val="center"/>
+          </w:tcPr>
+          <w:p>
+            <w:pPr>
+              <w:spacing w:after="0" w:before="0"/>
+            </w:pPr>
+            <w:r>
+              <w:rPr>
+                <w:rFonts w:ascii="Arial" w:cs="Arial" w:eastAsia="Arial" w:hAnsi="Arial"/>
+                <w:color w:val="1B2118"/>
+                <w:sz w:val="18"/>
+                <w:szCs w:val="18"/>
+              </w:rPr>
               <w:t xml:space="preserve">1.0</w:t>
             </w:r>
           </w:p>
@@ -2892,6 +3026,7 @@
               <w:bottom w:val="single" w:color="D9D4C5" w:sz="4"/>
               <w:right w:val="single" w:color="D9D4C5" w:sz="4"/>
             </w:tcBorders>
+            <w:shd w:fill="F6F4EE" w:color="auto" w:val="clear"/>
             <w:tcMar>
               <w:top w:type="dxa" w:w="70"/>
               <w:left w:type="dxa" w:w="110"/>
@@ -2924,6 +3059,7 @@
               <w:bottom w:val="single" w:color="D9D4C5" w:sz="4"/>
               <w:right w:val="single" w:color="D9D4C5" w:sz="4"/>
             </w:tcBorders>
+            <w:shd w:fill="F6F4EE" w:color="auto" w:val="clear"/>
             <w:tcMar>
               <w:top w:type="dxa" w:w="70"/>
               <w:left w:type="dxa" w:w="110"/>
@@ -2956,6 +3092,7 @@
               <w:bottom w:val="single" w:color="D9D4C5" w:sz="4"/>
               <w:right w:val="single" w:color="D9D4C5" w:sz="4"/>
             </w:tcBorders>
+            <w:shd w:fill="F6F4EE" w:color="auto" w:val="clear"/>
             <w:tcMar>
               <w:top w:type="dxa" w:w="70"/>
               <w:left w:type="dxa" w:w="110"/>
@@ -2997,7 +3134,7 @@
           <w:sz w:val="20"/>
           <w:szCs w:val="20"/>
         </w:rPr>
-        <w:t xml:space="preserve">Guida alla revisione 2.6 del 19/10/2026, allineata al portale e agli altri manuali. È aggiornata a ogni rilascio; la versione corrente si scarica dall'area Documentazione del portale (solo Amministratori).</w:t>
+        <w:t xml:space="preserve">Guida alla revisione 2.7 del 19/10/2026, allineata al portale e agli altri manuali. È aggiornata a ogni rilascio; la versione corrente si scarica dall'area Documentazione del portale (solo Amministratori).</w:t>
       </w:r>
     </w:p>
     <w:p>
@@ -3371,7 +3508,7 @@
         </w:rPr>
         <w:t xml:space="preserve">Il portale: </w:t>
       </w:r>
-      <w:hyperlink w:history="1" r:id="rIdegbhjafmtrsvn_7yzg8m_">
+      <w:hyperlink w:history="1" r:id="rIdi0oqvdt6qhc08xvlixtmu">
         <w:r>
           <w:rPr>
             <w:rFonts w:ascii="Arial" w:cs="Arial" w:eastAsia="Arial" w:hAnsi="Arial"/>
@@ -9373,7 +9510,7 @@
                 <w:sz w:val="18"/>
                 <w:szCs w:val="18"/>
               </w:rPr>
-              <w:t xml:space="preserve">1.3c</w:t>
+              <w:t xml:space="preserve">1.3d</w:t>
             </w:r>
           </w:p>
         </w:tc>
@@ -9405,7 +9542,27 @@
                 <w:sz w:val="18"/>
                 <w:szCs w:val="18"/>
               </w:rPr>
-              <w:t xml:space="preserve">[C] Aprite l'email «Il tuo accesso al Portale CWP» (se arrivata) e premete Accedi al portale</w:t>
+              <w:t xml:space="preserve">[A] Create un utente con un'email di prova, poi premete </w:t>
+            </w:r>
+            <w:r>
+              <w:rPr>
+                <w:rFonts w:ascii="Arial" w:cs="Arial" w:eastAsia="Arial" w:hAnsi="Arial"/>
+                <w:b/>
+                <w:bCs/>
+                <w:color w:val="1B2118"/>
+                <w:sz w:val="18"/>
+                <w:szCs w:val="18"/>
+              </w:rPr>
+              <w:t xml:space="preserve">Elimina</w:t>
+            </w:r>
+            <w:r>
+              <w:rPr>
+                <w:rFonts w:ascii="Arial" w:cs="Arial" w:eastAsia="Arial" w:hAnsi="Arial"/>
+                <w:color w:val="1B2118"/>
+                <w:sz w:val="18"/>
+                <w:szCs w:val="18"/>
+              </w:rPr>
+              <w:t xml:space="preserve"> nella sua riga → Elimina definitivamente</w:t>
             </w:r>
           </w:p>
         </w:tc>
@@ -9437,7 +9594,7 @@
                 <w:sz w:val="18"/>
                 <w:szCs w:val="18"/>
               </w:rPr>
-              <w:t xml:space="preserve">Si apre la pagina di accesso; con email e password temporanea dell'email il portale chiede subito la password personale</w:t>
+              <w:t xml:space="preserve">L'utente sparisce dall'elenco; in Audit la voce «cancellazione profilo». Sul referente del Comune, che ha già operato, il pulsante Elimina non compare</w:t>
             </w:r>
           </w:p>
         </w:tc>
@@ -9475,7 +9632,7 @@
                 <w:sz w:val="18"/>
                 <w:szCs w:val="18"/>
               </w:rPr>
-              <w:t xml:space="preserve">1.3a</w:t>
+              <w:t xml:space="preserve">1.3c</w:t>
             </w:r>
           </w:p>
         </w:tc>
@@ -9508,27 +9665,7 @@
                 <w:sz w:val="18"/>
                 <w:szCs w:val="18"/>
               </w:rPr>
-              <w:t xml:space="preserve">[A] Utenti → + Nuovo utente, ruolo </w:t>
-            </w:r>
-            <w:r>
-              <w:rPr>
-                <w:rFonts w:ascii="Arial" w:cs="Arial" w:eastAsia="Arial" w:hAnsi="Arial"/>
-                <w:b/>
-                <w:bCs/>
-                <w:color w:val="1B2118"/>
-                <w:sz w:val="18"/>
-                <w:szCs w:val="18"/>
-              </w:rPr>
-              <w:t xml:space="preserve">Amministratore</w:t>
-            </w:r>
-            <w:r>
-              <w:rPr>
-                <w:rFonts w:ascii="Arial" w:cs="Arial" w:eastAsia="Arial" w:hAnsi="Arial"/>
-                <w:color w:val="1B2118"/>
-                <w:sz w:val="18"/>
-                <w:szCs w:val="18"/>
-              </w:rPr>
-              <w:t xml:space="preserve"> (compare il promemoria sull'accesso completo) → Crea; poi entrate con il nuovo account</w:t>
+              <w:t xml:space="preserve">[C] Aprite l'email «Il tuo accesso al Portale CWP» (se arrivata) e premete Accedi al portale</w:t>
             </w:r>
           </w:p>
         </w:tc>
@@ -9561,7 +9698,7 @@
                 <w:sz w:val="18"/>
                 <w:szCs w:val="18"/>
               </w:rPr>
-              <w:t xml:space="preserve">Il nuovo utente ha il segno Admin e vede tutto il menu dell'Amministratore</w:t>
+              <w:t xml:space="preserve">Si apre la pagina di accesso; con email e password temporanea dell'email il portale chiede subito la password personale</w:t>
             </w:r>
           </w:p>
         </w:tc>
@@ -9598,7 +9735,7 @@
                 <w:sz w:val="18"/>
                 <w:szCs w:val="18"/>
               </w:rPr>
-              <w:t xml:space="preserve">1.3a2</w:t>
+              <w:t xml:space="preserve">1.3a</w:t>
             </w:r>
           </w:p>
         </w:tc>
@@ -9630,7 +9767,27 @@
                 <w:sz w:val="18"/>
                 <w:szCs w:val="18"/>
               </w:rPr>
-              <w:t xml:space="preserve">[A] Nella riga di luca.moretti@operate.it</w:t>
+              <w:t xml:space="preserve">[A] Utenti → + Nuovo utente, ruolo </w:t>
+            </w:r>
+            <w:r>
+              <w:rPr>
+                <w:rFonts w:ascii="Arial" w:cs="Arial" w:eastAsia="Arial" w:hAnsi="Arial"/>
+                <w:b/>
+                <w:bCs/>
+                <w:color w:val="1B2118"/>
+                <w:sz w:val="18"/>
+                <w:szCs w:val="18"/>
+              </w:rPr>
+              <w:t xml:space="preserve">Amministratore</w:t>
+            </w:r>
+            <w:r>
+              <w:rPr>
+                <w:rFonts w:ascii="Arial" w:cs="Arial" w:eastAsia="Arial" w:hAnsi="Arial"/>
+                <w:color w:val="1B2118"/>
+                <w:sz w:val="18"/>
+                <w:szCs w:val="18"/>
+              </w:rPr>
+              <w:t xml:space="preserve"> (compare il promemoria sull'accesso completo) → Crea; poi entrate con il nuovo account</w:t>
             </w:r>
           </w:p>
         </w:tc>
@@ -9662,7 +9819,7 @@
                 <w:sz w:val="18"/>
                 <w:szCs w:val="18"/>
               </w:rPr>
-              <w:t xml:space="preserve">Segno «Principale», nessun pulsante Modifica, Reimposta password o Disattiva</w:t>
+              <w:t xml:space="preserve">Il nuovo utente ha il segno Admin e vede tutto il menu dell'Amministratore</w:t>
             </w:r>
           </w:p>
         </w:tc>
@@ -9700,7 +9857,7 @@
                 <w:sz w:val="18"/>
                 <w:szCs w:val="18"/>
               </w:rPr>
-              <w:t xml:space="preserve">1.3a3</w:t>
+              <w:t xml:space="preserve">1.3a2</w:t>
             </w:r>
           </w:p>
         </w:tc>
@@ -9733,7 +9890,7 @@
                 <w:sz w:val="18"/>
                 <w:szCs w:val="18"/>
               </w:rPr>
-              <w:t xml:space="preserve">[A] Con Modifica riportate il nuovo Amministratore a Operatore, poi Disattiva e Riattiva</w:t>
+              <w:t xml:space="preserve">[A] Nella riga di luca.moretti@operate.it</w:t>
             </w:r>
           </w:p>
         </w:tc>
@@ -9766,7 +9923,7 @@
                 <w:sz w:val="18"/>
                 <w:szCs w:val="18"/>
               </w:rPr>
-              <w:t xml:space="preserve">Ruolo cambiato; disattivazione e riattivazione riuscite; voci nell'audit</w:t>
+              <w:t xml:space="preserve">Segno «Principale», nessun pulsante Modifica, Reimposta password o Disattiva</w:t>
             </w:r>
           </w:p>
         </w:tc>
@@ -9803,7 +9960,7 @@
                 <w:sz w:val="18"/>
                 <w:szCs w:val="18"/>
               </w:rPr>
-              <w:t xml:space="preserve">1.3b</w:t>
+              <w:t xml:space="preserve">1.3a3</w:t>
             </w:r>
           </w:p>
         </w:tc>
@@ -9835,27 +9992,7 @@
                 <w:sz w:val="18"/>
                 <w:szCs w:val="18"/>
               </w:rPr>
-              <w:t xml:space="preserve">[A] Create un </w:t>
-            </w:r>
-            <w:r>
-              <w:rPr>
-                <w:rFonts w:ascii="Arial" w:cs="Arial" w:eastAsia="Arial" w:hAnsi="Arial"/>
-                <w:b/>
-                <w:bCs/>
-                <w:color w:val="1B2118"/>
-                <w:sz w:val="18"/>
-                <w:szCs w:val="18"/>
-              </w:rPr>
-              <w:t xml:space="preserve">secondo</w:t>
-            </w:r>
-            <w:r>
-              <w:rPr>
-                <w:rFonts w:ascii="Arial" w:cs="Arial" w:eastAsia="Arial" w:hAnsi="Arial"/>
-                <w:color w:val="1B2118"/>
-                <w:sz w:val="18"/>
-                <w:szCs w:val="18"/>
-              </w:rPr>
-              <w:t xml:space="preserve"> utente Cliente associato a «Comune di Prova»</w:t>
+              <w:t xml:space="preserve">[A] Con Modifica riportate il nuovo Amministratore a Operatore, poi Disattiva e Riattiva</w:t>
             </w:r>
           </w:p>
         </w:tc>
@@ -9887,7 +10024,7 @@
                 <w:sz w:val="18"/>
                 <w:szCs w:val="18"/>
               </w:rPr>
-              <w:t xml:space="preserve">Rifiutato: «L'Organizzazione «Comune di Prova» ha già un account attivo… Disattiva quello attuale prima di attivarne un altro»</w:t>
+              <w:t xml:space="preserve">Ruolo cambiato; disattivazione e riattivazione riuscite; voci nell'audit</w:t>
             </w:r>
           </w:p>
         </w:tc>
@@ -9925,7 +10062,7 @@
                 <w:sz w:val="18"/>
                 <w:szCs w:val="18"/>
               </w:rPr>
-              <w:t xml:space="preserve">1.4</w:t>
+              <w:t xml:space="preserve">1.3b</w:t>
             </w:r>
           </w:p>
         </w:tc>
@@ -9958,7 +10095,27 @@
                 <w:sz w:val="18"/>
                 <w:szCs w:val="18"/>
               </w:rPr>
-              <w:t xml:space="preserve">[C] Accedete con la password temporanea</w:t>
+              <w:t xml:space="preserve">[A] Create un </w:t>
+            </w:r>
+            <w:r>
+              <w:rPr>
+                <w:rFonts w:ascii="Arial" w:cs="Arial" w:eastAsia="Arial" w:hAnsi="Arial"/>
+                <w:b/>
+                <w:bCs/>
+                <w:color w:val="1B2118"/>
+                <w:sz w:val="18"/>
+                <w:szCs w:val="18"/>
+              </w:rPr>
+              <w:t xml:space="preserve">secondo</w:t>
+            </w:r>
+            <w:r>
+              <w:rPr>
+                <w:rFonts w:ascii="Arial" w:cs="Arial" w:eastAsia="Arial" w:hAnsi="Arial"/>
+                <w:color w:val="1B2118"/>
+                <w:sz w:val="18"/>
+                <w:szCs w:val="18"/>
+              </w:rPr>
+              <w:t xml:space="preserve"> utente Cliente associato a «Comune di Prova»</w:t>
             </w:r>
           </w:p>
         </w:tc>
@@ -9991,7 +10148,7 @@
                 <w:sz w:val="18"/>
                 <w:szCs w:val="18"/>
               </w:rPr>
-              <w:t xml:space="preserve">Il portale chiede subito una nuova password (min. 10 caratteri, lettere e numeri)</w:t>
+              <w:t xml:space="preserve">Rifiutato: «L'Organizzazione «Comune di Prova» ha già un account attivo… Disattiva quello attuale prima di attivarne un altro»</w:t>
             </w:r>
           </w:p>
         </w:tc>
@@ -10028,7 +10185,7 @@
                 <w:sz w:val="18"/>
                 <w:szCs w:val="18"/>
               </w:rPr>
-              <w:t xml:space="preserve">1.5</w:t>
+              <w:t xml:space="preserve">1.4</w:t>
             </w:r>
           </w:p>
         </w:tc>
@@ -10060,7 +10217,7 @@
                 <w:sz w:val="18"/>
                 <w:szCs w:val="18"/>
               </w:rPr>
-              <w:t xml:space="preserve">[C] Aprite Il mio profilo e il Manuale</w:t>
+              <w:t xml:space="preserve">[C] Accedete con la password temporanea</w:t>
             </w:r>
           </w:p>
         </w:tc>
@@ -10092,7 +10249,7 @@
                 <w:sz w:val="18"/>
                 <w:szCs w:val="18"/>
               </w:rPr>
-              <w:t xml:space="preserve">Dati dell'account; manuale scaricabile in PDF</w:t>
+              <w:t xml:space="preserve">Il portale chiede subito una nuova password (min. 10 caratteri, lettere e numeri)</w:t>
             </w:r>
           </w:p>
         </w:tc>
@@ -10130,7 +10287,7 @@
                 <w:sz w:val="18"/>
                 <w:szCs w:val="18"/>
               </w:rPr>
-              <w:t xml:space="preserve">1.6</w:t>
+              <w:t xml:space="preserve">1.5</w:t>
             </w:r>
           </w:p>
         </w:tc>
@@ -10163,7 +10320,7 @@
                 <w:sz w:val="18"/>
                 <w:szCs w:val="18"/>
               </w:rPr>
-              <w:t xml:space="preserve">[O] Anagrafiche → Enti di Validazione: + Nuovo ente «RINA (prova)»</w:t>
+              <w:t xml:space="preserve">[C] Aprite Il mio profilo e il Manuale</w:t>
             </w:r>
           </w:p>
         </w:tc>
@@ -10196,7 +10353,7 @@
                 <w:sz w:val="18"/>
                 <w:szCs w:val="18"/>
               </w:rPr>
-              <w:t xml:space="preserve">L'ente compare in elenco (anche un Operatore può crearlo)</w:t>
+              <w:t xml:space="preserve">Dati dell'account; manuale scaricabile in PDF</w:t>
             </w:r>
           </w:p>
         </w:tc>
@@ -10233,7 +10390,7 @@
                 <w:sz w:val="18"/>
                 <w:szCs w:val="18"/>
               </w:rPr>
-              <w:t xml:space="preserve">1.6b</w:t>
+              <w:t xml:space="preserve">1.6</w:t>
             </w:r>
           </w:p>
         </w:tc>
@@ -10265,7 +10422,7 @@
                 <w:sz w:val="18"/>
                 <w:szCs w:val="18"/>
               </w:rPr>
-              <w:t xml:space="preserve">[O] Anagrafiche → Registri: + Nuovo registro «Registro (prova)», attivo</w:t>
+              <w:t xml:space="preserve">[O] Anagrafiche → Enti di Validazione: + Nuovo ente «RINA (prova)»</w:t>
             </w:r>
           </w:p>
         </w:tc>
@@ -10297,7 +10454,7 @@
                 <w:sz w:val="18"/>
                 <w:szCs w:val="18"/>
               </w:rPr>
-              <w:t xml:space="preserve">Il registro compare in elenco (serve alla prova 8.2)</w:t>
+              <w:t xml:space="preserve">L'ente compare in elenco (anche un Operatore può crearlo)</w:t>
             </w:r>
           </w:p>
         </w:tc>
@@ -10335,7 +10492,7 @@
                 <w:sz w:val="18"/>
                 <w:szCs w:val="18"/>
               </w:rPr>
-              <w:t xml:space="preserve">1.7</w:t>
+              <w:t xml:space="preserve">1.6b</w:t>
             </w:r>
           </w:p>
         </w:tc>
@@ -10368,7 +10525,7 @@
                 <w:sz w:val="18"/>
                 <w:szCs w:val="18"/>
               </w:rPr>
-              <w:t xml:space="preserve">[A] Impostazioni → Modelli di documento: un modello per «Progetto · Fase 1» e uno Generale, spuntando «pubblico» sul secondo con sezione «Modulistica»</w:t>
+              <w:t xml:space="preserve">[O] Anagrafiche → Registri: + Nuovo registro «Registro (prova)», attivo</w:t>
             </w:r>
           </w:p>
         </w:tc>
@@ -10401,7 +10558,7 @@
                 <w:sz w:val="18"/>
                 <w:szCs w:val="18"/>
               </w:rPr>
-              <w:t xml:space="preserve">Pubblicati; il Comune vede il primo nella fase 1 e il secondo in I tuoi documenti</w:t>
+              <w:t xml:space="preserve">Il registro compare in elenco (serve alla prova 8.2)</w:t>
             </w:r>
           </w:p>
         </w:tc>
@@ -10438,7 +10595,7 @@
                 <w:sz w:val="18"/>
                 <w:szCs w:val="18"/>
               </w:rPr>
-              <w:t xml:space="preserve">1.8</w:t>
+              <w:t xml:space="preserve">1.7</w:t>
             </w:r>
           </w:p>
         </w:tc>
@@ -10470,7 +10627,7 @@
                 <w:sz w:val="18"/>
                 <w:szCs w:val="18"/>
               </w:rPr>
-              <w:t xml:space="preserve">[A] Impostazioni → Documenti richiesti per fase: controllate le voci già presenti, poi aggiungete Progetto, Fase 2, «Altra (scrivila)…» «Delibera tariffaria»</w:t>
+              <w:t xml:space="preserve">[A] Impostazioni → Modelli di documento: un modello per «Progetto · Fase 1» e uno Generale, spuntando «pubblico» sul secondo con sezione «Modulistica»</w:t>
             </w:r>
           </w:p>
         </w:tc>
@@ -10502,7 +10659,7 @@
                 <w:sz w:val="18"/>
                 <w:szCs w:val="18"/>
               </w:rPr>
-              <w:t xml:space="preserve">Ci sono già le voci della Guida (es. Progetto · Fase 1 «Modulo di descrizione del progetto», Fase 3 «Contratto con l'ente di validazione e verifica»); la nuova voce compare in elenco</w:t>
+              <w:t xml:space="preserve">Pubblicati; il Comune vede il primo nella fase 1 e il secondo in I tuoi documenti</w:t>
             </w:r>
           </w:p>
         </w:tc>
@@ -10540,6 +10697,109 @@
                 <w:sz w:val="18"/>
                 <w:szCs w:val="18"/>
               </w:rPr>
+              <w:t xml:space="preserve">1.8</w:t>
+            </w:r>
+          </w:p>
+        </w:tc>
+        <w:tc>
+          <w:tcPr>
+            <w:tcW w:type="dxa" w:w="4377"/>
+            <w:tcBorders>
+              <w:top w:val="single" w:color="D9D4C5" w:sz="4"/>
+              <w:left w:val="single" w:color="D9D4C5" w:sz="4"/>
+              <w:bottom w:val="single" w:color="D9D4C5" w:sz="4"/>
+              <w:right w:val="single" w:color="D9D4C5" w:sz="4"/>
+            </w:tcBorders>
+            <w:shd w:fill="F6F4EE" w:color="auto" w:val="clear"/>
+            <w:tcMar>
+              <w:top w:type="dxa" w:w="70"/>
+              <w:left w:type="dxa" w:w="110"/>
+              <w:bottom w:type="dxa" w:w="70"/>
+              <w:right w:type="dxa" w:w="110"/>
+            </w:tcMar>
+            <w:vAlign w:val="center"/>
+          </w:tcPr>
+          <w:p>
+            <w:pPr>
+              <w:spacing w:after="0" w:before="0"/>
+            </w:pPr>
+            <w:r>
+              <w:rPr>
+                <w:rFonts w:ascii="Arial" w:cs="Arial" w:eastAsia="Arial" w:hAnsi="Arial"/>
+                <w:color w:val="1B2118"/>
+                <w:sz w:val="18"/>
+                <w:szCs w:val="18"/>
+              </w:rPr>
+              <w:t xml:space="preserve">[A] Impostazioni → Documenti richiesti per fase: controllate le voci già presenti, poi aggiungete Progetto, Fase 2, «Altra (scrivila)…» «Delibera tariffaria»</w:t>
+            </w:r>
+          </w:p>
+        </w:tc>
+        <w:tc>
+          <w:tcPr>
+            <w:tcW w:type="dxa" w:w="4376"/>
+            <w:tcBorders>
+              <w:top w:val="single" w:color="D9D4C5" w:sz="4"/>
+              <w:left w:val="single" w:color="D9D4C5" w:sz="4"/>
+              <w:bottom w:val="single" w:color="D9D4C5" w:sz="4"/>
+              <w:right w:val="single" w:color="D9D4C5" w:sz="4"/>
+            </w:tcBorders>
+            <w:shd w:fill="F6F4EE" w:color="auto" w:val="clear"/>
+            <w:tcMar>
+              <w:top w:type="dxa" w:w="70"/>
+              <w:left w:type="dxa" w:w="110"/>
+              <w:bottom w:type="dxa" w:w="70"/>
+              <w:right w:type="dxa" w:w="110"/>
+            </w:tcMar>
+            <w:vAlign w:val="center"/>
+          </w:tcPr>
+          <w:p>
+            <w:pPr>
+              <w:spacing w:after="0" w:before="0"/>
+            </w:pPr>
+            <w:r>
+              <w:rPr>
+                <w:rFonts w:ascii="Arial" w:cs="Arial" w:eastAsia="Arial" w:hAnsi="Arial"/>
+                <w:color w:val="1B2118"/>
+                <w:sz w:val="18"/>
+                <w:szCs w:val="18"/>
+              </w:rPr>
+              <w:t xml:space="preserve">Ci sono già le voci della Guida (es. Progetto · Fase 1 «Modulo di descrizione del progetto», Fase 3 «Contratto con l'ente di validazione e verifica»); la nuova voce compare in elenco</w:t>
+            </w:r>
+          </w:p>
+        </w:tc>
+      </w:tr>
+      <w:tr>
+        <w:trPr>
+          <w:cantSplit/>
+        </w:trPr>
+        <w:tc>
+          <w:tcPr>
+            <w:tcW w:type="dxa" w:w="885"/>
+            <w:tcBorders>
+              <w:top w:val="single" w:color="D9D4C5" w:sz="4"/>
+              <w:left w:val="single" w:color="D9D4C5" w:sz="4"/>
+              <w:bottom w:val="single" w:color="D9D4C5" w:sz="4"/>
+              <w:right w:val="single" w:color="D9D4C5" w:sz="4"/>
+            </w:tcBorders>
+            <w:tcMar>
+              <w:top w:type="dxa" w:w="70"/>
+              <w:left w:type="dxa" w:w="110"/>
+              <w:bottom w:type="dxa" w:w="70"/>
+              <w:right w:type="dxa" w:w="110"/>
+            </w:tcMar>
+            <w:vAlign w:val="center"/>
+          </w:tcPr>
+          <w:p>
+            <w:pPr>
+              <w:spacing w:after="0" w:before="0"/>
+            </w:pPr>
+            <w:r>
+              <w:rPr>
+                <w:rFonts w:ascii="Arial" w:cs="Arial" w:eastAsia="Arial" w:hAnsi="Arial"/>
+                <w:color w:val="1B2118"/>
+                <w:sz w:val="18"/>
+                <w:szCs w:val="18"/>
+              </w:rPr>
               <w:t xml:space="preserve">1.9</w:t>
             </w:r>
           </w:p>
@@ -10553,7 +10813,6 @@
               <w:bottom w:val="single" w:color="D9D4C5" w:sz="4"/>
               <w:right w:val="single" w:color="D9D4C5" w:sz="4"/>
             </w:tcBorders>
-            <w:shd w:fill="F6F4EE" w:color="auto" w:val="clear"/>
             <w:tcMar>
               <w:top w:type="dxa" w:w="70"/>
               <w:left w:type="dxa" w:w="110"/>
@@ -10586,7 +10845,6 @@
               <w:bottom w:val="single" w:color="D9D4C5" w:sz="4"/>
               <w:right w:val="single" w:color="D9D4C5" w:sz="4"/>
             </w:tcBorders>
-            <w:shd w:fill="F6F4EE" w:color="auto" w:val="clear"/>
             <w:tcMar>
               <w:top w:type="dxa" w:w="70"/>
               <w:left w:type="dxa" w:w="110"/>
@@ -24146,7 +24404,7 @@
         <w:szCs w:val="16"/>
       </w:rPr>
       <w:tab/>
-      <w:t xml:space="preserve">Manuale Test · Rev. 2.6 · 19/10/2026</w:t>
+      <w:t xml:space="preserve">Manuale Test · Rev. 2.7 · 19/10/2026</w:t>
     </w:r>
   </w:p>
 </w:hdr>
@@ -24211,7 +24469,7 @@
         <w:szCs w:val="16"/>
       </w:rPr>
       <w:tab/>
-      <w:t xml:space="preserve">Manuale Test · Rev. 2.6 · 19/10/2026</w:t>
+      <w:t xml:space="preserve">Manuale Test · Rev. 2.7 · 19/10/2026</w:t>
     </w:r>
   </w:p>
 </w:hdr>

</xml_diff>

<commit_message>
Banca Dati Utenze: categoria tariffaria e di simulazione, passo 5a con caricamento del file, schede domestiche e non domestiche e modulo di ogni utenza; file di prova 20+20; documenti
Co-Authored-By: Claude Opus 5.5 <noreply@anthropic.com>
Claude-Session: https://claude.ai/code/session_01E8XCbEeVHWVP3hntUZ6kZ1
</commit_message>
<xml_diff>
--- a/public/documentazione/Manuale_Test_Portale_CWP.docx
+++ b/public/documentazione/Manuale_Test_Portale_CWP.docx
@@ -302,7 +302,7 @@
                 <w:sz w:val="20"/>
                 <w:szCs w:val="20"/>
               </w:rPr>
-              <w:t xml:space="preserve">Rev. 3.18</w:t>
+              <w:t xml:space="preserve">Rev. 3.19</w:t>
             </w:r>
           </w:p>
         </w:tc>
@@ -719,7 +719,7 @@
                 <w:sz w:val="18"/>
                 <w:szCs w:val="18"/>
               </w:rPr>
-              <w:t xml:space="preserve">3.18</w:t>
+              <w:t xml:space="preserve">3.19</w:t>
             </w:r>
           </w:p>
         </w:tc>
@@ -783,7 +783,7 @@
                 <w:sz w:val="18"/>
                 <w:szCs w:val="18"/>
               </w:rPr>
-              <w:t xml:space="preserve">Prove 10.10g-10.10l (navigazione da smartphone).</w:t>
+              <w:t xml:space="preserve">Prove 7.25-7.25e (Banca Dati Utenze).</w:t>
             </w:r>
           </w:p>
         </w:tc>
@@ -853,7 +853,7 @@
                 <w:sz w:val="18"/>
                 <w:szCs w:val="18"/>
               </w:rPr>
-              <w:t xml:space="preserve">3.17</w:t>
+              <w:t xml:space="preserve">3.18</w:t>
             </w:r>
           </w:p>
         </w:tc>
@@ -919,7 +919,7 @@
                 <w:sz w:val="18"/>
                 <w:szCs w:val="18"/>
               </w:rPr>
-              <w:t xml:space="preserve">Prove dei rilievi N01-N06: 1.2d, 4.1, 4.9-4.9d, 5.0, 5.1c, 7.24, 8b.7d, 8b.7f, 10.10f; nota sull'attesa di 30 giorni.</w:t>
+              <w:t xml:space="preserve">Prove 10.10g-10.10l (navigazione da smartphone).</w:t>
             </w:r>
           </w:p>
         </w:tc>
@@ -989,7 +989,7 @@
                 <w:sz w:val="18"/>
                 <w:szCs w:val="18"/>
               </w:rPr>
-              <w:t xml:space="preserve">3.16</w:t>
+              <w:t xml:space="preserve">3.17</w:t>
             </w:r>
           </w:p>
         </w:tc>
@@ -1021,7 +1021,7 @@
                 <w:sz w:val="18"/>
                 <w:szCs w:val="18"/>
               </w:rPr>
-              <w:t xml:space="preserve">21/10/2026</w:t>
+              <w:t xml:space="preserve">22/10/2026</w:t>
             </w:r>
           </w:p>
         </w:tc>
@@ -1053,7 +1053,7 @@
                 <w:sz w:val="18"/>
                 <w:szCs w:val="18"/>
               </w:rPr>
-              <w:t xml:space="preserve">Prove 10.10d-10.10e (barra a LED, loghi); nomi Notizie CO2. Prova 10.15h (pallino verde).</w:t>
+              <w:t xml:space="preserve">Prove dei rilievi N01-N06: 1.2d, 4.1, 4.9-4.9d, 5.0, 5.1c, 7.24, 8b.7d, 8b.7f, 10.10f; nota sull'attesa di 30 giorni.</w:t>
             </w:r>
           </w:p>
         </w:tc>
@@ -1123,7 +1123,7 @@
                 <w:sz w:val="18"/>
                 <w:szCs w:val="18"/>
               </w:rPr>
-              <w:t xml:space="preserve">3.15</w:t>
+              <w:t xml:space="preserve">3.16</w:t>
             </w:r>
           </w:p>
         </w:tc>
@@ -1189,7 +1189,7 @@
                 <w:sz w:val="18"/>
                 <w:szCs w:val="18"/>
               </w:rPr>
-              <w:t xml:space="preserve">Prove 10.15-10.15g (News).</w:t>
+              <w:t xml:space="preserve">Prove 10.10d-10.10e (barra a LED, loghi); nomi Notizie CO2. Prova 10.15h (pallino verde).</w:t>
             </w:r>
           </w:p>
         </w:tc>
@@ -1259,7 +1259,7 @@
                 <w:sz w:val="18"/>
                 <w:szCs w:val="18"/>
               </w:rPr>
-              <w:t xml:space="preserve">3.14</w:t>
+              <w:t xml:space="preserve">3.15</w:t>
             </w:r>
           </w:p>
         </w:tc>
@@ -1323,7 +1323,7 @@
                 <w:sz w:val="18"/>
                 <w:szCs w:val="18"/>
               </w:rPr>
-              <w:t xml:space="preserve">Prove 8b.7 aggiornata e 8b.7b (PDF della simulazione completo).</w:t>
+              <w:t xml:space="preserve">Prove 10.15-10.15g (News).</w:t>
             </w:r>
           </w:p>
         </w:tc>
@@ -1393,7 +1393,7 @@
                 <w:sz w:val="18"/>
                 <w:szCs w:val="18"/>
               </w:rPr>
-              <w:t xml:space="preserve">3.13</w:t>
+              <w:t xml:space="preserve">3.14</w:t>
             </w:r>
           </w:p>
         </w:tc>
@@ -1459,7 +1459,7 @@
                 <w:sz w:val="18"/>
                 <w:szCs w:val="18"/>
               </w:rPr>
-              <w:t xml:space="preserve">Prove 10.11e (pratica aperta) e 10.11f (Operatore).</w:t>
+              <w:t xml:space="preserve">Prove 8b.7 aggiornata e 8b.7b (PDF della simulazione completo).</w:t>
             </w:r>
           </w:p>
         </w:tc>
@@ -1529,7 +1529,7 @@
                 <w:sz w:val="18"/>
                 <w:szCs w:val="18"/>
               </w:rPr>
-              <w:t xml:space="preserve">3.12</w:t>
+              <w:t xml:space="preserve">3.13</w:t>
             </w:r>
           </w:p>
         </w:tc>
@@ -1593,7 +1593,7 @@
                 <w:sz w:val="18"/>
                 <w:szCs w:val="18"/>
               </w:rPr>
-              <w:t xml:space="preserve">Prova 7.23: caratteri incorporati nei PDF (R08).</w:t>
+              <w:t xml:space="preserve">Prove 10.11e (pratica aperta) e 10.11f (Operatore).</w:t>
             </w:r>
           </w:p>
         </w:tc>
@@ -1663,7 +1663,7 @@
                 <w:sz w:val="18"/>
                 <w:szCs w:val="18"/>
               </w:rPr>
-              <w:t xml:space="preserve">3.11</w:t>
+              <w:t xml:space="preserve">3.12</w:t>
             </w:r>
           </w:p>
         </w:tc>
@@ -1729,7 +1729,7 @@
                 <w:sz w:val="18"/>
                 <w:szCs w:val="18"/>
               </w:rPr>
-              <w:t xml:space="preserve">Le segnalazioni del collaudo confluiscono nel Registro issue e test.</w:t>
+              <w:t xml:space="preserve">Prova 7.23: caratteri incorporati nei PDF (R08).</w:t>
             </w:r>
           </w:p>
         </w:tc>
@@ -1799,7 +1799,7 @@
                 <w:sz w:val="18"/>
                 <w:szCs w:val="18"/>
               </w:rPr>
-              <w:t xml:space="preserve">3.10</w:t>
+              <w:t xml:space="preserve">3.11</w:t>
             </w:r>
           </w:p>
         </w:tc>
@@ -1863,7 +1863,7 @@
                 <w:sz w:val="18"/>
                 <w:szCs w:val="18"/>
               </w:rPr>
-              <w:t xml:space="preserve">Collaudo V05: prova 10.5 aggiornata (account disattivato) e nuova 10.5b (testi lunghi nell'Audit).</w:t>
+              <w:t xml:space="preserve">Le segnalazioni del collaudo confluiscono nel Registro issue e test.</w:t>
             </w:r>
           </w:p>
         </w:tc>
@@ -1933,7 +1933,7 @@
                 <w:sz w:val="18"/>
                 <w:szCs w:val="18"/>
               </w:rPr>
-              <w:t xml:space="preserve">3.9</w:t>
+              <w:t xml:space="preserve">3.10</w:t>
             </w:r>
           </w:p>
         </w:tc>
@@ -1966,7 +1966,7 @@
                 <w:sz w:val="18"/>
                 <w:szCs w:val="18"/>
               </w:rPr>
-              <w:t xml:space="preserve">20/10/2026</w:t>
+              <w:t xml:space="preserve">21/10/2026</w:t>
             </w:r>
           </w:p>
         </w:tc>
@@ -1999,7 +1999,7 @@
                 <w:sz w:val="18"/>
                 <w:szCs w:val="18"/>
               </w:rPr>
-              <w:t xml:space="preserve">Prove del collaudo V01: 7.17-7.22 (negativi, date inesistenti, buffer, conferma senza Banca Dati, percentuali nel CSV, formule nei CSV) e 8b.5-8b.5e, 8b.9b (simulatore e audit degli scenari).</w:t>
+              <w:t xml:space="preserve">Collaudo V05: prova 10.5 aggiornata (account disattivato) e nuova 10.5b (testi lunghi nell'Audit).</w:t>
             </w:r>
           </w:p>
         </w:tc>
@@ -2069,7 +2069,7 @@
                 <w:sz w:val="18"/>
                 <w:szCs w:val="18"/>
               </w:rPr>
-              <w:t xml:space="preserve">3.8</w:t>
+              <w:t xml:space="preserve">3.9</w:t>
             </w:r>
           </w:p>
         </w:tc>
@@ -2133,7 +2133,7 @@
                 <w:sz w:val="18"/>
                 <w:szCs w:val="18"/>
               </w:rPr>
-              <w:t xml:space="preserve">Prove 10.14-10.14d (sicurezza).</w:t>
+              <w:t xml:space="preserve">Prove del collaudo V01: 7.17-7.22 (negativi, date inesistenti, buffer, conferma senza Banca Dati, percentuali nel CSV, formule nei CSV) e 8b.5-8b.5e, 8b.9b (simulatore e audit degli scenari).</w:t>
             </w:r>
           </w:p>
         </w:tc>
@@ -2203,7 +2203,7 @@
                 <w:sz w:val="18"/>
                 <w:szCs w:val="18"/>
               </w:rPr>
-              <w:t xml:space="preserve">3.7</w:t>
+              <w:t xml:space="preserve">3.8</w:t>
             </w:r>
           </w:p>
         </w:tc>
@@ -2269,7 +2269,7 @@
                 <w:sz w:val="18"/>
                 <w:szCs w:val="18"/>
               </w:rPr>
-              <w:t xml:space="preserve">Prove 10.6b (menu Amministratori) e 10.7 (menu enti).</w:t>
+              <w:t xml:space="preserve">Prove 10.14-10.14d (sicurezza).</w:t>
             </w:r>
           </w:p>
         </w:tc>
@@ -2339,7 +2339,7 @@
                 <w:sz w:val="18"/>
                 <w:szCs w:val="18"/>
               </w:rPr>
-              <w:t xml:space="preserve">3.6</w:t>
+              <w:t xml:space="preserve">3.7</w:t>
             </w:r>
           </w:p>
         </w:tc>
@@ -2403,7 +2403,7 @@
                 <w:sz w:val="18"/>
                 <w:szCs w:val="18"/>
               </w:rPr>
-              <w:t xml:space="preserve">Sezione «Audit User». Voce «Marketplaces» in arrivo.</w:t>
+              <w:t xml:space="preserve">Prove 10.6b (menu Amministratori) e 10.7 (menu enti).</w:t>
             </w:r>
           </w:p>
         </w:tc>
@@ -2473,7 +2473,7 @@
                 <w:sz w:val="18"/>
                 <w:szCs w:val="18"/>
               </w:rPr>
-              <w:t xml:space="preserve">3.5</w:t>
+              <w:t xml:space="preserve">3.6</w:t>
             </w:r>
           </w:p>
         </w:tc>
@@ -2539,7 +2539,7 @@
                 <w:sz w:val="18"/>
                 <w:szCs w:val="18"/>
               </w:rPr>
-              <w:t xml:space="preserve">Prove 10.12b-10.13d (Audit trail user).</w:t>
+              <w:t xml:space="preserve">Sezione «Audit User». Voce «Marketplaces» in arrivo.</w:t>
             </w:r>
           </w:p>
         </w:tc>
@@ -2609,7 +2609,7 @@
                 <w:sz w:val="18"/>
                 <w:szCs w:val="18"/>
               </w:rPr>
-              <w:t xml:space="preserve">3.4</w:t>
+              <w:t xml:space="preserve">3.5</w:t>
             </w:r>
           </w:p>
         </w:tc>
@@ -2673,7 +2673,7 @@
                 <w:sz w:val="18"/>
                 <w:szCs w:val="18"/>
               </w:rPr>
-              <w:t xml:space="preserve">Prove 8b.7-8b.7e (PDF, Excel, telefono), 10.12 (utenti online), 10.11d.</w:t>
+              <w:t xml:space="preserve">Prove 10.12b-10.13d (Audit trail user).</w:t>
             </w:r>
           </w:p>
         </w:tc>
@@ -2743,7 +2743,7 @@
                 <w:sz w:val="18"/>
                 <w:szCs w:val="18"/>
               </w:rPr>
-              <w:t xml:space="preserve">3.3</w:t>
+              <w:t xml:space="preserve">3.4</w:t>
             </w:r>
           </w:p>
         </w:tc>
@@ -2776,7 +2776,7 @@
                 <w:sz w:val="18"/>
                 <w:szCs w:val="18"/>
               </w:rPr>
-              <w:t xml:space="preserve">19/10/2026</w:t>
+              <w:t xml:space="preserve">20/10/2026</w:t>
             </w:r>
           </w:p>
         </w:tc>
@@ -2809,7 +2809,7 @@
                 <w:sz w:val="18"/>
                 <w:szCs w:val="18"/>
               </w:rPr>
-              <w:t xml:space="preserve">Prova 10.11: messaggio d'attesa «Un attimo…».</w:t>
+              <w:t xml:space="preserve">Prove 8b.7-8b.7e (PDF, Excel, telefono), 10.12 (utenti online), 10.11d.</w:t>
             </w:r>
           </w:p>
         </w:tc>
@@ -2879,7 +2879,7 @@
                 <w:sz w:val="18"/>
                 <w:szCs w:val="18"/>
               </w:rPr>
-              <w:t xml:space="preserve">3.2</w:t>
+              <w:t xml:space="preserve">3.3</w:t>
             </w:r>
           </w:p>
         </w:tc>
@@ -2943,7 +2943,7 @@
                 <w:sz w:val="18"/>
                 <w:szCs w:val="18"/>
               </w:rPr>
-              <w:t xml:space="preserve">Prova 10.11 aggiornata con l'assistente attivo e i messaggi d'errore della Console.</w:t>
+              <w:t xml:space="preserve">Prova 10.11: messaggio d'attesa «Un attimo…».</w:t>
             </w:r>
           </w:p>
         </w:tc>
@@ -3013,7 +3013,7 @@
                 <w:sz w:val="18"/>
                 <w:szCs w:val="18"/>
               </w:rPr>
-              <w:t xml:space="preserve">3.1</w:t>
+              <w:t xml:space="preserve">3.2</w:t>
             </w:r>
           </w:p>
         </w:tc>
@@ -3079,7 +3079,7 @@
                 <w:sz w:val="18"/>
                 <w:szCs w:val="18"/>
               </w:rPr>
-              <w:t xml:space="preserve">Prove 10.11-10.11c: assistente virtuale e documenti ufficiali.</w:t>
+              <w:t xml:space="preserve">Prova 10.11 aggiornata con l'assistente attivo e i messaggi d'errore della Console.</w:t>
             </w:r>
           </w:p>
         </w:tc>
@@ -3149,7 +3149,7 @@
                 <w:sz w:val="18"/>
                 <w:szCs w:val="18"/>
               </w:rPr>
-              <w:t xml:space="preserve">3.0</w:t>
+              <w:t xml:space="preserve">3.1</w:t>
             </w:r>
           </w:p>
         </w:tc>
@@ -3213,7 +3213,7 @@
                 <w:sz w:val="18"/>
                 <w:szCs w:val="18"/>
               </w:rPr>
-              <w:t xml:space="preserve">Prova 10.10c: ordinamento.</w:t>
+              <w:t xml:space="preserve">Prove 10.11-10.11c: assistente virtuale e documenti ufficiali.</w:t>
             </w:r>
           </w:p>
         </w:tc>
@@ -3283,7 +3283,7 @@
                 <w:sz w:val="18"/>
                 <w:szCs w:val="18"/>
               </w:rPr>
-              <w:t xml:space="preserve">2.9</w:t>
+              <w:t xml:space="preserve">3.0</w:t>
             </w:r>
           </w:p>
         </w:tc>
@@ -3349,7 +3349,7 @@
                 <w:sz w:val="18"/>
                 <w:szCs w:val="18"/>
               </w:rPr>
-              <w:t xml:space="preserve">Prove 8b.3b e 8b.3c: metodo per utenza, buffer e taratura.</w:t>
+              <w:t xml:space="preserve">Prova 10.10c: ordinamento.</w:t>
             </w:r>
           </w:p>
         </w:tc>
@@ -3419,7 +3419,7 @@
                 <w:sz w:val="18"/>
                 <w:szCs w:val="18"/>
               </w:rPr>
-              <w:t xml:space="preserve">2.8</w:t>
+              <w:t xml:space="preserve">2.9</w:t>
             </w:r>
           </w:p>
         </w:tc>
@@ -3483,7 +3483,7 @@
                 <w:sz w:val="18"/>
                 <w:szCs w:val="18"/>
               </w:rPr>
-              <w:t xml:space="preserve">Prova 10.10b: barra a LED della Dashboard.</w:t>
+              <w:t xml:space="preserve">Prove 8b.3b e 8b.3c: metodo per utenza, buffer e taratura.</w:t>
             </w:r>
           </w:p>
         </w:tc>
@@ -3553,7 +3553,7 @@
                 <w:sz w:val="18"/>
                 <w:szCs w:val="18"/>
               </w:rPr>
-              <w:t xml:space="preserve">2.7</w:t>
+              <w:t xml:space="preserve">2.8</w:t>
             </w:r>
           </w:p>
         </w:tc>
@@ -3619,7 +3619,7 @@
                 <w:sz w:val="18"/>
                 <w:szCs w:val="18"/>
               </w:rPr>
-              <w:t xml:space="preserve">Prova 1.3d: eliminazione di un utente mai attivo.</w:t>
+              <w:t xml:space="preserve">Prova 10.10b: barra a LED della Dashboard.</w:t>
             </w:r>
           </w:p>
         </w:tc>
@@ -3689,7 +3689,7 @@
                 <w:sz w:val="18"/>
                 <w:szCs w:val="18"/>
               </w:rPr>
-              <w:t xml:space="preserve">2.6</w:t>
+              <w:t xml:space="preserve">2.7</w:t>
             </w:r>
           </w:p>
         </w:tc>
@@ -3753,7 +3753,7 @@
                 <w:sz w:val="18"/>
                 <w:szCs w:val="18"/>
               </w:rPr>
-              <w:t xml:space="preserve">Prove 1.3 e 1.3c: email con le credenziali.</w:t>
+              <w:t xml:space="preserve">Prova 1.3d: eliminazione di un utente mai attivo.</w:t>
             </w:r>
           </w:p>
         </w:tc>
@@ -3823,7 +3823,7 @@
                 <w:sz w:val="18"/>
                 <w:szCs w:val="18"/>
               </w:rPr>
-              <w:t xml:space="preserve">2.5</w:t>
+              <w:t xml:space="preserve">2.6</w:t>
             </w:r>
           </w:p>
         </w:tc>
@@ -3889,7 +3889,7 @@
                 <w:sz w:val="18"/>
                 <w:szCs w:val="18"/>
               </w:rPr>
-              <w:t xml:space="preserve">Prove 1.3a-1.3a3: nomina di un Amministratore e protezione del principale.</w:t>
+              <w:t xml:space="preserve">Prove 1.3 e 1.3c: email con le credenziali.</w:t>
             </w:r>
           </w:p>
         </w:tc>
@@ -3959,7 +3959,7 @@
                 <w:sz w:val="18"/>
                 <w:szCs w:val="18"/>
               </w:rPr>
-              <w:t xml:space="preserve">2.4</w:t>
+              <w:t xml:space="preserve">2.5</w:t>
             </w:r>
           </w:p>
         </w:tc>
@@ -4023,7 +4023,7 @@
                 <w:sz w:val="18"/>
                 <w:szCs w:val="18"/>
               </w:rPr>
-              <w:t xml:space="preserve">Prove 8b.7c e 8b.7d: costi Caso 1 e Caso 2.</w:t>
+              <w:t xml:space="preserve">Prove 1.3a-1.3a3: nomina di un Amministratore e protezione del principale.</w:t>
             </w:r>
           </w:p>
         </w:tc>
@@ -4093,7 +4093,7 @@
                 <w:sz w:val="18"/>
                 <w:szCs w:val="18"/>
               </w:rPr>
-              <w:t xml:space="preserve">2.3</w:t>
+              <w:t xml:space="preserve">2.4</w:t>
             </w:r>
           </w:p>
         </w:tc>
@@ -4159,7 +4159,7 @@
                 <w:sz w:val="18"/>
                 <w:szCs w:val="18"/>
               </w:rPr>
-              <w:t xml:space="preserve">Prova 8b.7b aggiornata: valore del credito anno per anno.</w:t>
+              <w:t xml:space="preserve">Prove 8b.7c e 8b.7d: costi Caso 1 e Caso 2.</w:t>
             </w:r>
           </w:p>
         </w:tc>
@@ -4229,7 +4229,7 @@
                 <w:sz w:val="18"/>
                 <w:szCs w:val="18"/>
               </w:rPr>
-              <w:t xml:space="preserve">2.2</w:t>
+              <w:t xml:space="preserve">2.3</w:t>
             </w:r>
           </w:p>
         </w:tc>
@@ -4293,7 +4293,7 @@
                 <w:sz w:val="18"/>
                 <w:szCs w:val="18"/>
               </w:rPr>
-              <w:t xml:space="preserve">Prova 8b.7b della simulazione economica (ricavi e costi per il Comune).</w:t>
+              <w:t xml:space="preserve">Prova 8b.7b aggiornata: valore del credito anno per anno.</w:t>
             </w:r>
           </w:p>
         </w:tc>
@@ -4363,7 +4363,7 @@
                 <w:sz w:val="18"/>
                 <w:szCs w:val="18"/>
               </w:rPr>
-              <w:t xml:space="preserve">2.1</w:t>
+              <w:t xml:space="preserve">2.2</w:t>
             </w:r>
           </w:p>
         </w:tc>
@@ -4429,7 +4429,7 @@
                 <w:sz w:val="18"/>
                 <w:szCs w:val="18"/>
               </w:rPr>
-              <w:t xml:space="preserve">Prove 8b.2b e 8b.2c (scenario di riferimento e situazione attuale).</w:t>
+              <w:t xml:space="preserve">Prova 8b.7b della simulazione economica (ricavi e costi per il Comune).</w:t>
             </w:r>
           </w:p>
         </w:tc>
@@ -4499,7 +4499,7 @@
                 <w:sz w:val="18"/>
                 <w:szCs w:val="18"/>
               </w:rPr>
-              <w:t xml:space="preserve">2.0</w:t>
+              <w:t xml:space="preserve">2.1</w:t>
             </w:r>
           </w:p>
         </w:tc>
@@ -4563,7 +4563,7 @@
                 <w:sz w:val="18"/>
                 <w:szCs w:val="18"/>
               </w:rPr>
-              <w:t xml:space="preserve">Prove 8b del simulatore di scenari.</w:t>
+              <w:t xml:space="preserve">Prove 8b.2b e 8b.2c (scenario di riferimento e situazione attuale).</w:t>
             </w:r>
           </w:p>
         </w:tc>
@@ -4633,7 +4633,7 @@
                 <w:sz w:val="18"/>
                 <w:szCs w:val="18"/>
               </w:rPr>
-              <w:t xml:space="preserve">1.9</w:t>
+              <w:t xml:space="preserve">2.0</w:t>
             </w:r>
           </w:p>
         </w:tc>
@@ -4699,7 +4699,7 @@
                 <w:sz w:val="18"/>
                 <w:szCs w:val="18"/>
               </w:rPr>
-              <w:t xml:space="preserve">In sviluppo: simulatore di scenari e assistente virtuale.</w:t>
+              <w:t xml:space="preserve">Prove 8b del simulatore di scenari.</w:t>
             </w:r>
           </w:p>
         </w:tc>
@@ -4769,7 +4769,7 @@
                 <w:sz w:val="18"/>
                 <w:szCs w:val="18"/>
               </w:rPr>
-              <w:t xml:space="preserve">1.8</w:t>
+              <w:t xml:space="preserve">1.9</w:t>
             </w:r>
           </w:p>
         </w:tc>
@@ -4833,7 +4833,7 @@
                 <w:sz w:val="18"/>
                 <w:szCs w:val="18"/>
               </w:rPr>
-              <w:t xml:space="preserve">Tolto il limite noto sull'incarico del soggetto promotore del programma.</w:t>
+              <w:t xml:space="preserve">In sviluppo: simulatore di scenari e assistente virtuale.</w:t>
             </w:r>
           </w:p>
         </w:tc>
@@ -4903,7 +4903,7 @@
                 <w:sz w:val="18"/>
                 <w:szCs w:val="18"/>
               </w:rPr>
-              <w:t xml:space="preserve">1.7</w:t>
+              <w:t xml:space="preserve">1.8</w:t>
             </w:r>
           </w:p>
         </w:tc>
@@ -4936,7 +4936,7 @@
                 <w:sz w:val="18"/>
                 <w:szCs w:val="18"/>
               </w:rPr>
-              <w:t xml:space="preserve">18/10/2026</w:t>
+              <w:t xml:space="preserve">19/10/2026</w:t>
             </w:r>
           </w:p>
         </w:tc>
@@ -4969,7 +4969,7 @@
                 <w:sz w:val="18"/>
                 <w:szCs w:val="18"/>
               </w:rPr>
-              <w:t xml:space="preserve">Percorso di prova esteso alle funzioni dell'allineamento ai documenti CWP: territorio ISTAT, stati del Programma, Rapporto a 7 fasi, tariffe e sospensione, accuratezza, ritiro, account unico, crediti emessi, reclami, pagina pubblica, qualità dei dati.</w:t>
+              <w:t xml:space="preserve">Tolto il limite noto sull'incarico del soggetto promotore del programma.</w:t>
             </w:r>
           </w:p>
         </w:tc>
@@ -5039,7 +5039,7 @@
                 <w:sz w:val="18"/>
                 <w:szCs w:val="18"/>
               </w:rPr>
-              <w:t xml:space="preserve">1.6</w:t>
+              <w:t xml:space="preserve">1.7</w:t>
             </w:r>
           </w:p>
         </w:tc>
@@ -5103,7 +5103,7 @@
                 <w:sz w:val="18"/>
                 <w:szCs w:val="18"/>
               </w:rPr>
-              <w:t xml:space="preserve">Glossario: descrizione corretta del buffer (al massimo 80%).</w:t>
+              <w:t xml:space="preserve">Percorso di prova esteso alle funzioni dell'allineamento ai documenti CWP: territorio ISTAT, stati del Programma, Rapporto a 7 fasi, tariffe e sospensione, accuratezza, ritiro, account unico, crediti emessi, reclami, pagina pubblica, qualità dei dati.</w:t>
             </w:r>
           </w:p>
         </w:tc>
@@ -5173,7 +5173,7 @@
                 <w:sz w:val="18"/>
                 <w:szCs w:val="18"/>
               </w:rPr>
-              <w:t xml:space="preserve">1.5</w:t>
+              <w:t xml:space="preserve">1.6</w:t>
             </w:r>
           </w:p>
         </w:tc>
@@ -5239,7 +5239,7 @@
                 <w:sz w:val="18"/>
                 <w:szCs w:val="18"/>
               </w:rPr>
-              <w:t xml:space="preserve">Nuove prove 1.2b, 1.8, 3.7, 4.1b, 6.4, 6.5; prove 1.6, 1.7, 3.2, 4.1, 4.6, 5.4 e 6.3 aggiornate (anagrafiche, documenti richiesti, consultazione, Rapporti a 4 fasi, conservazione, fascicolo).</w:t>
+              <w:t xml:space="preserve">Glossario: descrizione corretta del buffer (al massimo 80%).</w:t>
             </w:r>
           </w:p>
         </w:tc>
@@ -5309,7 +5309,7 @@
                 <w:sz w:val="18"/>
                 <w:szCs w:val="18"/>
               </w:rPr>
-              <w:t xml:space="preserve">1.4</w:t>
+              <w:t xml:space="preserve">1.5</w:t>
             </w:r>
           </w:p>
         </w:tc>
@@ -5373,7 +5373,7 @@
                 <w:sz w:val="18"/>
                 <w:szCs w:val="18"/>
               </w:rPr>
-              <w:t xml:space="preserve">Nuova prova 7.12 (risultato azzerato dopo una modifica dei dati); prove successive del blocco 7 rinumerate; prova 8.4 estesa.</w:t>
+              <w:t xml:space="preserve">Nuove prove 1.2b, 1.8, 3.7, 4.1b, 6.4, 6.5; prove 1.6, 1.7, 3.2, 4.1, 4.6, 5.4 e 6.3 aggiornate (anagrafiche, documenti richiesti, consultazione, Rapporti a 4 fasi, conservazione, fascicolo).</w:t>
             </w:r>
           </w:p>
         </w:tc>
@@ -5443,7 +5443,7 @@
                 <w:sz w:val="18"/>
                 <w:szCs w:val="18"/>
               </w:rPr>
-              <w:t xml:space="preserve">1.3</w:t>
+              <w:t xml:space="preserve">1.4</w:t>
             </w:r>
           </w:p>
         </w:tc>
@@ -5509,7 +5509,7 @@
                 <w:sz w:val="18"/>
                 <w:szCs w:val="18"/>
               </w:rPr>
-              <w:t xml:space="preserve">Prove del rapporto PDF, del numero di registro e del registro dei crediti con le nuove versioni.</w:t>
+              <w:t xml:space="preserve">Nuova prova 7.12 (risultato azzerato dopo una modifica dei dati); prove successive del blocco 7 rinumerate; prova 8.4 estesa.</w:t>
             </w:r>
           </w:p>
         </w:tc>
@@ -5579,7 +5579,7 @@
                 <w:sz w:val="18"/>
                 <w:szCs w:val="18"/>
               </w:rPr>
-              <w:t xml:space="preserve">1.2</w:t>
+              <w:t xml:space="preserve">1.3</w:t>
             </w:r>
           </w:p>
         </w:tc>
@@ -5643,7 +5643,7 @@
                 <w:sz w:val="18"/>
                 <w:szCs w:val="18"/>
               </w:rPr>
-              <w:t xml:space="preserve">Calcolo crediti: prove di import del tracciato con i file di esempio (compilato, letture, dati personali) e dei controlli di coerenza.</w:t>
+              <w:t xml:space="preserve">Prove del rapporto PDF, del numero di registro e del registro dei crediti con le nuove versioni.</w:t>
             </w:r>
           </w:p>
         </w:tc>
@@ -5713,7 +5713,7 @@
                 <w:sz w:val="18"/>
                 <w:szCs w:val="18"/>
               </w:rPr>
-              <w:t xml:space="preserve">1.1</w:t>
+              <w:t xml:space="preserve">1.2</w:t>
             </w:r>
           </w:p>
         </w:tc>
@@ -5779,7 +5779,7 @@
                 <w:sz w:val="18"/>
                 <w:szCs w:val="18"/>
               </w:rPr>
-              <w:t xml:space="preserve">Prove per Enti di Validazione, modelli, note di fase, messaggi, pagamenti visibili al Comune, pratica sospesa, consultazione pubblica con conferma dell'email, limiti di invio ed errata corrige.</w:t>
+              <w:t xml:space="preserve">Calcolo crediti: prove di import del tracciato con i file di esempio (compilato, letture, dati personali) e dei controlli di coerenza.</w:t>
             </w:r>
           </w:p>
         </w:tc>
@@ -5849,6 +5849,140 @@
                 <w:sz w:val="18"/>
                 <w:szCs w:val="18"/>
               </w:rPr>
+              <w:t xml:space="preserve">1.1</w:t>
+            </w:r>
+          </w:p>
+        </w:tc>
+        <w:tc>
+          <w:tcPr>
+            <w:tcW w:type="dxa" w:w="1300"/>
+            <w:tcBorders>
+              <w:top w:val="single" w:color="D9D4C5" w:sz="4"/>
+              <w:left w:val="single" w:color="D9D4C5" w:sz="4"/>
+              <w:bottom w:val="single" w:color="D9D4C5" w:sz="4"/>
+              <w:right w:val="single" w:color="D9D4C5" w:sz="4"/>
+            </w:tcBorders>
+            <w:tcMar>
+              <w:top w:type="dxa" w:w="70"/>
+              <w:left w:type="dxa" w:w="110"/>
+              <w:bottom w:type="dxa" w:w="70"/>
+              <w:right w:type="dxa" w:w="110"/>
+            </w:tcMar>
+            <w:vAlign w:val="center"/>
+          </w:tcPr>
+          <w:p>
+            <w:pPr>
+              <w:spacing w:after="0" w:before="0"/>
+            </w:pPr>
+            <w:r>
+              <w:rPr>
+                <w:rFonts w:ascii="Arial" w:cs="Arial" w:eastAsia="Arial" w:hAnsi="Arial"/>
+                <w:color w:val="1B2118"/>
+                <w:sz w:val="18"/>
+                <w:szCs w:val="18"/>
+              </w:rPr>
+              <w:t xml:space="preserve">18/10/2026</w:t>
+            </w:r>
+          </w:p>
+        </w:tc>
+        <w:tc>
+          <w:tcPr>
+            <w:tcW w:type="dxa" w:w="5538"/>
+            <w:tcBorders>
+              <w:top w:val="single" w:color="D9D4C5" w:sz="4"/>
+              <w:left w:val="single" w:color="D9D4C5" w:sz="4"/>
+              <w:bottom w:val="single" w:color="D9D4C5" w:sz="4"/>
+              <w:right w:val="single" w:color="D9D4C5" w:sz="4"/>
+            </w:tcBorders>
+            <w:tcMar>
+              <w:top w:type="dxa" w:w="70"/>
+              <w:left w:type="dxa" w:w="110"/>
+              <w:bottom w:type="dxa" w:w="70"/>
+              <w:right w:type="dxa" w:w="110"/>
+            </w:tcMar>
+            <w:vAlign w:val="center"/>
+          </w:tcPr>
+          <w:p>
+            <w:pPr>
+              <w:spacing w:after="0" w:before="0"/>
+            </w:pPr>
+            <w:r>
+              <w:rPr>
+                <w:rFonts w:ascii="Arial" w:cs="Arial" w:eastAsia="Arial" w:hAnsi="Arial"/>
+                <w:color w:val="1B2118"/>
+                <w:sz w:val="18"/>
+                <w:szCs w:val="18"/>
+              </w:rPr>
+              <w:t xml:space="preserve">Prove per Enti di Validazione, modelli, note di fase, messaggi, pagamenti visibili al Comune, pratica sospesa, consultazione pubblica con conferma dell'email, limiti di invio ed errata corrige.</w:t>
+            </w:r>
+          </w:p>
+        </w:tc>
+        <w:tc>
+          <w:tcPr>
+            <w:tcW w:type="dxa" w:w="2000"/>
+            <w:tcBorders>
+              <w:top w:val="single" w:color="D9D4C5" w:sz="4"/>
+              <w:left w:val="single" w:color="D9D4C5" w:sz="4"/>
+              <w:bottom w:val="single" w:color="D9D4C5" w:sz="4"/>
+              <w:right w:val="single" w:color="D9D4C5" w:sz="4"/>
+            </w:tcBorders>
+            <w:tcMar>
+              <w:top w:type="dxa" w:w="70"/>
+              <w:left w:type="dxa" w:w="110"/>
+              <w:bottom w:type="dxa" w:w="70"/>
+              <w:right w:type="dxa" w:w="110"/>
+            </w:tcMar>
+            <w:vAlign w:val="center"/>
+          </w:tcPr>
+          <w:p>
+            <w:pPr>
+              <w:spacing w:after="0" w:before="0"/>
+            </w:pPr>
+            <w:r>
+              <w:rPr>
+                <w:rFonts w:ascii="Arial" w:cs="Arial" w:eastAsia="Arial" w:hAnsi="Arial"/>
+                <w:color w:val="1B2118"/>
+                <w:sz w:val="18"/>
+                <w:szCs w:val="18"/>
+              </w:rPr>
+              <w:t xml:space="preserve">Fondazione Operate</w:t>
+            </w:r>
+          </w:p>
+        </w:tc>
+      </w:tr>
+      <w:tr>
+        <w:trPr>
+          <w:cantSplit/>
+        </w:trPr>
+        <w:tc>
+          <w:tcPr>
+            <w:tcW w:type="dxa" w:w="800"/>
+            <w:tcBorders>
+              <w:top w:val="single" w:color="D9D4C5" w:sz="4"/>
+              <w:left w:val="single" w:color="D9D4C5" w:sz="4"/>
+              <w:bottom w:val="single" w:color="D9D4C5" w:sz="4"/>
+              <w:right w:val="single" w:color="D9D4C5" w:sz="4"/>
+            </w:tcBorders>
+            <w:shd w:fill="F6F4EE" w:color="auto" w:val="clear"/>
+            <w:tcMar>
+              <w:top w:type="dxa" w:w="70"/>
+              <w:left w:type="dxa" w:w="110"/>
+              <w:bottom w:type="dxa" w:w="70"/>
+              <w:right w:type="dxa" w:w="110"/>
+            </w:tcMar>
+            <w:vAlign w:val="center"/>
+          </w:tcPr>
+          <w:p>
+            <w:pPr>
+              <w:spacing w:after="0" w:before="0"/>
+            </w:pPr>
+            <w:r>
+              <w:rPr>
+                <w:rFonts w:ascii="Arial" w:cs="Arial" w:eastAsia="Arial" w:hAnsi="Arial"/>
+                <w:color w:val="1B2118"/>
+                <w:sz w:val="18"/>
+                <w:szCs w:val="18"/>
+              </w:rPr>
               <w:t xml:space="preserve">1.0</w:t>
             </w:r>
           </w:p>
@@ -5862,6 +5996,7 @@
               <w:bottom w:val="single" w:color="D9D4C5" w:sz="4"/>
               <w:right w:val="single" w:color="D9D4C5" w:sz="4"/>
             </w:tcBorders>
+            <w:shd w:fill="F6F4EE" w:color="auto" w:val="clear"/>
             <w:tcMar>
               <w:top w:type="dxa" w:w="70"/>
               <w:left w:type="dxa" w:w="110"/>
@@ -5894,6 +6029,7 @@
               <w:bottom w:val="single" w:color="D9D4C5" w:sz="4"/>
               <w:right w:val="single" w:color="D9D4C5" w:sz="4"/>
             </w:tcBorders>
+            <w:shd w:fill="F6F4EE" w:color="auto" w:val="clear"/>
             <w:tcMar>
               <w:top w:type="dxa" w:w="70"/>
               <w:left w:type="dxa" w:w="110"/>
@@ -5926,6 +6062,7 @@
               <w:bottom w:val="single" w:color="D9D4C5" w:sz="4"/>
               <w:right w:val="single" w:color="D9D4C5" w:sz="4"/>
             </w:tcBorders>
+            <w:shd w:fill="F6F4EE" w:color="auto" w:val="clear"/>
             <w:tcMar>
               <w:top w:type="dxa" w:w="70"/>
               <w:left w:type="dxa" w:w="110"/>
@@ -5967,7 +6104,7 @@
           <w:sz w:val="20"/>
           <w:szCs w:val="20"/>
         </w:rPr>
-        <w:t xml:space="preserve">Guida alla revisione 3.18 del 22/10/2026, allineata al portale e agli altri manuali. È aggiornata a ogni rilascio; la versione corrente si scarica dall'area Documentazione del portale (solo Amministratori).</w:t>
+        <w:t xml:space="preserve">Guida alla revisione 3.19 del 22/10/2026, allineata al portale e agli altri manuali. È aggiornata a ogni rilascio; la versione corrente si scarica dall'area Documentazione del portale (solo Amministratori).</w:t>
       </w:r>
     </w:p>
     <w:p>
@@ -6341,7 +6478,7 @@
         </w:rPr>
         <w:t xml:space="preserve">Il portale: </w:t>
       </w:r>
-      <w:hyperlink w:history="1" r:id="rIdfpxlvt_buqachi8ihgxwt">
+      <w:hyperlink w:history="1" r:id="rIddmljjsqzz78jss_wls2wj">
         <w:r>
           <w:rPr>
             <w:rFonts w:ascii="Arial" w:cs="Arial" w:eastAsia="Arial" w:hAnsi="Arial"/>
@@ -23786,6 +23923,620 @@
                 <w:szCs w:val="18"/>
               </w:rPr>
               <w:t xml:space="preserve">Sotto la tabella dei fattori: «FE indifferenziato calcolato… da» con quota, tonnellate e FE di ogni frazione usata; la nota «Comprende tipologie oltre le cinque nominate al cap. 5 della Metodologia (Legno): il paniere da usare è in attesa di conferma della Fondazione»; «Escluse perché senza fattore: Metallo». Lo stesso nel PDF. Il valore del fattore non cambia rispetto a prima</w:t>
+            </w:r>
+          </w:p>
+        </w:tc>
+      </w:tr>
+      <w:tr>
+        <w:trPr>
+          <w:cantSplit/>
+        </w:trPr>
+        <w:tc>
+          <w:tcPr>
+            <w:tcW w:type="dxa" w:w="885"/>
+            <w:tcBorders>
+              <w:top w:val="single" w:color="D9D4C5" w:sz="4"/>
+              <w:left w:val="single" w:color="D9D4C5" w:sz="4"/>
+              <w:bottom w:val="single" w:color="D9D4C5" w:sz="4"/>
+              <w:right w:val="single" w:color="D9D4C5" w:sz="4"/>
+            </w:tcBorders>
+            <w:shd w:fill="F6F4EE" w:color="auto" w:val="clear"/>
+            <w:tcMar>
+              <w:top w:type="dxa" w:w="70"/>
+              <w:left w:type="dxa" w:w="110"/>
+              <w:bottom w:type="dxa" w:w="70"/>
+              <w:right w:type="dxa" w:w="110"/>
+            </w:tcMar>
+            <w:vAlign w:val="center"/>
+          </w:tcPr>
+          <w:p>
+            <w:pPr>
+              <w:spacing w:after="0" w:before="0"/>
+            </w:pPr>
+            <w:r>
+              <w:rPr>
+                <w:rFonts w:ascii="Arial" w:cs="Arial" w:eastAsia="Arial" w:hAnsi="Arial"/>
+                <w:color w:val="1B2118"/>
+                <w:sz w:val="18"/>
+                <w:szCs w:val="18"/>
+              </w:rPr>
+              <w:t xml:space="preserve">7.25</w:t>
+            </w:r>
+          </w:p>
+        </w:tc>
+        <w:tc>
+          <w:tcPr>
+            <w:tcW w:type="dxa" w:w="4377"/>
+            <w:tcBorders>
+              <w:top w:val="single" w:color="D9D4C5" w:sz="4"/>
+              <w:left w:val="single" w:color="D9D4C5" w:sz="4"/>
+              <w:bottom w:val="single" w:color="D9D4C5" w:sz="4"/>
+              <w:right w:val="single" w:color="D9D4C5" w:sz="4"/>
+            </w:tcBorders>
+            <w:shd w:fill="F6F4EE" w:color="auto" w:val="clear"/>
+            <w:tcMar>
+              <w:top w:type="dxa" w:w="70"/>
+              <w:left w:type="dxa" w:w="110"/>
+              <w:bottom w:type="dxa" w:w="70"/>
+              <w:right w:type="dxa" w:w="110"/>
+            </w:tcMar>
+            <w:vAlign w:val="center"/>
+          </w:tcPr>
+          <w:p>
+            <w:pPr>
+              <w:spacing w:after="0" w:before="0"/>
+            </w:pPr>
+            <w:r>
+              <w:rPr>
+                <w:rFonts w:ascii="Arial" w:cs="Arial" w:eastAsia="Arial" w:hAnsi="Arial"/>
+                <w:color w:val="1B2118"/>
+                <w:sz w:val="18"/>
+                <w:szCs w:val="18"/>
+              </w:rPr>
+              <w:t xml:space="preserve">[A] Banca Dati Utenze. In un calcolo in bozza aprite </w:t>
+            </w:r>
+            <w:r>
+              <w:rPr>
+                <w:rFonts w:ascii="Arial" w:cs="Arial" w:eastAsia="Arial" w:hAnsi="Arial"/>
+                <w:b/>
+                <w:bCs/>
+                <w:color w:val="1B2118"/>
+                <w:sz w:val="18"/>
+                <w:szCs w:val="18"/>
+              </w:rPr>
+              <w:t xml:space="preserve">5a. Utenze del calcolo</w:t>
+            </w:r>
+            <w:r>
+              <w:rPr>
+                <w:rFonts w:ascii="Arial" w:cs="Arial" w:eastAsia="Arial" w:hAnsi="Arial"/>
+                <w:color w:val="1B2118"/>
+                <w:sz w:val="18"/>
+                <w:szCs w:val="18"/>
+              </w:rPr>
+              <w:t xml:space="preserve"> → </w:t>
+            </w:r>
+            <w:r>
+              <w:rPr>
+                <w:rFonts w:ascii="Arial" w:cs="Arial" w:eastAsia="Arial" w:hAnsi="Arial"/>
+                <w:b/>
+                <w:bCs/>
+                <w:color w:val="1B2118"/>
+                <w:sz w:val="18"/>
+                <w:szCs w:val="18"/>
+              </w:rPr>
+              <w:t xml:space="preserve">Scarica il modello Excel</w:t>
+            </w:r>
+            <w:r>
+              <w:rPr>
+                <w:rFonts w:ascii="Arial" w:cs="Arial" w:eastAsia="Arial" w:hAnsi="Arial"/>
+                <w:color w:val="1B2118"/>
+                <w:sz w:val="18"/>
+                <w:szCs w:val="18"/>
+              </w:rPr>
+              <w:t xml:space="preserve">, poi </w:t>
+            </w:r>
+            <w:r>
+              <w:rPr>
+                <w:rFonts w:ascii="Arial" w:cs="Arial" w:eastAsia="Arial" w:hAnsi="Arial"/>
+                <w:b/>
+                <w:bCs/>
+                <w:color w:val="1B2118"/>
+                <w:sz w:val="18"/>
+                <w:szCs w:val="18"/>
+              </w:rPr>
+              <w:t xml:space="preserve">Carica il file dell'anno</w:t>
+            </w:r>
+            <w:r>
+              <w:rPr>
+                <w:rFonts w:ascii="Arial" w:cs="Arial" w:eastAsia="Arial" w:hAnsi="Arial"/>
+                <w:color w:val="1B2118"/>
+                <w:sz w:val="18"/>
+                <w:szCs w:val="18"/>
+              </w:rPr>
+              <w:t xml:space="preserve"> con il file di prova </w:t>
+            </w:r>
+            <w:r>
+              <w:rPr>
+                <w:rFonts w:ascii="Consolas" w:cs="Consolas" w:eastAsia="Consolas" w:hAnsi="Consolas"/>
+                <w:color w:val="2F5D3A"/>
+                <w:sz w:val="18"/>
+                <w:szCs w:val="18"/>
+              </w:rPr>
+              <w:t xml:space="preserve">Banca_dati_utenze_prova_40.xlsx</w:t>
+            </w:r>
+            <w:r>
+              <w:rPr>
+                <w:rFonts w:ascii="Arial" w:cs="Arial" w:eastAsia="Arial" w:hAnsi="Arial"/>
+                <w:color w:val="1B2118"/>
+                <w:sz w:val="18"/>
+                <w:szCs w:val="18"/>
+              </w:rPr>
+              <w:t xml:space="preserve"> → </w:t>
+            </w:r>
+            <w:r>
+              <w:rPr>
+                <w:rFonts w:ascii="Arial" w:cs="Arial" w:eastAsia="Arial" w:hAnsi="Arial"/>
+                <w:b/>
+                <w:bCs/>
+                <w:color w:val="1B2118"/>
+                <w:sz w:val="18"/>
+                <w:szCs w:val="18"/>
+              </w:rPr>
+              <w:t xml:space="preserve">Sostituisci l'elenco</w:t>
+            </w:r>
+          </w:p>
+        </w:tc>
+        <w:tc>
+          <w:tcPr>
+            <w:tcW w:type="dxa" w:w="4376"/>
+            <w:tcBorders>
+              <w:top w:val="single" w:color="D9D4C5" w:sz="4"/>
+              <w:left w:val="single" w:color="D9D4C5" w:sz="4"/>
+              <w:bottom w:val="single" w:color="D9D4C5" w:sz="4"/>
+              <w:right w:val="single" w:color="D9D4C5" w:sz="4"/>
+            </w:tcBorders>
+            <w:shd w:fill="F6F4EE" w:color="auto" w:val="clear"/>
+            <w:tcMar>
+              <w:top w:type="dxa" w:w="70"/>
+              <w:left w:type="dxa" w:w="110"/>
+              <w:bottom w:type="dxa" w:w="70"/>
+              <w:right w:type="dxa" w:w="110"/>
+            </w:tcMar>
+            <w:vAlign w:val="center"/>
+          </w:tcPr>
+          <w:p>
+            <w:pPr>
+              <w:spacing w:after="0" w:before="0"/>
+            </w:pPr>
+            <w:r>
+              <w:rPr>
+                <w:rFonts w:ascii="Arial" w:cs="Arial" w:eastAsia="Arial" w:hAnsi="Arial"/>
+                <w:color w:val="1B2118"/>
+                <w:sz w:val="18"/>
+                <w:szCs w:val="18"/>
+              </w:rPr>
+              <w:t xml:space="preserve">Anteprima: 20 domestiche e 20 non domestiche, avvisi per PROVA-UD-005 (totale diverso dalla somma) e per 4 utenze senza categoria; dopo il caricamento i riquadri dicono 20, 20 e 4; in Audit «caricamento utenze» con i numeri</w:t>
+            </w:r>
+          </w:p>
+        </w:tc>
+      </w:tr>
+      <w:tr>
+        <w:trPr>
+          <w:cantSplit/>
+        </w:trPr>
+        <w:tc>
+          <w:tcPr>
+            <w:tcW w:type="dxa" w:w="885"/>
+            <w:tcBorders>
+              <w:top w:val="single" w:color="D9D4C5" w:sz="4"/>
+              <w:left w:val="single" w:color="D9D4C5" w:sz="4"/>
+              <w:bottom w:val="single" w:color="D9D4C5" w:sz="4"/>
+              <w:right w:val="single" w:color="D9D4C5" w:sz="4"/>
+            </w:tcBorders>
+            <w:tcMar>
+              <w:top w:type="dxa" w:w="70"/>
+              <w:left w:type="dxa" w:w="110"/>
+              <w:bottom w:type="dxa" w:w="70"/>
+              <w:right w:type="dxa" w:w="110"/>
+            </w:tcMar>
+            <w:vAlign w:val="center"/>
+          </w:tcPr>
+          <w:p>
+            <w:pPr>
+              <w:spacing w:after="0" w:before="0"/>
+            </w:pPr>
+            <w:r>
+              <w:rPr>
+                <w:rFonts w:ascii="Arial" w:cs="Arial" w:eastAsia="Arial" w:hAnsi="Arial"/>
+                <w:color w:val="1B2118"/>
+                <w:sz w:val="18"/>
+                <w:szCs w:val="18"/>
+              </w:rPr>
+              <w:t xml:space="preserve">7.25b</w:t>
+            </w:r>
+          </w:p>
+        </w:tc>
+        <w:tc>
+          <w:tcPr>
+            <w:tcW w:type="dxa" w:w="4377"/>
+            <w:tcBorders>
+              <w:top w:val="single" w:color="D9D4C5" w:sz="4"/>
+              <w:left w:val="single" w:color="D9D4C5" w:sz="4"/>
+              <w:bottom w:val="single" w:color="D9D4C5" w:sz="4"/>
+              <w:right w:val="single" w:color="D9D4C5" w:sz="4"/>
+            </w:tcBorders>
+            <w:tcMar>
+              <w:top w:type="dxa" w:w="70"/>
+              <w:left w:type="dxa" w:w="110"/>
+              <w:bottom w:type="dxa" w:w="70"/>
+              <w:right w:type="dxa" w:w="110"/>
+            </w:tcMar>
+            <w:vAlign w:val="center"/>
+          </w:tcPr>
+          <w:p>
+            <w:pPr>
+              <w:spacing w:after="0" w:before="0"/>
+            </w:pPr>
+            <w:r>
+              <w:rPr>
+                <w:rFonts w:ascii="Arial" w:cs="Arial" w:eastAsia="Arial" w:hAnsi="Arial"/>
+                <w:color w:val="1B2118"/>
+                <w:sz w:val="18"/>
+                <w:szCs w:val="18"/>
+              </w:rPr>
+              <w:t xml:space="preserve">[A] Caricate un file con una riga senza indifferenziato e una con un codice ripetuto</w:t>
+            </w:r>
+          </w:p>
+        </w:tc>
+        <w:tc>
+          <w:tcPr>
+            <w:tcW w:type="dxa" w:w="4376"/>
+            <w:tcBorders>
+              <w:top w:val="single" w:color="D9D4C5" w:sz="4"/>
+              <w:left w:val="single" w:color="D9D4C5" w:sz="4"/>
+              <w:bottom w:val="single" w:color="D9D4C5" w:sz="4"/>
+              <w:right w:val="single" w:color="D9D4C5" w:sz="4"/>
+            </w:tcBorders>
+            <w:tcMar>
+              <w:top w:type="dxa" w:w="70"/>
+              <w:left w:type="dxa" w:w="110"/>
+              <w:bottom w:type="dxa" w:w="70"/>
+              <w:right w:type="dxa" w:w="110"/>
+            </w:tcMar>
+            <w:vAlign w:val="center"/>
+          </w:tcPr>
+          <w:p>
+            <w:pPr>
+              <w:spacing w:after="0" w:before="0"/>
+            </w:pPr>
+            <w:r>
+              <w:rPr>
+                <w:rFonts w:ascii="Arial" w:cs="Arial" w:eastAsia="Arial" w:hAnsi="Arial"/>
+                <w:color w:val="1B2118"/>
+                <w:sz w:val="18"/>
+                <w:szCs w:val="18"/>
+              </w:rPr>
+              <w:t xml:space="preserve">«File non caricato»: per ogni errore foglio, riga e codice; l'elenco precedente non cambia</w:t>
+            </w:r>
+          </w:p>
+        </w:tc>
+      </w:tr>
+      <w:tr>
+        <w:trPr>
+          <w:cantSplit/>
+        </w:trPr>
+        <w:tc>
+          <w:tcPr>
+            <w:tcW w:type="dxa" w:w="885"/>
+            <w:tcBorders>
+              <w:top w:val="single" w:color="D9D4C5" w:sz="4"/>
+              <w:left w:val="single" w:color="D9D4C5" w:sz="4"/>
+              <w:bottom w:val="single" w:color="D9D4C5" w:sz="4"/>
+              <w:right w:val="single" w:color="D9D4C5" w:sz="4"/>
+            </w:tcBorders>
+            <w:shd w:fill="F6F4EE" w:color="auto" w:val="clear"/>
+            <w:tcMar>
+              <w:top w:type="dxa" w:w="70"/>
+              <w:left w:type="dxa" w:w="110"/>
+              <w:bottom w:type="dxa" w:w="70"/>
+              <w:right w:type="dxa" w:w="110"/>
+            </w:tcMar>
+            <w:vAlign w:val="center"/>
+          </w:tcPr>
+          <w:p>
+            <w:pPr>
+              <w:spacing w:after="0" w:before="0"/>
+            </w:pPr>
+            <w:r>
+              <w:rPr>
+                <w:rFonts w:ascii="Arial" w:cs="Arial" w:eastAsia="Arial" w:hAnsi="Arial"/>
+                <w:color w:val="1B2118"/>
+                <w:sz w:val="18"/>
+                <w:szCs w:val="18"/>
+              </w:rPr>
+              <w:t xml:space="preserve">7.25c</w:t>
+            </w:r>
+          </w:p>
+        </w:tc>
+        <w:tc>
+          <w:tcPr>
+            <w:tcW w:type="dxa" w:w="4377"/>
+            <w:tcBorders>
+              <w:top w:val="single" w:color="D9D4C5" w:sz="4"/>
+              <w:left w:val="single" w:color="D9D4C5" w:sz="4"/>
+              <w:bottom w:val="single" w:color="D9D4C5" w:sz="4"/>
+              <w:right w:val="single" w:color="D9D4C5" w:sz="4"/>
+            </w:tcBorders>
+            <w:shd w:fill="F6F4EE" w:color="auto" w:val="clear"/>
+            <w:tcMar>
+              <w:top w:type="dxa" w:w="70"/>
+              <w:left w:type="dxa" w:w="110"/>
+              <w:bottom w:type="dxa" w:w="70"/>
+              <w:right w:type="dxa" w:w="110"/>
+            </w:tcMar>
+            <w:vAlign w:val="center"/>
+          </w:tcPr>
+          <w:p>
+            <w:pPr>
+              <w:spacing w:after="0" w:before="0"/>
+            </w:pPr>
+            <w:r>
+              <w:rPr>
+                <w:rFonts w:ascii="Arial" w:cs="Arial" w:eastAsia="Arial" w:hAnsi="Arial"/>
+                <w:color w:val="1B2118"/>
+                <w:sz w:val="18"/>
+                <w:szCs w:val="18"/>
+              </w:rPr>
+              <w:t xml:space="preserve">[A] Aprite PROVA-UD-008 (categoria «da assegnare»), scrivete 2 nella categoria tariffaria, poi cambiate la categoria di simulazione in 3 e salvate</w:t>
+            </w:r>
+          </w:p>
+        </w:tc>
+        <w:tc>
+          <w:tcPr>
+            <w:tcW w:type="dxa" w:w="4376"/>
+            <w:tcBorders>
+              <w:top w:val="single" w:color="D9D4C5" w:sz="4"/>
+              <w:left w:val="single" w:color="D9D4C5" w:sz="4"/>
+              <w:bottom w:val="single" w:color="D9D4C5" w:sz="4"/>
+              <w:right w:val="single" w:color="D9D4C5" w:sz="4"/>
+            </w:tcBorders>
+            <w:shd w:fill="F6F4EE" w:color="auto" w:val="clear"/>
+            <w:tcMar>
+              <w:top w:type="dxa" w:w="70"/>
+              <w:left w:type="dxa" w:w="110"/>
+              <w:bottom w:type="dxa" w:w="70"/>
+              <w:right w:type="dxa" w:w="110"/>
+            </w:tcMar>
+            <w:vAlign w:val="center"/>
+          </w:tcPr>
+          <w:p>
+            <w:pPr>
+              <w:spacing w:after="0" w:before="0"/>
+            </w:pPr>
+            <w:r>
+              <w:rPr>
+                <w:rFonts w:ascii="Arial" w:cs="Arial" w:eastAsia="Arial" w:hAnsi="Arial"/>
+                <w:color w:val="1B2118"/>
+                <w:sz w:val="18"/>
+                <w:szCs w:val="18"/>
+              </w:rPr>
+              <w:t xml:space="preserve">La simulazione segue la tariffaria (2) finché non la cambiate; dopo il salvataggio la riga mostra 2 e 3 «(cambiata)», i riquadri una utenza senza categoria in meno; in Audit «modifica utenza» con i campi cambiati</w:t>
+            </w:r>
+          </w:p>
+        </w:tc>
+      </w:tr>
+      <w:tr>
+        <w:trPr>
+          <w:cantSplit/>
+        </w:trPr>
+        <w:tc>
+          <w:tcPr>
+            <w:tcW w:type="dxa" w:w="885"/>
+            <w:tcBorders>
+              <w:top w:val="single" w:color="D9D4C5" w:sz="4"/>
+              <w:left w:val="single" w:color="D9D4C5" w:sz="4"/>
+              <w:bottom w:val="single" w:color="D9D4C5" w:sz="4"/>
+              <w:right w:val="single" w:color="D9D4C5" w:sz="4"/>
+            </w:tcBorders>
+            <w:tcMar>
+              <w:top w:type="dxa" w:w="70"/>
+              <w:left w:type="dxa" w:w="110"/>
+              <w:bottom w:type="dxa" w:w="70"/>
+              <w:right w:type="dxa" w:w="110"/>
+            </w:tcMar>
+            <w:vAlign w:val="center"/>
+          </w:tcPr>
+          <w:p>
+            <w:pPr>
+              <w:spacing w:after="0" w:before="0"/>
+            </w:pPr>
+            <w:r>
+              <w:rPr>
+                <w:rFonts w:ascii="Arial" w:cs="Arial" w:eastAsia="Arial" w:hAnsi="Arial"/>
+                <w:color w:val="1B2118"/>
+                <w:sz w:val="18"/>
+                <w:szCs w:val="18"/>
+              </w:rPr>
+              <w:t xml:space="preserve">7.25d</w:t>
+            </w:r>
+          </w:p>
+        </w:tc>
+        <w:tc>
+          <w:tcPr>
+            <w:tcW w:type="dxa" w:w="4377"/>
+            <w:tcBorders>
+              <w:top w:val="single" w:color="D9D4C5" w:sz="4"/>
+              <w:left w:val="single" w:color="D9D4C5" w:sz="4"/>
+              <w:bottom w:val="single" w:color="D9D4C5" w:sz="4"/>
+              <w:right w:val="single" w:color="D9D4C5" w:sz="4"/>
+            </w:tcBorders>
+            <w:tcMar>
+              <w:top w:type="dxa" w:w="70"/>
+              <w:left w:type="dxa" w:w="110"/>
+              <w:bottom w:type="dxa" w:w="70"/>
+              <w:right w:type="dxa" w:w="110"/>
+            </w:tcMar>
+            <w:vAlign w:val="center"/>
+          </w:tcPr>
+          <w:p>
+            <w:pPr>
+              <w:spacing w:after="0" w:before="0"/>
+            </w:pPr>
+            <w:r>
+              <w:rPr>
+                <w:rFonts w:ascii="Arial" w:cs="Arial" w:eastAsia="Arial" w:hAnsi="Arial"/>
+                <w:color w:val="1B2118"/>
+                <w:sz w:val="18"/>
+                <w:szCs w:val="18"/>
+              </w:rPr>
+              <w:t xml:space="preserve">[A] + Nuova utenza non domestica: lasciate vuoti ragione sociale e indifferenziato, poi compilateli, usate «= somma delle frazioni» e salvate; poi riaprite e </w:t>
+            </w:r>
+            <w:r>
+              <w:rPr>
+                <w:rFonts w:ascii="Arial" w:cs="Arial" w:eastAsia="Arial" w:hAnsi="Arial"/>
+                <w:b/>
+                <w:bCs/>
+                <w:color w:val="1B2118"/>
+                <w:sz w:val="18"/>
+                <w:szCs w:val="18"/>
+              </w:rPr>
+              <w:t xml:space="preserve">Elimina utenza</w:t>
+            </w:r>
+          </w:p>
+        </w:tc>
+        <w:tc>
+          <w:tcPr>
+            <w:tcW w:type="dxa" w:w="4376"/>
+            <w:tcBorders>
+              <w:top w:val="single" w:color="D9D4C5" w:sz="4"/>
+              <w:left w:val="single" w:color="D9D4C5" w:sz="4"/>
+              <w:bottom w:val="single" w:color="D9D4C5" w:sz="4"/>
+              <w:right w:val="single" w:color="D9D4C5" w:sz="4"/>
+            </w:tcBorders>
+            <w:tcMar>
+              <w:top w:type="dxa" w:w="70"/>
+              <w:left w:type="dxa" w:w="110"/>
+              <w:bottom w:type="dxa" w:w="70"/>
+              <w:right w:type="dxa" w:w="110"/>
+            </w:tcMar>
+            <w:vAlign w:val="center"/>
+          </w:tcPr>
+          <w:p>
+            <w:pPr>
+              <w:spacing w:after="0" w:before="0"/>
+            </w:pPr>
+            <w:r>
+              <w:rPr>
+                <w:rFonts w:ascii="Arial" w:cs="Arial" w:eastAsia="Arial" w:hAnsi="Arial"/>
+                <w:color w:val="1B2118"/>
+                <w:sz w:val="18"/>
+                <w:szCs w:val="18"/>
+              </w:rPr>
+              <w:t xml:space="preserve">Prima errori in rosso e Salva disattivato; poi salvataggio riuscito; eliminazione con voce di audit</w:t>
+            </w:r>
+          </w:p>
+        </w:tc>
+      </w:tr>
+      <w:tr>
+        <w:trPr>
+          <w:cantSplit/>
+        </w:trPr>
+        <w:tc>
+          <w:tcPr>
+            <w:tcW w:type="dxa" w:w="885"/>
+            <w:tcBorders>
+              <w:top w:val="single" w:color="D9D4C5" w:sz="4"/>
+              <w:left w:val="single" w:color="D9D4C5" w:sz="4"/>
+              <w:bottom w:val="single" w:color="D9D4C5" w:sz="4"/>
+              <w:right w:val="single" w:color="D9D4C5" w:sz="4"/>
+            </w:tcBorders>
+            <w:shd w:fill="F6F4EE" w:color="auto" w:val="clear"/>
+            <w:tcMar>
+              <w:top w:type="dxa" w:w="70"/>
+              <w:left w:type="dxa" w:w="110"/>
+              <w:bottom w:type="dxa" w:w="70"/>
+              <w:right w:type="dxa" w:w="110"/>
+            </w:tcMar>
+            <w:vAlign w:val="center"/>
+          </w:tcPr>
+          <w:p>
+            <w:pPr>
+              <w:spacing w:after="0" w:before="0"/>
+            </w:pPr>
+            <w:r>
+              <w:rPr>
+                <w:rFonts w:ascii="Arial" w:cs="Arial" w:eastAsia="Arial" w:hAnsi="Arial"/>
+                <w:color w:val="1B2118"/>
+                <w:sz w:val="18"/>
+                <w:szCs w:val="18"/>
+              </w:rPr>
+              <w:t xml:space="preserve">7.25e</w:t>
+            </w:r>
+          </w:p>
+        </w:tc>
+        <w:tc>
+          <w:tcPr>
+            <w:tcW w:type="dxa" w:w="4377"/>
+            <w:tcBorders>
+              <w:top w:val="single" w:color="D9D4C5" w:sz="4"/>
+              <w:left w:val="single" w:color="D9D4C5" w:sz="4"/>
+              <w:bottom w:val="single" w:color="D9D4C5" w:sz="4"/>
+              <w:right w:val="single" w:color="D9D4C5" w:sz="4"/>
+            </w:tcBorders>
+            <w:shd w:fill="F6F4EE" w:color="auto" w:val="clear"/>
+            <w:tcMar>
+              <w:top w:type="dxa" w:w="70"/>
+              <w:left w:type="dxa" w:w="110"/>
+              <w:bottom w:type="dxa" w:w="70"/>
+              <w:right w:type="dxa" w:w="110"/>
+            </w:tcMar>
+            <w:vAlign w:val="center"/>
+          </w:tcPr>
+          <w:p>
+            <w:pPr>
+              <w:spacing w:after="0" w:before="0"/>
+            </w:pPr>
+            <w:r>
+              <w:rPr>
+                <w:rFonts w:ascii="Arial" w:cs="Arial" w:eastAsia="Arial" w:hAnsi="Arial"/>
+                <w:color w:val="1B2118"/>
+                <w:sz w:val="18"/>
+                <w:szCs w:val="18"/>
+              </w:rPr>
+              <w:t xml:space="preserve">[O] Come Operatore provate ad aprire /crediti</w:t>
+            </w:r>
+          </w:p>
+        </w:tc>
+        <w:tc>
+          <w:tcPr>
+            <w:tcW w:type="dxa" w:w="4376"/>
+            <w:tcBorders>
+              <w:top w:val="single" w:color="D9D4C5" w:sz="4"/>
+              <w:left w:val="single" w:color="D9D4C5" w:sz="4"/>
+              <w:bottom w:val="single" w:color="D9D4C5" w:sz="4"/>
+              <w:right w:val="single" w:color="D9D4C5" w:sz="4"/>
+            </w:tcBorders>
+            <w:shd w:fill="F6F4EE" w:color="auto" w:val="clear"/>
+            <w:tcMar>
+              <w:top w:type="dxa" w:w="70"/>
+              <w:left w:type="dxa" w:w="110"/>
+              <w:bottom w:type="dxa" w:w="70"/>
+              <w:right w:type="dxa" w:w="110"/>
+            </w:tcMar>
+            <w:vAlign w:val="center"/>
+          </w:tcPr>
+          <w:p>
+            <w:pPr>
+              <w:spacing w:after="0" w:before="0"/>
+            </w:pPr>
+            <w:r>
+              <w:rPr>
+                <w:rFonts w:ascii="Arial" w:cs="Arial" w:eastAsia="Arial" w:hAnsi="Arial"/>
+                <w:color w:val="1B2118"/>
+                <w:sz w:val="18"/>
+                <w:szCs w:val="18"/>
+              </w:rPr>
+              <w:t xml:space="preserve">Pagina non disponibile: la Banca Dati Utenze si gestisce solo come Amministratore</w:t>
             </w:r>
           </w:p>
         </w:tc>
@@ -34004,7 +34755,7 @@
         <w:szCs w:val="16"/>
       </w:rPr>
       <w:tab/>
-      <w:t xml:space="preserve">Manuale Test · Rev. 3.18 · 22/10/2026</w:t>
+      <w:t xml:space="preserve">Manuale Test · Rev. 3.19 · 22/10/2026</w:t>
     </w:r>
   </w:p>
 </w:hdr>
@@ -34069,7 +34820,7 @@
         <w:szCs w:val="16"/>
       </w:rPr>
       <w:tab/>
-      <w:t xml:space="preserve">Manuale Test · Rev. 3.18 · 22/10/2026</w:t>
+      <w:t xml:space="preserve">Manuale Test · Rev. 3.19 · 22/10/2026</w:t>
     </w:r>
   </w:p>
 </w:hdr>

</xml_diff>